<commit_message>
Reviews 6-7: E8 + E7-LV rerun + scaling results, corrected statements, RQ definitions, bibliography fix, rebuilt documents
Co-Authored-By: Claude Opus 5.5 <noreply@anthropic.com>
Claude-Session: https://claude.ai/code/session_01GRaL3aKCgpJNtcS7frCXJ4
</commit_message>
<xml_diff>
--- a/Target_Journal_Submission/manuscript/Final_Manuscript.docx
+++ b/Target_Journal_Submission/manuscript/Final_Manuscript.docx
@@ -194,7 +194,7 @@
         <w:t xml:space="preserve"> </w:t>
       </w:r>
       <w:r>
-        <w:t xml:space="preserve">We propose a transfer jackknife+ (TJ+N). Each standard is left out in turn, the transfer step (e.g., piecewise direct standardisation) is re-fitted on the others, and the leave-one-out residuals, normalised by a difficulty function of Hotelling T² and Q residuals learned from source data, define distribution-free intervals with coverage ≥ 1−2α for exchangeable standards. On three public NIR data sets (instrument and season shift; 40 pre-registered scenarios, up to 500 repetitions each), source-calibrated intervals under-covered after transfer, with coverage as low as 0.03 for a nominal 0.90. TJ+N had a mean coverage of 0.922 and was never flagged as under-covering, at α = 0.05, 0.10 or 0.20, under four transfer pipelines, or with PLS, ridge and 1D-CNN models. Splitting the standards gave unbounded intervals for</w:t>
+        <w:t xml:space="preserve">We propose a transfer jackknife+ (TJ+N). Each standard is left out in turn and the transfer step (e.g., piecewise direct standardisation) is re-fitted on the others. The leave-one-out residuals, normalised by a source-learned function of Hotelling T² and Q residuals, define distribution-free intervals with coverage ≥ 1−2α for exchangeable standards. On three public NIR data sets (instrument and season shift; 40 pre-registered scenarios, up to 500 repetitions each), source-calibrated intervals under-covered after transfer, with coverage as low as 0.03 for a nominal 0.90. TJ+N had a mean coverage of 0.922 and was never flagged as under-covering, at α = 0.05, 0.10 or 0.20, under four transfer pipelines, or with PLS, ridge and 1D-CNN models, including an independent transfer between handheld fruit spectrometers. Splitting the standards gave unbounded intervals for</w:t>
       </w:r>
       <w:r>
         <w:t xml:space="preserve"> </w:t>
@@ -423,7 +423,7 @@
         <w:t xml:space="preserve">[27]</w:t>
       </w:r>
       <w:r>
-        <w:t xml:space="preserve">. Coverage guarantees break when calibration and deployment data are not exchangeable, which is exactly the calibration-transfer situation. Weighted conformal prediction corrects for covariate shift</w:t>
+        <w:t xml:space="preserve">. Coverage guarantees break when calibration and deployment data are not exchangeable, which is exactly the calibration-transfer situation. Weighted conformal prediction</w:t>
       </w:r>
       <w:r>
         <w:t xml:space="preserve"> </w:t>
@@ -432,7 +432,10 @@
         <w:t xml:space="preserve">[28]</w:t>
       </w:r>
       <w:r>
-        <w:t xml:space="preserve">, but an instrument change alters the relation between spectrum and property, not only the spectral distribution. Transporting calibration data between paired domains has very recently been proposed for classification</w:t>
+        <w:t xml:space="preserve"> </w:t>
+      </w:r>
+      <w:r>
+        <w:t xml:space="preserve">and its jackknife+ counterpart JAWS</w:t>
       </w:r>
       <w:r>
         <w:t xml:space="preserve"> </w:t>
@@ -441,7 +444,28 @@
         <w:t xml:space="preserve">[29]</w:t>
       </w:r>
       <w:r>
-        <w:t xml:space="preserve">. We found no study of interval validity for transferred spectroscopic calibrations.</w:t>
+        <w:t xml:space="preserve"> </w:t>
+      </w:r>
+      <w:r>
+        <w:t xml:space="preserve">correct for covariate shift using labelled source data. An instrument change, however, alters the relation between spectrum and property, not only the spectral distribution, which violates the covariate-shift assumption. Outside spectroscopy, the growth of uncertainty after calibration transfer has been characterised empirically for networks of low-cost air-quality sensors</w:t>
+      </w:r>
+      <w:r>
+        <w:t xml:space="preserve"> </w:t>
+      </w:r>
+      <w:r>
+        <w:t xml:space="preserve">[30]</w:t>
+      </w:r>
+      <w:r>
+        <w:t xml:space="preserve">, without finite-sample guarantees. Transporting calibration data between paired domains has very recently been proposed for classification</w:t>
+      </w:r>
+      <w:r>
+        <w:t xml:space="preserve"> </w:t>
+      </w:r>
+      <w:r>
+        <w:t xml:space="preserve">[31]</w:t>
+      </w:r>
+      <w:r>
+        <w:t xml:space="preserve">. In searches of Crossref, arXiv and the web (2015–2026; terms combining conformal prediction, jackknife+, prediction intervals and uncertainty with calibration transfer, model transfer, standardisation, near-infrared and spectroscopy), we found no study of interval validity for transferred spectroscopic calibrations.</w:t>
       </w:r>
     </w:p>
     <w:p>
@@ -487,7 +511,7 @@
         <w:t xml:space="preserve"> </w:t>
       </w:r>
       <w:r>
-        <w:t xml:space="preserve">[30]</w:t>
+        <w:t xml:space="preserve">[32]</w:t>
       </w:r>
       <w:r>
         <w:t xml:space="preserve"> </w:t>
@@ -517,7 +541,35 @@
         <w:pStyle w:val="BodyText"/>
       </w:pPr>
       <w:r>
-        <w:t xml:space="preserve">The contributions of this work are:</w:t>
+        <w:rPr>
+          <w:bCs/>
+          <w:b/>
+        </w:rPr>
+        <w:t xml:space="preserve">What is and is not new.</w:t>
+      </w:r>
+      <w:r>
+        <w:t xml:space="preserve"> </w:t>
+      </w:r>
+      <w:r>
+        <w:t xml:space="preserve">The inference engine is the jackknife+</w:t>
+      </w:r>
+      <w:r>
+        <w:t xml:space="preserve"> </w:t>
+      </w:r>
+      <w:r>
+        <w:t xml:space="preserve">[32]</w:t>
+      </w:r>
+      <w:r>
+        <w:t xml:space="preserve">, and normalised nonconformity scores are established</w:t>
+      </w:r>
+      <w:r>
+        <w:t xml:space="preserve"> </w:t>
+      </w:r>
+      <w:r>
+        <w:t xml:space="preserve">[25,33]</w:t>
+      </w:r>
+      <w:r>
+        <w:t xml:space="preserve">; we claim no new conformal theory. What we contribute is the instantiation of the method for calibration transfer, together with the evidence that it is needed:</w:t>
       </w:r>
     </w:p>
     <w:p>
@@ -528,7 +580,17 @@
         </w:numPr>
       </w:pPr>
       <w:r>
-        <w:t xml:space="preserve">A transfer jackknife+ (TJ+) for transferred multivariate calibrations, with a finite-sample coverage statement under explicit conditions on how the standards are selected (Appendix A).</w:t>
+        <w:rPr>
+          <w:bCs/>
+          <w:b/>
+        </w:rPr>
+        <w:t xml:space="preserve">Which step to re-fit.</w:t>
+      </w:r>
+      <w:r>
+        <w:t xml:space="preserve"> </w:t>
+      </w:r>
+      <w:r>
+        <w:t xml:space="preserve">Only the transfer step is placed inside the leave-one-out loop. The source model is kept fixed, and in practice it often cannot be re-fitted because it belongs to another instrument or season.</w:t>
       </w:r>
     </w:p>
     <w:p>
@@ -539,7 +601,68 @@
         </w:numPr>
       </w:pPr>
       <w:r>
-        <w:t xml:space="preserve">A chemometric normalisation (TJ+N), using a source-learned difficulty function of Hotelling T² and Q residuals of the</w:t>
+        <w:rPr>
+          <w:bCs/>
+          <w:b/>
+        </w:rPr>
+        <w:t xml:space="preserve">Why the obvious alternatives fall short.</w:t>
+      </w:r>
+      <w:r>
+        <w:t xml:space="preserve"> </w:t>
+      </w:r>
+      <w:r>
+        <w:t xml:space="preserve">The two natural practices are residuals of the fitted transfer and Gaussian intervals from the leave-one-standard-out RMSE. Neither carries a guarantee, and both are shown to fail in identifiable conditions.</w:t>
+      </w:r>
+    </w:p>
+    <w:p>
+      <w:pPr>
+        <w:numPr>
+          <w:ilvl w:val="0"/>
+          <w:numId w:val="1001"/>
+        </w:numPr>
+      </w:pPr>
+      <w:r>
+        <w:rPr>
+          <w:bCs/>
+          <w:b/>
+        </w:rPr>
+        <w:t xml:space="preserve">Practical consequences</w:t>
+      </w:r>
+      <w:r>
+        <w:t xml:space="preserve"> </w:t>
+      </w:r>
+      <w:r>
+        <w:t xml:space="preserve">for analytical laboratories: the minimum number of standards, the requirement on how standards are selected, and the failure under drift after standardisation.</w:t>
+      </w:r>
+    </w:p>
+    <w:p>
+      <w:pPr>
+        <w:pStyle w:val="FirstParagraph"/>
+      </w:pPr>
+      <w:r>
+        <w:t xml:space="preserve">The contributions of this work are:</w:t>
+      </w:r>
+    </w:p>
+    <w:p>
+      <w:pPr>
+        <w:numPr>
+          <w:ilvl w:val="0"/>
+          <w:numId w:val="1002"/>
+        </w:numPr>
+      </w:pPr>
+      <w:r>
+        <w:t xml:space="preserve">A transfer jackknife+ (TJ+) for transferred multivariate calibrations, with a finite-sample coverage statement under explicit conditions on how the standards are selected (Appendix A).</w:t>
+      </w:r>
+    </w:p>
+    <w:p>
+      <w:pPr>
+        <w:numPr>
+          <w:ilvl w:val="0"/>
+          <w:numId w:val="1002"/>
+        </w:numPr>
+      </w:pPr>
+      <w:r>
+        <w:t xml:space="preserve">A chemometric normalisation (TJ+N). A source-learned difficulty function of Hotelling T² and Q residuals is evaluated on the</w:t>
       </w:r>
       <w:r>
         <w:t xml:space="preserve"> </w:t>
@@ -555,14 +678,14 @@
         <w:t xml:space="preserve"> </w:t>
       </w:r>
       <w:r>
-        <w:t xml:space="preserve">spectrum, so that interval width adapts to the sample.</w:t>
+        <w:t xml:space="preserve">spectrum within each leave-one-out fit, so that interval width adapts to the sample and to spectra that the transfer maps poorly.</w:t>
       </w:r>
     </w:p>
     <w:p>
       <w:pPr>
         <w:numPr>
           <w:ilvl w:val="0"/>
-          <w:numId w:val="1001"/>
+          <w:numId w:val="1002"/>
         </w:numPr>
       </w:pPr>
       <w:r>
@@ -573,11 +696,145 @@
       <w:pPr>
         <w:numPr>
           <w:ilvl w:val="0"/>
-          <w:numId w:val="1001"/>
+          <w:numId w:val="1002"/>
         </w:numPr>
       </w:pPr>
       <w:r>
         <w:t xml:space="preserve">An exploratory label-free variant for the case in which the transfer standards have no reference values.</w:t>
+      </w:r>
+    </w:p>
+    <w:p>
+      <w:pPr>
+        <w:pStyle w:val="FirstParagraph"/>
+      </w:pPr>
+      <w:r>
+        <w:t xml:space="preserve">The study addresses the following research questions:</w:t>
+      </w:r>
+    </w:p>
+    <w:p>
+      <w:pPr>
+        <w:numPr>
+          <w:ilvl w:val="0"/>
+          <w:numId w:val="1003"/>
+        </w:numPr>
+      </w:pPr>
+      <w:r>
+        <w:rPr>
+          <w:bCs/>
+          <w:b/>
+        </w:rPr>
+        <w:t xml:space="preserve">RQ1.</w:t>
+      </w:r>
+      <w:r>
+        <w:t xml:space="preserve"> </w:t>
+      </w:r>
+      <w:r>
+        <w:t xml:space="preserve">Do conventional intervals remain valid after transfer?</w:t>
+      </w:r>
+    </w:p>
+    <w:p>
+      <w:pPr>
+        <w:numPr>
+          <w:ilvl w:val="0"/>
+          <w:numId w:val="1003"/>
+        </w:numPr>
+      </w:pPr>
+      <w:r>
+        <w:rPr>
+          <w:bCs/>
+          <w:b/>
+        </w:rPr>
+        <w:t xml:space="preserve">RQ2.</w:t>
+      </w:r>
+      <w:r>
+        <w:t xml:space="preserve"> </w:t>
+      </w:r>
+      <w:r>
+        <w:t xml:space="preserve">Is TJ+N valid and efficient for realistic numbers of standards?</w:t>
+      </w:r>
+    </w:p>
+    <w:p>
+      <w:pPr>
+        <w:numPr>
+          <w:ilvl w:val="0"/>
+          <w:numId w:val="1003"/>
+        </w:numPr>
+      </w:pPr>
+      <w:r>
+        <w:rPr>
+          <w:bCs/>
+          <w:b/>
+        </w:rPr>
+        <w:t xml:space="preserve">RQ3.</w:t>
+      </w:r>
+      <w:r>
+        <w:t xml:space="preserve"> </w:t>
+      </w:r>
+      <w:r>
+        <w:t xml:space="preserve">Which components of TJ+N matter?</w:t>
+      </w:r>
+    </w:p>
+    <w:p>
+      <w:pPr>
+        <w:numPr>
+          <w:ilvl w:val="0"/>
+          <w:numId w:val="1003"/>
+        </w:numPr>
+      </w:pPr>
+      <w:r>
+        <w:rPr>
+          <w:bCs/>
+          <w:b/>
+        </w:rPr>
+        <w:t xml:space="preserve">RQ4.</w:t>
+      </w:r>
+      <w:r>
+        <w:t xml:space="preserve"> </w:t>
+      </w:r>
+      <w:r>
+        <w:t xml:space="preserve">How robust is it to standard selection, noise, drift and reduced source data?</w:t>
+      </w:r>
+    </w:p>
+    <w:p>
+      <w:pPr>
+        <w:numPr>
+          <w:ilvl w:val="0"/>
+          <w:numId w:val="1003"/>
+        </w:numPr>
+      </w:pPr>
+      <w:r>
+        <w:rPr>
+          <w:bCs/>
+          <w:b/>
+        </w:rPr>
+        <w:t xml:space="preserve">RQ5.</w:t>
+      </w:r>
+      <w:r>
+        <w:t xml:space="preserve"> </w:t>
+      </w:r>
+      <w:r>
+        <w:t xml:space="preserve">Does it generalise across transfer pipelines, directions, model classes and instruments?</w:t>
+      </w:r>
+    </w:p>
+    <w:p>
+      <w:pPr>
+        <w:numPr>
+          <w:ilvl w:val="0"/>
+          <w:numId w:val="1003"/>
+        </w:numPr>
+      </w:pPr>
+      <w:r>
+        <w:rPr>
+          <w:bCs/>
+          <w:b/>
+        </w:rPr>
+        <w:t xml:space="preserve">RQ6.</w:t>
+      </w:r>
+      <w:r>
+        <w:t xml:space="preserve"> </w:t>
+      </w:r>
+      <w:r>
+        <w:t xml:space="preserve">What does it cost?</w:t>
       </w:r>
     </w:p>
     <w:p>
@@ -1233,7 +1490,7 @@
       <w:pPr>
         <w:numPr>
           <w:ilvl w:val="0"/>
-          <w:numId w:val="1002"/>
+          <w:numId w:val="1004"/>
         </w:numPr>
       </w:pPr>
       <w:r>
@@ -1383,7 +1640,7 @@
       <w:pPr>
         <w:numPr>
           <w:ilvl w:val="0"/>
-          <w:numId w:val="1002"/>
+          <w:numId w:val="1004"/>
         </w:numPr>
       </w:pPr>
       <w:r>
@@ -1505,7 +1762,7 @@
       <w:pPr>
         <w:numPr>
           <w:ilvl w:val="0"/>
-          <w:numId w:val="1002"/>
+          <w:numId w:val="1004"/>
         </w:numPr>
       </w:pPr>
       <w:r>
@@ -2049,7 +2306,7 @@
         <w:t xml:space="preserve"> </w:t>
       </w:r>
       <w:r>
-        <w:t xml:space="preserve">(the squared spectral residual). We set</w:t>
+        <w:t xml:space="preserve">(the squared spectral residual), both computed in the preprocessed, mean-centred spectral space of the source model. We set</w:t>
       </w:r>
     </w:p>
     <w:p>
@@ -4546,7 +4803,7 @@
         <w:t xml:space="preserve"> </w:t>
       </w:r>
       <w:r>
-        <w:t xml:space="preserve">[30, Thm. 1]</w:t>
+        <w:t xml:space="preserve">[32, Thm. 1]</w:t>
       </w:r>
       <w:r>
         <w:t xml:space="preserve"> </w:t>
@@ -4615,7 +4872,7 @@
       <w:pPr>
         <w:numPr>
           <w:ilvl w:val="0"/>
-          <w:numId w:val="1003"/>
+          <w:numId w:val="1005"/>
         </w:numPr>
       </w:pPr>
       <w:r>
@@ -4715,7 +4972,7 @@
       <w:pPr>
         <w:numPr>
           <w:ilvl w:val="0"/>
-          <w:numId w:val="1003"/>
+          <w:numId w:val="1005"/>
         </w:numPr>
       </w:pPr>
       <w:r>
@@ -4852,7 +5109,7 @@
       <w:pPr>
         <w:numPr>
           <w:ilvl w:val="0"/>
-          <w:numId w:val="1003"/>
+          <w:numId w:val="1005"/>
         </w:numPr>
       </w:pPr>
       <w:r>
@@ -4872,7 +5129,7 @@
         <w:t xml:space="preserve"> </w:t>
       </w:r>
       <w:r>
-        <w:t xml:space="preserve">[31]</w:t>
+        <w:t xml:space="preserve">[34]</w:t>
       </w:r>
       <w:r>
         <w:t xml:space="preserve">, is not covered by Proposition 1 and is examined empirically (§4.5). The bound is also marginal: it holds on average over the draw of standards and the test sample, not conditionally on a particular set of standards.</w:t>
@@ -5008,7 +5265,7 @@
       <w:pPr>
         <w:numPr>
           <w:ilvl w:val="0"/>
-          <w:numId w:val="1004"/>
+          <w:numId w:val="1006"/>
         </w:numPr>
       </w:pPr>
       <w:r>
@@ -5195,14 +5452,14 @@
         <w:t xml:space="preserve">[16]</w:t>
       </w:r>
       <w:r>
-        <w:t xml:space="preserve">.</w:t>
+        <w:t xml:space="preserve">. For ridge models, the leverage and degrees of freedom of the companion PLS model are used (an approximation).</w:t>
       </w:r>
     </w:p>
     <w:p>
       <w:pPr>
         <w:numPr>
           <w:ilvl w:val="0"/>
-          <w:numId w:val="1004"/>
+          <w:numId w:val="1006"/>
         </w:numPr>
       </w:pPr>
       <w:r>
@@ -5232,7 +5489,7 @@
       <w:pPr>
         <w:numPr>
           <w:ilvl w:val="0"/>
-          <w:numId w:val="1004"/>
+          <w:numId w:val="1006"/>
         </w:numPr>
       </w:pPr>
       <w:r>
@@ -5255,14 +5512,14 @@
         <w:t xml:space="preserve">[28]</w:t>
       </w:r>
       <w:r>
-        <w:t xml:space="preserve">. Likelihood ratios come from a logistic domain classifier on the PLS scores of source spectra versus transferred, unlabelled target spectra.</w:t>
+        <w:t xml:space="preserve">. Likelihood ratios come from a logistic domain classifier on the PLS scores of source spectra versus transferred, unlabelled target spectra; the test spectra themselves are included (transductive use).</w:t>
       </w:r>
     </w:p>
     <w:p>
       <w:pPr>
         <w:numPr>
           <w:ilvl w:val="0"/>
-          <w:numId w:val="1004"/>
+          <w:numId w:val="1006"/>
         </w:numPr>
       </w:pPr>
       <w:r>
@@ -5282,17 +5539,26 @@
         <w:t xml:space="preserve"> </w:t>
       </w:r>
       <w:r>
-        <w:t xml:space="preserve">[29]</w:t>
-      </w:r>
-      <w:r>
-        <w:t xml:space="preserve">. Source-calibration spectra are mapped into the target space by a master→secondary PDS fitted on the standards, passed through the deployed pipeline, and their residuals calibrate a split-conformal quantile. It applies to paired transfers only.</w:t>
+        <w:t xml:space="preserve">[31]</w:t>
+      </w:r>
+      <w:r>
+        <w:t xml:space="preserve">. Source-calibration spectra are mapped into the target space by a master→secondary PDS fitted on the standards, passed through the deployed pipeline, and their residuals calibrate a split-conformal quantile. It applies to paired transfers only. This baseline implements only the transport idea of</w:t>
+      </w:r>
+      <w:r>
+        <w:t xml:space="preserve"> </w:t>
+      </w:r>
+      <w:r>
+        <w:t xml:space="preserve">[31]</w:t>
+      </w:r>
+      <w:r>
+        <w:t xml:space="preserve">; the mismatch correction (TCC-KS) and weighting proposed there for classification were not adapted to regression here.</w:t>
       </w:r>
     </w:p>
     <w:p>
       <w:pPr>
         <w:numPr>
           <w:ilvl w:val="0"/>
-          <w:numId w:val="1004"/>
+          <w:numId w:val="1006"/>
         </w:numPr>
       </w:pPr>
       <w:r>
@@ -5424,14 +5690,14 @@
         </m:sSub>
       </m:oMath>
       <w:r>
-        <w:t xml:space="preserve">, using the leave-one-standard-out residuals. This mimics recomputing the RMSEP on the standards.</w:t>
+        <w:t xml:space="preserve">, using the leave-one-standard-out residuals. This mimics the common practice of validating a transfer by its prediction error on check samples.</w:t>
       </w:r>
     </w:p>
     <w:p>
       <w:pPr>
         <w:numPr>
           <w:ilvl w:val="0"/>
-          <w:numId w:val="1004"/>
+          <w:numId w:val="1006"/>
         </w:numPr>
       </w:pPr>
       <w:r>
@@ -5452,7 +5718,7 @@
       <w:pPr>
         <w:numPr>
           <w:ilvl w:val="0"/>
-          <w:numId w:val="1004"/>
+          <w:numId w:val="1006"/>
         </w:numPr>
       </w:pPr>
       <w:r>
@@ -5472,7 +5738,7 @@
         <w:t xml:space="preserve"> </w:t>
       </w:r>
       <w:r>
-        <w:t xml:space="preserve">[32]</w:t>
+        <w:t xml:space="preserve">[35]</w:t>
       </w:r>
       <w:r>
         <w:t xml:space="preserve">, followed by SBC.</w:t>
@@ -5494,7 +5760,7 @@
       <w:pPr>
         <w:numPr>
           <w:ilvl w:val="0"/>
-          <w:numId w:val="1005"/>
+          <w:numId w:val="1007"/>
         </w:numPr>
       </w:pPr>
       <w:r>
@@ -5520,7 +5786,7 @@
       <w:pPr>
         <w:numPr>
           <w:ilvl w:val="0"/>
-          <w:numId w:val="1005"/>
+          <w:numId w:val="1007"/>
         </w:numPr>
       </w:pPr>
       <w:r>
@@ -5531,7 +5797,7 @@
       <w:pPr>
         <w:numPr>
           <w:ilvl w:val="0"/>
-          <w:numId w:val="1005"/>
+          <w:numId w:val="1007"/>
         </w:numPr>
       </w:pPr>
       <w:r>
@@ -5542,7 +5808,7 @@
       <w:pPr>
         <w:numPr>
           <w:ilvl w:val="0"/>
-          <w:numId w:val="1005"/>
+          <w:numId w:val="1007"/>
         </w:numPr>
       </w:pPr>
       <w:r>
@@ -6177,7 +6443,7 @@
         <w:t xml:space="preserve"> </w:t>
       </w:r>
       <w:r>
-        <w:t xml:space="preserve">[33]</w:t>
+        <w:t xml:space="preserve">[36]</w:t>
       </w:r>
       <w:r>
         <w:t xml:space="preserve">. Eighty corn samples were measured on three NIR spectrometers: m5 (master), mp5 and mp6. The range is 1100–2498 nm at 2 nm intervals (700 channels). Moisture, oil, protein and starch were determined by reference methods. Instrument shift: m5→mp5 and m5→mp6, plus mp5→m5 as a reverse-direction check.</w:t>
@@ -6198,10 +6464,10 @@
         <w:t xml:space="preserve"> </w:t>
       </w:r>
       <w:r>
-        <w:t xml:space="preserve">[33]</w:t>
-      </w:r>
-      <w:r>
-        <w:t xml:space="preserve">. 655 tablets were measured on two spectrometers (600–1898 nm, 650 channels), with reference weight, hardness and active-ingredient assay. The distributed calibrate (155), validate (40) and test (460) partition was retained. Instrument 1 is the master.</w:t>
+        <w:t xml:space="preserve">[36]</w:t>
+      </w:r>
+      <w:r>
+        <w:t xml:space="preserve">. 655 tablets were measured on two spectrometers (600–1898 nm, 650 channels), with reference weight, hardness and active-ingredient assay. The distributed calibrate (155), validate (40) and test (460) partition was retained; the target pool is therefore the organisers’ test set. Instrument 1 is the master.</w:t>
       </w:r>
     </w:p>
     <w:p>
@@ -6219,10 +6485,10 @@
         <w:t xml:space="preserve"> </w:t>
       </w:r>
       <w:r>
-        <w:t xml:space="preserve">[4,34]</w:t>
-      </w:r>
-      <w:r>
-        <w:t xml:space="preserve">. The data comprise 11,691 NIR spectra (684–990 nm used, 103 channels) of intact mango fruit from four harvest seasons, with dry-matter content (DMC) as reference. As recommended by the data providers, replicate scans of the same fruit (2–6 scans; one subset scanned at three temperatures) must never be split between training and test sets. Replicates were therefore averaged per fruit, giving 4,677 fruit. Season shift: seasons 1–3 (source) → season 4 (target, the providers’ external validation season).</w:t>
+        <w:t xml:space="preserve">[4,37]</w:t>
+      </w:r>
+      <w:r>
+        <w:t xml:space="preserve">. The data comprise 11,691 NIR spectra (684–990 nm used, 103 channels) of intact mango fruit from four harvest seasons, with dry-matter content (DMC) as reference. As recommended by the data providers, replicate scans of the same fruit (2–6 scans; one subset scanned at three temperatures) must never be split between training and test sets. Replicates were therefore averaged per fruit (fruit identified by season, region, harvest date, maturity type, cultivar, population and DM value), giving 4,677 fruit (file version 1 of the data record). For the additional instrument-shift test (§4.6), the providers’ extended file (record version 6) was used. Spectra flagged as outliers by the providers were excluded, and replicates were averaged per fruit and instrument. Season shift: seasons 1–3 (source) → season 4 (target, the providers’ external validation season).</w:t>
       </w:r>
     </w:p>
     <w:p>
@@ -6806,7 +7072,7 @@
         <w:t xml:space="preserve"> </w:t>
       </w:r>
       <w:r>
-        <w:t xml:space="preserve">[35]</w:t>
+        <w:t xml:space="preserve">[38]</w:t>
       </w:r>
       <w:r>
         <w:t xml:space="preserve">, Savitzky–Golay</w:t>
@@ -6815,7 +7081,7 @@
         <w:t xml:space="preserve"> </w:t>
       </w:r>
       <w:r>
-        <w:t xml:space="preserve">[36]</w:t>
+        <w:t xml:space="preserve">[39]</w:t>
       </w:r>
       <w:r>
         <w:t xml:space="preserve"> </w:t>
@@ -6827,13 +7093,13 @@
         <w:t xml:space="preserve"> </w:t>
       </w:r>
       <w:r>
-        <w:t xml:space="preserve">[37]</w:t>
-      </w:r>
-      <w:r>
-        <w:t xml:space="preserve"> </w:t>
-      </w:r>
-      <w:r>
-        <w:t xml:space="preserve">(≤15 for corn and tablets, ≤25 for mango) was chosen by 10-fold cross-validation (one-standard-error rule) on the source training data only. The out-of-fold residuals of this cross-validation were used to fit σ (Eq. (2)). For model-class generalisation, ridge regression (penalty by 10-fold CV, same preprocessing) and a small 1D-CNN were used. The CNN (mango only) has two convolutional layers and dropout 0.2, and was trained once on seasons 1–3 with early stopping on a 10% split of the source training data.</w:t>
+        <w:t xml:space="preserve">[40]</w:t>
+      </w:r>
+      <w:r>
+        <w:t xml:space="preserve"> </w:t>
+      </w:r>
+      <w:r>
+        <w:t xml:space="preserve">(≤15 for corn and tablets, ≤25 for mango) was chosen by 10-fold cross-validation (one-standard-error rule) on the source training data only. The out-of-fold residuals of this cross-validation were used to fit σ (Eq. (2)). For model-class generalisation, ridge regression (penalty by 10-fold CV, same preprocessing) and a small 1D-CNN were used. The CNN (mango only) takes SNV-corrected, channel-standardised spectra. It has two 1D convolutional layers (16 and 32 filters, kernel 7, the second with stride 2), a dense layer of 64 units, ReLU activations and dropout 0.2. It was trained once on seasons 1–3 (Adam, learning rate 10⁻³, weight decay 10⁻⁵, batch 128, at most 150 epochs, early stopping with patience 20 on a 10% split of the source training data).</w:t>
       </w:r>
     </w:p>
     <w:p>
@@ -6852,7 +7118,7 @@
       <w:pPr>
         <w:numPr>
           <w:ilvl w:val="0"/>
-          <w:numId w:val="1006"/>
+          <w:numId w:val="1008"/>
         </w:numPr>
       </w:pPr>
       <w:r>
@@ -6902,7 +7168,7 @@
       <w:pPr>
         <w:numPr>
           <w:ilvl w:val="0"/>
-          <w:numId w:val="1006"/>
+          <w:numId w:val="1008"/>
         </w:numPr>
       </w:pPr>
       <w:r>
@@ -6952,7 +7218,7 @@
       <w:pPr>
         <w:numPr>
           <w:ilvl w:val="0"/>
-          <w:numId w:val="1006"/>
+          <w:numId w:val="1008"/>
         </w:numPr>
       </w:pPr>
       <w:r>
@@ -7008,7 +7274,7 @@
         <w:t xml:space="preserve"> </w:t>
       </w:r>
       <w:r>
-        <w:t xml:space="preserve">PDS (window 5, truncated pseudo-inverse with relative tolerance 0.01, with intercept)</w:t>
+        <w:t xml:space="preserve">PDS (window 5, truncated pseudo-inverse with relative tolerance 0.01, with intercept; windows truncated at the spectral edges)</w:t>
       </w:r>
       <w:r>
         <w:t xml:space="preserve"> </w:t>
@@ -7042,7 +7308,7 @@
       <w:pPr>
         <w:numPr>
           <w:ilvl w:val="0"/>
-          <w:numId w:val="1007"/>
+          <w:numId w:val="1009"/>
         </w:numPr>
       </w:pPr>
       <w:r>
@@ -7053,7 +7319,7 @@
       <w:pPr>
         <w:numPr>
           <w:ilvl w:val="0"/>
-          <w:numId w:val="1007"/>
+          <w:numId w:val="1009"/>
         </w:numPr>
       </w:pPr>
       <w:r>
@@ -7064,7 +7330,7 @@
       <w:pPr>
         <w:numPr>
           <w:ilvl w:val="0"/>
-          <w:numId w:val="1007"/>
+          <w:numId w:val="1009"/>
         </w:numPr>
       </w:pPr>
       <w:r>
@@ -7075,7 +7341,7 @@
       <w:pPr>
         <w:numPr>
           <w:ilvl w:val="0"/>
-          <w:numId w:val="1007"/>
+          <w:numId w:val="1009"/>
         </w:numPr>
       </w:pPr>
       <w:r>
@@ -7252,7 +7518,7 @@
         <w:t xml:space="preserve"> </w:t>
       </w:r>
       <w:r>
-        <w:t xml:space="preserve">[38]</w:t>
+        <w:t xml:space="preserve">[41]</w:t>
       </w:r>
       <w:r>
         <w:t xml:space="preserve">;</w:t>
@@ -7262,7 +7528,7 @@
       <w:pPr>
         <w:numPr>
           <w:ilvl w:val="0"/>
-          <w:numId w:val="1007"/>
+          <w:numId w:val="1009"/>
         </w:numPr>
       </w:pPr>
       <w:r>
@@ -7273,7 +7539,7 @@
       <w:pPr>
         <w:numPr>
           <w:ilvl w:val="0"/>
-          <w:numId w:val="1007"/>
+          <w:numId w:val="1009"/>
         </w:numPr>
       </w:pPr>
       <w:r>
@@ -7325,7 +7591,7 @@
         <w:t xml:space="preserve"> </w:t>
       </w:r>
       <w:r>
-        <w:t xml:space="preserve">[39]</w:t>
+        <w:t xml:space="preserve">[42]</w:t>
       </w:r>
       <w:r>
         <w:t xml:space="preserve"> </w:t>
@@ -7337,10 +7603,26 @@
         <w:t xml:space="preserve"> </w:t>
       </w:r>
       <w:r>
-        <w:t xml:space="preserve">[40]</w:t>
-      </w:r>
-      <w:r>
-        <w:t xml:space="preserve">. Repetitions are independent random draws of the splits from fixed data sets, so inferences are conditional on the data sets.</w:t>
+        <w:t xml:space="preserve">[43]</w:t>
+      </w:r>
+      <w:r>
+        <w:t xml:space="preserve">. Repetitions are independent random draws of the splits from fixed data sets, so inferences are conditional on the data sets. Every method is evaluated on identical standards and test samples in each repetition (paired design). Scenarios that share a data set are not independent (corn properties share samples; the</w:t>
+      </w:r>
+      <w:r>
+        <w:t xml:space="preserve"> </w:t>
+      </w:r>
+      <w:r>
+        <w:rPr>
+          <w:iCs/>
+          <w:i/>
+        </w:rPr>
+        <w:t xml:space="preserve">m</w:t>
+      </w:r>
+      <w:r>
+        <w:t xml:space="preserve"> </w:t>
+      </w:r>
+      <w:r>
+        <w:t xml:space="preserve">levels share splits). The Friedman ranks are therefore interpreted descriptively, and inferential statements rest on the within-scenario paired tests. Because the under-coverage flag is applied per scenario without multiplicity correction, it errs towards flagging, which works against the proposed method rather than in its favour.</w:t>
       </w:r>
     </w:p>
     <w:p>
@@ -7365,7 +7647,7 @@
       <w:pPr>
         <w:numPr>
           <w:ilvl w:val="0"/>
-          <w:numId w:val="1008"/>
+          <w:numId w:val="1010"/>
         </w:numPr>
       </w:pPr>
       <w:r>
@@ -7376,7 +7658,7 @@
       <w:pPr>
         <w:numPr>
           <w:ilvl w:val="0"/>
-          <w:numId w:val="1008"/>
+          <w:numId w:val="1010"/>
         </w:numPr>
       </w:pPr>
       <w:r>
@@ -7387,7 +7669,7 @@
       <w:pPr>
         <w:numPr>
           <w:ilvl w:val="0"/>
-          <w:numId w:val="1008"/>
+          <w:numId w:val="1010"/>
         </w:numPr>
       </w:pPr>
       <w:r>
@@ -7398,7 +7680,7 @@
       <w:pPr>
         <w:numPr>
           <w:ilvl w:val="0"/>
-          <w:numId w:val="1008"/>
+          <w:numId w:val="1010"/>
         </w:numPr>
       </w:pPr>
       <w:r>
@@ -7472,7 +7754,7 @@
       <w:pPr>
         <w:numPr>
           <w:ilvl w:val="0"/>
-          <w:numId w:val="1009"/>
+          <w:numId w:val="1011"/>
         </w:numPr>
       </w:pPr>
       <w:r>
@@ -7509,7 +7791,7 @@
       <w:pPr>
         <w:numPr>
           <w:ilvl w:val="0"/>
-          <w:numId w:val="1009"/>
+          <w:numId w:val="1011"/>
         </w:numPr>
       </w:pPr>
       <w:r>
@@ -7556,7 +7838,7 @@
       <w:pPr>
         <w:numPr>
           <w:ilvl w:val="0"/>
-          <w:numId w:val="1009"/>
+          <w:numId w:val="1011"/>
         </w:numPr>
       </w:pPr>
       <w:r>
@@ -7570,7 +7852,7 @@
         <w:t xml:space="preserve"> </w:t>
       </w:r>
       <w:r>
-        <w:t xml:space="preserve">SBC did not improve on the uncorrected source model (RMSEP 1.06–1.15 vs 1.05 %), consistent with reports that models built over several seasons are already fairly robust</w:t>
+        <w:t xml:space="preserve">SBC did not improve on the uncorrected source model (RMSEP 1.06–1.15 vs 1.05 % DM), consistent with reports that models built over several seasons are already fairly robust</w:t>
       </w:r>
       <w:r>
         <w:t xml:space="preserve"> </w:t>
@@ -8926,14 +9208,14 @@
         <w:pStyle w:val="FirstParagraph"/>
       </w:pPr>
       <w:r>
-        <w:t xml:space="preserve">Source-calibrated intervals under-covered whenever the transfer added error that the source calibration had not seen (Fig. 3; Table 3).</w:t>
+        <w:t xml:space="preserve">Source-calibrated intervals under-covered when the transfer added substantial error that the source calibration had not seen (Fig. 3; Table 3; compare Table 2).</w:t>
       </w:r>
     </w:p>
     <w:p>
       <w:pPr>
         <w:numPr>
           <w:ilvl w:val="0"/>
-          <w:numId w:val="1010"/>
+          <w:numId w:val="1012"/>
         </w:numPr>
       </w:pPr>
       <w:r>
@@ -8954,7 +9236,7 @@
       <w:pPr>
         <w:numPr>
           <w:ilvl w:val="0"/>
-          <w:numId w:val="1010"/>
+          <w:numId w:val="1012"/>
         </w:numPr>
       </w:pPr>
       <w:r>
@@ -8975,7 +9257,7 @@
       <w:pPr>
         <w:numPr>
           <w:ilvl w:val="0"/>
-          <w:numId w:val="1010"/>
+          <w:numId w:val="1012"/>
         </w:numPr>
       </w:pPr>
       <w:r>
@@ -9029,7 +9311,7 @@
         <w:pStyle w:val="FirstParagraph"/>
       </w:pPr>
       <w:r>
-        <w:t xml:space="preserve">Weighting the source residuals for covariate shift (WCP-S) did not repair coverage, and it produced unbounded intervals in 59% of corn repetitions. When the domains are almost perfectly separable, the estimated likelihood ratios degenerate. More fundamentally, an instrument change alters the conditional relation between spectrum and property, which violates the covariate-shift assumption. The transport baseline, which maps source-calibration spectra into the secondary-instrument space with a master→secondary PDS, recovered part of the coverage on corn (mean coverage 0.75, range 0.29–0.92). It still under-covered in 14 of 24 scenarios, because the transported residuals inherit the source error distribution and only approximate the transfer error.</w:t>
+        <w:t xml:space="preserve">The failure is not an artefact of the in-sample calibration error used by ASTM-PI: SCP-S, which uses cross-validated (out-of-fold) source residuals, under-covered almost as severely. Weighting the source residuals for covariate shift (WCP-S) did not repair coverage either, and it produced unbounded intervals in 59% of corn repetitions. When the domains are almost perfectly separable, the estimated likelihood ratios degenerate. More fundamentally, an instrument change alters the conditional relation between spectrum and property, which violates the covariate-shift assumption. The transport baseline, which maps source-calibration spectra into the secondary-instrument space with a master→secondary PDS, recovered part of the coverage on corn (mean coverage 0.75, range 0.29–0.92). It still under-covered in 14 of 24 scenarios, because the transported residuals inherit the source error distribution and only approximate the transfer error.</w:t>
       </w:r>
     </w:p>
     <w:p>
@@ -10562,7 +10844,7 @@
         <w:pStyle w:val="FirstParagraph"/>
       </w:pPr>
       <w:r>
-        <w:t xml:space="preserve">TJ+N was not flagged as under-covering in any of the 40 primary scenarios. Its mean coverage was 0.922 (range over scenarios 0.898–0.959) at α = 0.10, and the same held at α = 0.05 and 0.20 (0 under-covering scenarios over all three levels; Table 4). Coverage exceeded the nominal level most clearly for</w:t>
+        <w:t xml:space="preserve">TJ+N was not flagged as under-covering in any of the 40 primary scenarios. Given the precision of the coverage estimates (median half-width of the 95% CI: corn ±0.008, mango ±0.007, tablets ±0.005), this means that no scenario was significantly below nominal at that resolution. Its mean coverage was 0.922 (range over scenarios 0.898–0.959) at α = 0.10, and the same held at α = 0.05 and 0.20 (0 under-covering scenarios over all three levels; Table 4). Coverage exceeded the nominal level most clearly for</w:t>
       </w:r>
       <w:r>
         <w:t xml:space="preserve"> </w:t>
@@ -10824,7 +11106,7 @@
       <w:pPr>
         <w:numPr>
           <w:ilvl w:val="0"/>
-          <w:numId w:val="1011"/>
+          <w:numId w:val="1013"/>
         </w:numPr>
       </w:pPr>
       <w:r>
@@ -10835,11 +11117,11 @@
       <w:pPr>
         <w:numPr>
           <w:ilvl w:val="0"/>
-          <w:numId w:val="1011"/>
+          <w:numId w:val="1013"/>
         </w:numPr>
       </w:pPr>
       <w:r>
-        <w:t xml:space="preserve">It had the best mean rank of interval score in the Friedman analysis (Fig. S2; χ² = 145.5,</w:t>
+        <w:t xml:space="preserve">It had the best mean rank of interval score across scenarios (Fig. S2; mean ranks Gauss-LOO 2.17, TJ+N 2.52, TJ+ 3.12; Friedman χ² = 145.5, nominal</w:t>
       </w:r>
       <w:r>
         <w:t xml:space="preserve"> </w:t>
@@ -10864,18 +11146,18 @@
         <w:t xml:space="preserve">−</w:t>
       </w:r>
       <w:r>
-        <w:t xml:space="preserve">28; mean ranks Gauss-LOO 2.17, TJ+N 2.52, TJ+ 3.12).</w:t>
+        <w:t xml:space="preserve">28, which overstates the evidence because scenarios are dependent).</w:t>
       </w:r>
     </w:p>
     <w:p>
       <w:pPr>
         <w:numPr>
           <w:ilvl w:val="0"/>
-          <w:numId w:val="1011"/>
+          <w:numId w:val="1013"/>
         </w:numPr>
       </w:pPr>
       <w:r>
-        <w:t xml:space="preserve">It did not differ significantly from TJ+N after Holm correction (</w:t>
+        <w:t xml:space="preserve">Across scenarios, it did not differ significantly from TJ+N after Holm correction (</w:t>
       </w:r>
       <w:r>
         <w:rPr>
@@ -10895,7 +11177,7 @@
       <w:pPr>
         <w:numPr>
           <w:ilvl w:val="0"/>
-          <w:numId w:val="1011"/>
+          <w:numId w:val="1013"/>
         </w:numPr>
       </w:pPr>
       <w:r>
@@ -11523,7 +11805,7 @@
       <w:pPr>
         <w:numPr>
           <w:ilvl w:val="0"/>
-          <w:numId w:val="1012"/>
+          <w:numId w:val="1014"/>
         </w:numPr>
       </w:pPr>
       <w:r>
@@ -11544,7 +11826,7 @@
       <w:pPr>
         <w:numPr>
           <w:ilvl w:val="0"/>
-          <w:numId w:val="1012"/>
+          <w:numId w:val="1014"/>
         </w:numPr>
       </w:pPr>
       <w:r>
@@ -11565,7 +11847,7 @@
       <w:pPr>
         <w:numPr>
           <w:ilvl w:val="0"/>
-          <w:numId w:val="1012"/>
+          <w:numId w:val="1014"/>
         </w:numPr>
       </w:pPr>
       <w:r>
@@ -11628,7 +11910,7 @@
       <w:pPr>
         <w:numPr>
           <w:ilvl w:val="0"/>
-          <w:numId w:val="1012"/>
+          <w:numId w:val="1014"/>
         </w:numPr>
       </w:pPr>
       <w:r>
@@ -11649,7 +11931,7 @@
       <w:pPr>
         <w:numPr>
           <w:ilvl w:val="1"/>
-          <w:numId w:val="1013"/>
+          <w:numId w:val="1015"/>
         </w:numPr>
       </w:pPr>
       <w:r>
@@ -11660,7 +11942,7 @@
       <w:pPr>
         <w:numPr>
           <w:ilvl w:val="1"/>
-          <w:numId w:val="1013"/>
+          <w:numId w:val="1015"/>
         </w:numPr>
       </w:pPr>
       <w:r>
@@ -11671,7 +11953,7 @@
       <w:pPr>
         <w:numPr>
           <w:ilvl w:val="1"/>
-          <w:numId w:val="1013"/>
+          <w:numId w:val="1015"/>
         </w:numPr>
       </w:pPr>
       <w:r>
@@ -11682,7 +11964,7 @@
       <w:pPr>
         <w:numPr>
           <w:ilvl w:val="1"/>
-          <w:numId w:val="1013"/>
+          <w:numId w:val="1015"/>
         </w:numPr>
       </w:pPr>
       <w:r>
@@ -13184,7 +13466,7 @@
       <w:pPr>
         <w:numPr>
           <w:ilvl w:val="0"/>
-          <w:numId w:val="1014"/>
+          <w:numId w:val="1016"/>
         </w:numPr>
       </w:pPr>
       <w:r>
@@ -13195,7 +13477,7 @@
       <w:pPr>
         <w:numPr>
           <w:ilvl w:val="0"/>
-          <w:numId w:val="1014"/>
+          <w:numId w:val="1016"/>
         </w:numPr>
       </w:pPr>
       <w:r>
@@ -13206,7 +13488,7 @@
       <w:pPr>
         <w:numPr>
           <w:ilvl w:val="0"/>
-          <w:numId w:val="1014"/>
+          <w:numId w:val="1016"/>
         </w:numPr>
       </w:pPr>
       <w:r>
@@ -15734,13 +16016,13 @@
       </w:r>
     </w:p>
     <w:bookmarkEnd w:id="55"/>
-    <w:bookmarkStart w:id="56" w:name="X8e8ab3d411f7961fc5ed7c92101cf36cb68b707"/>
+    <w:bookmarkStart w:id="56" w:name="Xcb0a70a72bf83b16794b68d731904a21add5d8c"/>
     <w:p>
       <w:pPr>
         <w:pStyle w:val="Heading2"/>
       </w:pPr>
       <w:r>
-        <w:t xml:space="preserve">4.6. Generalisation across pipelines, directions and model classes (RQ5)</w:t>
+        <w:t xml:space="preserve">4.6. Generalisation across pipelines, directions, model classes and instruments (RQ5)</w:t>
       </w:r>
     </w:p>
     <w:p>
@@ -15755,7 +16037,7 @@
       <w:pPr>
         <w:numPr>
           <w:ilvl w:val="0"/>
-          <w:numId w:val="1015"/>
+          <w:numId w:val="1017"/>
         </w:numPr>
       </w:pPr>
       <w:r>
@@ -15776,7 +16058,7 @@
       <w:pPr>
         <w:numPr>
           <w:ilvl w:val="0"/>
-          <w:numId w:val="1015"/>
+          <w:numId w:val="1017"/>
         </w:numPr>
       </w:pPr>
       <w:r>
@@ -15797,7 +16079,7 @@
       <w:pPr>
         <w:numPr>
           <w:ilvl w:val="0"/>
-          <w:numId w:val="1015"/>
+          <w:numId w:val="1017"/>
         </w:numPr>
       </w:pPr>
       <w:r>
@@ -15818,7 +16100,7 @@
       <w:pPr>
         <w:numPr>
           <w:ilvl w:val="0"/>
-          <w:numId w:val="1015"/>
+          <w:numId w:val="1017"/>
         </w:numPr>
       </w:pPr>
       <w:r>
@@ -15832,14 +16114,14 @@
         <w:t xml:space="preserve"> </w:t>
       </w:r>
       <w:r>
-        <w:t xml:space="preserve">The CNN (110,369 parameters, early stopping after 101 epochs, 36 s on a CPU) reached RMSEP 1.22 % after SBC. On top of it:</w:t>
+        <w:t xml:space="preserve">The CNN (110,369 parameters, early stopping after 101 epochs, 36 s on a CPU) reached RMSEP 1.22 % DM after SBC. On top of it:</w:t>
       </w:r>
     </w:p>
     <w:p>
       <w:pPr>
         <w:numPr>
           <w:ilvl w:val="1"/>
-          <w:numId w:val="1016"/>
+          <w:numId w:val="1018"/>
         </w:numPr>
       </w:pPr>
       <w:r>
@@ -15850,7 +16132,7 @@
       <w:pPr>
         <w:numPr>
           <w:ilvl w:val="1"/>
-          <w:numId w:val="1016"/>
+          <w:numId w:val="1018"/>
         </w:numPr>
       </w:pPr>
       <w:r>
@@ -15861,7 +16143,7 @@
       <w:pPr>
         <w:numPr>
           <w:ilvl w:val="1"/>
-          <w:numId w:val="1016"/>
+          <w:numId w:val="1018"/>
         </w:numPr>
       </w:pPr>
       <w:r>
@@ -15871,7 +16153,7 @@
         <w:t xml:space="preserve"> </w:t>
       </w:r>
       <w:r>
-        <w:t xml:space="preserve">[32]</w:t>
+        <w:t xml:space="preserve">[35]</w:t>
       </w:r>
       <w:r>
         <w:t xml:space="preserve">, a common deep-learning uncertainty estimate for spectra</w:t>
@@ -15880,7 +16162,7 @@
         <w:t xml:space="preserve"> </w:t>
       </w:r>
       <w:r>
-        <w:t xml:space="preserve">[41]</w:t>
+        <w:t xml:space="preserve">[44]</w:t>
       </w:r>
       <w:r>
         <w:t xml:space="preserve">, under-covered in 4/4 scenarios (coverage 0.807), presumably because dropout variance captures model uncertainty but not the systematic error introduced by the season shift.</w:t>
@@ -15892,6 +16174,128 @@
       </w:pPr>
       <w:r>
         <w:t xml:space="preserve">Over all generalisation settings, TJ+N under-covered in 0 of 22 scenarios.</w:t>
+      </w:r>
+    </w:p>
+    <w:p>
+      <w:pPr>
+        <w:pStyle w:val="BodyText"/>
+      </w:pPr>
+      <w:r>
+        <w:rPr>
+          <w:bCs/>
+          <w:b/>
+        </w:rPr>
+        <w:t xml:space="preserve">Independent instrument shift (mango, E8).</w:t>
+      </w:r>
+      <w:r>
+        <w:t xml:space="preserve"> </w:t>
+      </w:r>
+      <w:r>
+        <w:t xml:space="preserve">Prompted by the review process, we added a test that was not part of the pre-registered design: transfer between handheld spectrometers on intact fruit, using the data providers’ extended data set with paired spectra of the same fruit on several instruments</w:t>
+      </w:r>
+      <w:r>
+        <w:t xml:space="preserve"> </w:t>
+      </w:r>
+      <w:r>
+        <w:t xml:space="preserve">[45]</w:t>
+      </w:r>
+      <w:r>
+        <w:t xml:space="preserve">. The design was fixed before any result was computed:</w:t>
+      </w:r>
+    </w:p>
+    <w:p>
+      <w:pPr>
+        <w:numPr>
+          <w:ilvl w:val="0"/>
+          <w:numId w:val="1019"/>
+        </w:numPr>
+      </w:pPr>
+      <w:r>
+        <w:t xml:space="preserve">source instrument 15006;</w:t>
+      </w:r>
+    </w:p>
+    <w:p>
+      <w:pPr>
+        <w:numPr>
+          <w:ilvl w:val="0"/>
+          <w:numId w:val="1019"/>
+        </w:numPr>
+      </w:pPr>
+      <w:r>
+        <w:t xml:space="preserve">the three target instruments with most shared fruit;</w:t>
+      </w:r>
+    </w:p>
+    <w:p>
+      <w:pPr>
+        <w:numPr>
+          <w:ilvl w:val="0"/>
+          <w:numId w:val="1019"/>
+        </w:numPr>
+      </w:pPr>
+      <w:r>
+        <w:t xml:space="preserve">PDS and SBC pipelines;</w:t>
+      </w:r>
+    </w:p>
+    <w:p>
+      <w:pPr>
+        <w:numPr>
+          <w:ilvl w:val="0"/>
+          <w:numId w:val="1019"/>
+        </w:numPr>
+      </w:pPr>
+      <w:r>
+        <w:rPr>
+          <w:iCs/>
+          <w:i/>
+        </w:rPr>
+        <w:t xml:space="preserve">m</w:t>
+      </w:r>
+      <w:r>
+        <w:t xml:space="preserve"> </w:t>
+      </w:r>
+      <w:r>
+        <w:t xml:space="preserve">= 10–50 standards, 200 repetitions.</w:t>
+      </w:r>
+    </w:p>
+    <w:p>
+      <w:pPr>
+        <w:pStyle w:val="FirstParagraph"/>
+      </w:pPr>
+      <w:r>
+        <w:t xml:space="preserve">The results reproduced the main findings (Table 8).</w:t>
+      </w:r>
+    </w:p>
+    <w:p>
+      <w:pPr>
+        <w:numPr>
+          <w:ilvl w:val="0"/>
+          <w:numId w:val="1020"/>
+        </w:numPr>
+      </w:pPr>
+      <w:r>
+        <w:t xml:space="preserve">ASTM-PI and SCP-S under-covered in every scenario: coverage 0.20–0.51 after PDS (24/24 scenarios) and 0.73–0.81 after SBC (24/24). WCP-S under-covered after PDS (0.15–0.47). After SBC it returned unbounded intervals in 100% of repetitions: valid, but uninformative.</w:t>
+      </w:r>
+    </w:p>
+    <w:p>
+      <w:pPr>
+        <w:numPr>
+          <w:ilvl w:val="0"/>
+          <w:numId w:val="1020"/>
+        </w:numPr>
+      </w:pPr>
+      <w:r>
+        <w:t xml:space="preserve">TJ+N was valid: mean coverage 0.931 (PDS) and 0.906 (SBC). It was never flagged at any α (0/72 under-covering scenarios), whereas Gauss-LOO was flagged in 4/72.</w:t>
+      </w:r>
+    </w:p>
+    <w:p>
+      <w:pPr>
+        <w:numPr>
+          <w:ilvl w:val="0"/>
+          <w:numId w:val="1020"/>
+        </w:numPr>
+      </w:pPr>
+      <w:r>
+        <w:t xml:space="preserve">PDS proved a poor transfer for these instruments (RMSEP 2.03–7.40 % DM, against 1.06–1.22 % with SBC). TJ+N made this visible through wide intervals (median width 11.1 vs 4.0 % DM), whereas the source-calibrated intervals remained narrow and missed most samples. Valid intervals are thus also a diagnostic of transfer quality.</w:t>
       </w:r>
     </w:p>
     <w:p>
@@ -15910,7 +16314,7 @@
         <w:t xml:space="preserve"> </w:t>
       </w:r>
       <w:r>
-        <w:t xml:space="preserve">Generalisation (E5; α = 0.10). Each cell: mean coverage (under-covering / scenarios); median interval score (lower is better).</w:t>
+        <w:t xml:space="preserve">Independent instrument shift (E8): mango dry matter, source instrument 15006, three target instruments × four values of m (12 scenarios per pipeline; α = 0.10; 200 repetitions).</w:t>
       </w:r>
     </w:p>
     <w:tbl>
@@ -15919,7 +16323,1692 @@
         <w:tblW w:type="pct" w:w="5000"/>
         <w:jc w:val="center"/>
         <w:tblLook w:firstRow="1" w:lastRow="0" w:firstColumn="0" w:lastColumn="0" w:noHBand="0" w:noVBand="0" w:val="0020"/>
-        <w:tblCaption w:val="Table 7. Generalisation (E5; α = 0.10). Each cell: mean coverage (under-covering / scenarios); median interval score (lower is better)."/>
+        <w:tblCaption w:val="Table 7. Independent instrument shift (E8): mango dry matter, source instrument 15006, three target instruments × four values of m (12 scenarios per pipeline; α = 0.10; 200 repetitions)."/>
+      </w:tblPr>
+      <w:tblGrid>
+        <w:gridCol w:w="1131"/>
+        <w:gridCol w:w="1131"/>
+        <w:gridCol w:w="1131"/>
+        <w:gridCol w:w="1131"/>
+        <w:gridCol w:w="1131"/>
+        <w:gridCol w:w="1131"/>
+        <w:gridCol w:w="1131"/>
+      </w:tblGrid>
+      <w:tr>
+        <w:trPr>
+          <w:tblHeader w:val="true"/>
+        </w:trPr>
+        <w:tc>
+          <w:tcPr>
+            <w:tcBorders>
+              <w:top w:val="single" w:sz="8" w:color="000000"/>
+              <w:bottom w:val="single" w:sz="8" w:color="000000"/>
+            </w:tcBorders>
+          </w:tcPr>
+          <w:p>
+            <w:pPr>
+              <w:pStyle w:val="Compact"/>
+              <w:spacing w:after="0"/>
+              <w:jc w:val="left"/>
+            </w:pPr>
+            <w:r>
+              <w:t xml:space="preserve">Pipeline</w:t>
+            </w:r>
+          </w:p>
+        </w:tc>
+        <w:tc>
+          <w:tcPr>
+            <w:tcBorders>
+              <w:top w:val="single" w:sz="8" w:color="000000"/>
+              <w:bottom w:val="single" w:sz="8" w:color="000000"/>
+            </w:tcBorders>
+          </w:tcPr>
+          <w:p>
+            <w:pPr>
+              <w:pStyle w:val="Compact"/>
+              <w:spacing w:after="0"/>
+              <w:jc w:val="right"/>
+            </w:pPr>
+            <w:r>
+              <w:t xml:space="preserve">Method</w:t>
+            </w:r>
+          </w:p>
+        </w:tc>
+        <w:tc>
+          <w:tcPr>
+            <w:tcBorders>
+              <w:top w:val="single" w:sz="8" w:color="000000"/>
+              <w:bottom w:val="single" w:sz="8" w:color="000000"/>
+            </w:tcBorders>
+          </w:tcPr>
+          <w:p>
+            <w:pPr>
+              <w:pStyle w:val="Compact"/>
+              <w:spacing w:after="0"/>
+              <w:jc w:val="right"/>
+            </w:pPr>
+            <w:r>
+              <w:t xml:space="preserve">Coverage (range)</w:t>
+            </w:r>
+          </w:p>
+        </w:tc>
+        <w:tc>
+          <w:tcPr>
+            <w:tcBorders>
+              <w:top w:val="single" w:sz="8" w:color="000000"/>
+              <w:bottom w:val="single" w:sz="8" w:color="000000"/>
+            </w:tcBorders>
+          </w:tcPr>
+          <w:p>
+            <w:pPr>
+              <w:pStyle w:val="Compact"/>
+              <w:spacing w:after="0"/>
+              <w:jc w:val="right"/>
+            </w:pPr>
+            <w:r>
+              <w:t xml:space="preserve">Under</w:t>
+            </w:r>
+          </w:p>
+        </w:tc>
+        <w:tc>
+          <w:tcPr>
+            <w:tcBorders>
+              <w:top w:val="single" w:sz="8" w:color="000000"/>
+              <w:bottom w:val="single" w:sz="8" w:color="000000"/>
+            </w:tcBorders>
+          </w:tcPr>
+          <w:p>
+            <w:pPr>
+              <w:pStyle w:val="Compact"/>
+              <w:spacing w:after="0"/>
+              <w:jc w:val="right"/>
+            </w:pPr>
+            <w:r>
+              <w:t xml:space="preserve">Unbounded (% reps)</w:t>
+            </w:r>
+          </w:p>
+        </w:tc>
+        <w:tc>
+          <w:tcPr>
+            <w:tcBorders>
+              <w:top w:val="single" w:sz="8" w:color="000000"/>
+              <w:bottom w:val="single" w:sz="8" w:color="000000"/>
+            </w:tcBorders>
+          </w:tcPr>
+          <w:p>
+            <w:pPr>
+              <w:pStyle w:val="Compact"/>
+              <w:spacing w:after="0"/>
+              <w:jc w:val="right"/>
+            </w:pPr>
+            <w:r>
+              <w:t xml:space="preserve">Median width (% DM)</w:t>
+            </w:r>
+          </w:p>
+        </w:tc>
+        <w:tc>
+          <w:tcPr>
+            <w:tcBorders>
+              <w:top w:val="single" w:sz="8" w:color="000000"/>
+              <w:bottom w:val="single" w:sz="8" w:color="000000"/>
+            </w:tcBorders>
+          </w:tcPr>
+          <w:p>
+            <w:pPr>
+              <w:pStyle w:val="Compact"/>
+              <w:spacing w:after="0"/>
+              <w:jc w:val="right"/>
+            </w:pPr>
+            <w:r>
+              <w:t xml:space="preserve">RMSEP (% DM)</w:t>
+            </w:r>
+          </w:p>
+        </w:tc>
+      </w:tr>
+      <w:tr>
+        <w:tc>
+          <w:tcPr/>
+          <w:p>
+            <w:pPr>
+              <w:pStyle w:val="Compact"/>
+              <w:spacing w:after="0"/>
+              <w:jc w:val="left"/>
+            </w:pPr>
+            <w:r>
+              <w:t xml:space="preserve">PDS</w:t>
+            </w:r>
+          </w:p>
+        </w:tc>
+        <w:tc>
+          <w:tcPr/>
+          <w:p>
+            <w:pPr>
+              <w:pStyle w:val="Compact"/>
+              <w:spacing w:after="0"/>
+              <w:jc w:val="right"/>
+            </w:pPr>
+            <w:r>
+              <w:t xml:space="preserve">TJ+N</w:t>
+            </w:r>
+          </w:p>
+        </w:tc>
+        <w:tc>
+          <w:tcPr/>
+          <w:p>
+            <w:pPr>
+              <w:pStyle w:val="Compact"/>
+              <w:spacing w:after="0"/>
+              <w:jc w:val="right"/>
+            </w:pPr>
+            <w:r>
+              <w:t xml:space="preserve">0.931 (0.91–0.97)</w:t>
+            </w:r>
+          </w:p>
+        </w:tc>
+        <w:tc>
+          <w:tcPr/>
+          <w:p>
+            <w:pPr>
+              <w:pStyle w:val="Compact"/>
+              <w:spacing w:after="0"/>
+              <w:jc w:val="right"/>
+            </w:pPr>
+            <w:r>
+              <w:t xml:space="preserve">0/12</w:t>
+            </w:r>
+          </w:p>
+        </w:tc>
+        <w:tc>
+          <w:tcPr/>
+          <w:p>
+            <w:pPr>
+              <w:pStyle w:val="Compact"/>
+              <w:spacing w:after="0"/>
+              <w:jc w:val="right"/>
+            </w:pPr>
+            <w:r>
+              <w:t xml:space="preserve">0</w:t>
+            </w:r>
+          </w:p>
+        </w:tc>
+        <w:tc>
+          <w:tcPr/>
+          <w:p>
+            <w:pPr>
+              <w:pStyle w:val="Compact"/>
+              <w:spacing w:after="0"/>
+              <w:jc w:val="right"/>
+            </w:pPr>
+            <w:r>
+              <w:t xml:space="preserve">11.05</w:t>
+            </w:r>
+          </w:p>
+        </w:tc>
+        <w:tc>
+          <w:tcPr/>
+          <w:p>
+            <w:pPr>
+              <w:pStyle w:val="Compact"/>
+              <w:spacing w:after="0"/>
+              <w:jc w:val="right"/>
+            </w:pPr>
+            <w:r>
+              <w:t xml:space="preserve">4.03</w:t>
+            </w:r>
+          </w:p>
+        </w:tc>
+      </w:tr>
+      <w:tr>
+        <w:tc>
+          <w:tcPr/>
+          <w:p>
+            <w:pPr>
+              <w:pStyle w:val="Compact"/>
+              <w:spacing w:after="0"/>
+              <w:jc w:val="left"/>
+            </w:pPr>
+            <w:r>
+              <w:t xml:space="preserve">PDS</w:t>
+            </w:r>
+          </w:p>
+        </w:tc>
+        <w:tc>
+          <w:tcPr/>
+          <w:p>
+            <w:pPr>
+              <w:pStyle w:val="Compact"/>
+              <w:spacing w:after="0"/>
+              <w:jc w:val="right"/>
+            </w:pPr>
+            <w:r>
+              <w:t xml:space="preserve">TJ+</w:t>
+            </w:r>
+          </w:p>
+        </w:tc>
+        <w:tc>
+          <w:tcPr/>
+          <w:p>
+            <w:pPr>
+              <w:pStyle w:val="Compact"/>
+              <w:spacing w:after="0"/>
+              <w:jc w:val="right"/>
+            </w:pPr>
+            <w:r>
+              <w:t xml:space="preserve">0.929 (0.90–0.97)</w:t>
+            </w:r>
+          </w:p>
+        </w:tc>
+        <w:tc>
+          <w:tcPr/>
+          <w:p>
+            <w:pPr>
+              <w:pStyle w:val="Compact"/>
+              <w:spacing w:after="0"/>
+              <w:jc w:val="right"/>
+            </w:pPr>
+            <w:r>
+              <w:t xml:space="preserve">0/12</w:t>
+            </w:r>
+          </w:p>
+        </w:tc>
+        <w:tc>
+          <w:tcPr/>
+          <w:p>
+            <w:pPr>
+              <w:pStyle w:val="Compact"/>
+              <w:spacing w:after="0"/>
+              <w:jc w:val="right"/>
+            </w:pPr>
+            <w:r>
+              <w:t xml:space="preserve">0</w:t>
+            </w:r>
+          </w:p>
+        </w:tc>
+        <w:tc>
+          <w:tcPr/>
+          <w:p>
+            <w:pPr>
+              <w:pStyle w:val="Compact"/>
+              <w:spacing w:after="0"/>
+              <w:jc w:val="right"/>
+            </w:pPr>
+            <w:r>
+              <w:t xml:space="preserve">12.79</w:t>
+            </w:r>
+          </w:p>
+        </w:tc>
+        <w:tc>
+          <w:tcPr/>
+          <w:p>
+            <w:pPr>
+              <w:pStyle w:val="Compact"/>
+              <w:spacing w:after="0"/>
+              <w:jc w:val="right"/>
+            </w:pPr>
+            <w:r>
+              <w:t xml:space="preserve">4.03</w:t>
+            </w:r>
+          </w:p>
+        </w:tc>
+      </w:tr>
+      <w:tr>
+        <w:tc>
+          <w:tcPr/>
+          <w:p>
+            <w:pPr>
+              <w:pStyle w:val="Compact"/>
+              <w:spacing w:after="0"/>
+              <w:jc w:val="left"/>
+            </w:pPr>
+            <w:r>
+              <w:t xml:space="preserve">PDS</w:t>
+            </w:r>
+          </w:p>
+        </w:tc>
+        <w:tc>
+          <w:tcPr/>
+          <w:p>
+            <w:pPr>
+              <w:pStyle w:val="Compact"/>
+              <w:spacing w:after="0"/>
+              <w:jc w:val="right"/>
+            </w:pPr>
+            <w:r>
+              <w:t xml:space="preserve">SCP-T-split-N</w:t>
+            </w:r>
+          </w:p>
+        </w:tc>
+        <w:tc>
+          <w:tcPr/>
+          <w:p>
+            <w:pPr>
+              <w:pStyle w:val="Compact"/>
+              <w:spacing w:after="0"/>
+              <w:jc w:val="right"/>
+            </w:pPr>
+            <w:r>
+              <w:t xml:space="preserve">0.943 (0.91–1.00)</w:t>
+            </w:r>
+          </w:p>
+        </w:tc>
+        <w:tc>
+          <w:tcPr/>
+          <w:p>
+            <w:pPr>
+              <w:pStyle w:val="Compact"/>
+              <w:spacing w:after="0"/>
+              <w:jc w:val="right"/>
+            </w:pPr>
+            <w:r>
+              <w:t xml:space="preserve">0/12</w:t>
+            </w:r>
+          </w:p>
+        </w:tc>
+        <w:tc>
+          <w:tcPr/>
+          <w:p>
+            <w:pPr>
+              <w:pStyle w:val="Compact"/>
+              <w:spacing w:after="0"/>
+              <w:jc w:val="right"/>
+            </w:pPr>
+            <w:r>
+              <w:t xml:space="preserve">25</w:t>
+            </w:r>
+          </w:p>
+        </w:tc>
+        <w:tc>
+          <w:tcPr/>
+          <w:p>
+            <w:pPr>
+              <w:pStyle w:val="Compact"/>
+              <w:spacing w:after="0"/>
+              <w:jc w:val="right"/>
+            </w:pPr>
+            <w:r>
+              <w:t xml:space="preserve">11.15</w:t>
+            </w:r>
+          </w:p>
+        </w:tc>
+        <w:tc>
+          <w:tcPr/>
+          <w:p>
+            <w:pPr>
+              <w:pStyle w:val="Compact"/>
+              <w:spacing w:after="0"/>
+              <w:jc w:val="right"/>
+            </w:pPr>
+            <w:r>
+              <w:t xml:space="preserve">4.03</w:t>
+            </w:r>
+          </w:p>
+        </w:tc>
+      </w:tr>
+      <w:tr>
+        <w:tc>
+          <w:tcPr/>
+          <w:p>
+            <w:pPr>
+              <w:pStyle w:val="Compact"/>
+              <w:spacing w:after="0"/>
+              <w:jc w:val="left"/>
+            </w:pPr>
+            <w:r>
+              <w:t xml:space="preserve">PDS</w:t>
+            </w:r>
+          </w:p>
+        </w:tc>
+        <w:tc>
+          <w:tcPr/>
+          <w:p>
+            <w:pPr>
+              <w:pStyle w:val="Compact"/>
+              <w:spacing w:after="0"/>
+              <w:jc w:val="right"/>
+            </w:pPr>
+            <w:r>
+              <w:t xml:space="preserve">Gauss-LOO</w:t>
+            </w:r>
+          </w:p>
+        </w:tc>
+        <w:tc>
+          <w:tcPr/>
+          <w:p>
+            <w:pPr>
+              <w:pStyle w:val="Compact"/>
+              <w:spacing w:after="0"/>
+              <w:jc w:val="right"/>
+            </w:pPr>
+            <w:r>
+              <w:t xml:space="preserve">0.916 (0.90–0.93)</w:t>
+            </w:r>
+          </w:p>
+        </w:tc>
+        <w:tc>
+          <w:tcPr/>
+          <w:p>
+            <w:pPr>
+              <w:pStyle w:val="Compact"/>
+              <w:spacing w:after="0"/>
+              <w:jc w:val="right"/>
+            </w:pPr>
+            <w:r>
+              <w:t xml:space="preserve">0/12</w:t>
+            </w:r>
+          </w:p>
+        </w:tc>
+        <w:tc>
+          <w:tcPr/>
+          <w:p>
+            <w:pPr>
+              <w:pStyle w:val="Compact"/>
+              <w:spacing w:after="0"/>
+              <w:jc w:val="right"/>
+            </w:pPr>
+            <w:r>
+              <w:t xml:space="preserve">0</w:t>
+            </w:r>
+          </w:p>
+        </w:tc>
+        <w:tc>
+          <w:tcPr/>
+          <w:p>
+            <w:pPr>
+              <w:pStyle w:val="Compact"/>
+              <w:spacing w:after="0"/>
+              <w:jc w:val="right"/>
+            </w:pPr>
+            <w:r>
+              <w:t xml:space="preserve">12.13</w:t>
+            </w:r>
+          </w:p>
+        </w:tc>
+        <w:tc>
+          <w:tcPr/>
+          <w:p>
+            <w:pPr>
+              <w:pStyle w:val="Compact"/>
+              <w:spacing w:after="0"/>
+              <w:jc w:val="right"/>
+            </w:pPr>
+            <w:r>
+              <w:t xml:space="preserve">4.03</w:t>
+            </w:r>
+          </w:p>
+        </w:tc>
+      </w:tr>
+      <w:tr>
+        <w:tc>
+          <w:tcPr/>
+          <w:p>
+            <w:pPr>
+              <w:pStyle w:val="Compact"/>
+              <w:spacing w:after="0"/>
+              <w:jc w:val="left"/>
+            </w:pPr>
+            <w:r>
+              <w:t xml:space="preserve">PDS</w:t>
+            </w:r>
+          </w:p>
+        </w:tc>
+        <w:tc>
+          <w:tcPr/>
+          <w:p>
+            <w:pPr>
+              <w:pStyle w:val="Compact"/>
+              <w:spacing w:after="0"/>
+              <w:jc w:val="right"/>
+            </w:pPr>
+            <w:r>
+              <w:t xml:space="preserve">ASTM-PI</w:t>
+            </w:r>
+          </w:p>
+        </w:tc>
+        <w:tc>
+          <w:tcPr/>
+          <w:p>
+            <w:pPr>
+              <w:pStyle w:val="Compact"/>
+              <w:spacing w:after="0"/>
+              <w:jc w:val="right"/>
+            </w:pPr>
+            <w:r>
+              <w:t xml:space="preserve">0.355 (0.22–0.51)</w:t>
+            </w:r>
+          </w:p>
+        </w:tc>
+        <w:tc>
+          <w:tcPr/>
+          <w:p>
+            <w:pPr>
+              <w:pStyle w:val="Compact"/>
+              <w:spacing w:after="0"/>
+              <w:jc w:val="right"/>
+            </w:pPr>
+            <w:r>
+              <w:t xml:space="preserve">12/12</w:t>
+            </w:r>
+          </w:p>
+        </w:tc>
+        <w:tc>
+          <w:tcPr/>
+          <w:p>
+            <w:pPr>
+              <w:pStyle w:val="Compact"/>
+              <w:spacing w:after="0"/>
+              <w:jc w:val="right"/>
+            </w:pPr>
+            <w:r>
+              <w:t xml:space="preserve">0</w:t>
+            </w:r>
+          </w:p>
+        </w:tc>
+        <w:tc>
+          <w:tcPr/>
+          <w:p>
+            <w:pPr>
+              <w:pStyle w:val="Compact"/>
+              <w:spacing w:after="0"/>
+              <w:jc w:val="right"/>
+            </w:pPr>
+            <w:r>
+              <w:t xml:space="preserve">2.71</w:t>
+            </w:r>
+          </w:p>
+        </w:tc>
+        <w:tc>
+          <w:tcPr/>
+          <w:p>
+            <w:pPr>
+              <w:pStyle w:val="Compact"/>
+              <w:spacing w:after="0"/>
+              <w:jc w:val="right"/>
+            </w:pPr>
+            <w:r>
+              <w:t xml:space="preserve">4.03</w:t>
+            </w:r>
+          </w:p>
+        </w:tc>
+      </w:tr>
+      <w:tr>
+        <w:tc>
+          <w:tcPr/>
+          <w:p>
+            <w:pPr>
+              <w:pStyle w:val="Compact"/>
+              <w:spacing w:after="0"/>
+              <w:jc w:val="left"/>
+            </w:pPr>
+            <w:r>
+              <w:t xml:space="preserve">PDS</w:t>
+            </w:r>
+          </w:p>
+        </w:tc>
+        <w:tc>
+          <w:tcPr/>
+          <w:p>
+            <w:pPr>
+              <w:pStyle w:val="Compact"/>
+              <w:spacing w:after="0"/>
+              <w:jc w:val="right"/>
+            </w:pPr>
+            <w:r>
+              <w:t xml:space="preserve">SCP-S</w:t>
+            </w:r>
+          </w:p>
+        </w:tc>
+        <w:tc>
+          <w:tcPr/>
+          <w:p>
+            <w:pPr>
+              <w:pStyle w:val="Compact"/>
+              <w:spacing w:after="0"/>
+              <w:jc w:val="right"/>
+            </w:pPr>
+            <w:r>
+              <w:t xml:space="preserve">0.342 (0.20–0.50)</w:t>
+            </w:r>
+          </w:p>
+        </w:tc>
+        <w:tc>
+          <w:tcPr/>
+          <w:p>
+            <w:pPr>
+              <w:pStyle w:val="Compact"/>
+              <w:spacing w:after="0"/>
+              <w:jc w:val="right"/>
+            </w:pPr>
+            <w:r>
+              <w:t xml:space="preserve">12/12</w:t>
+            </w:r>
+          </w:p>
+        </w:tc>
+        <w:tc>
+          <w:tcPr/>
+          <w:p>
+            <w:pPr>
+              <w:pStyle w:val="Compact"/>
+              <w:spacing w:after="0"/>
+              <w:jc w:val="right"/>
+            </w:pPr>
+            <w:r>
+              <w:t xml:space="preserve">0</w:t>
+            </w:r>
+          </w:p>
+        </w:tc>
+        <w:tc>
+          <w:tcPr/>
+          <w:p>
+            <w:pPr>
+              <w:pStyle w:val="Compact"/>
+              <w:spacing w:after="0"/>
+              <w:jc w:val="right"/>
+            </w:pPr>
+            <w:r>
+              <w:t xml:space="preserve">2.60</w:t>
+            </w:r>
+          </w:p>
+        </w:tc>
+        <w:tc>
+          <w:tcPr/>
+          <w:p>
+            <w:pPr>
+              <w:pStyle w:val="Compact"/>
+              <w:spacing w:after="0"/>
+              <w:jc w:val="right"/>
+            </w:pPr>
+            <w:r>
+              <w:t xml:space="preserve">4.03</w:t>
+            </w:r>
+          </w:p>
+        </w:tc>
+      </w:tr>
+      <w:tr>
+        <w:tc>
+          <w:tcPr/>
+          <w:p>
+            <w:pPr>
+              <w:pStyle w:val="Compact"/>
+              <w:spacing w:after="0"/>
+              <w:jc w:val="left"/>
+            </w:pPr>
+            <w:r>
+              <w:t xml:space="preserve">PDS</w:t>
+            </w:r>
+          </w:p>
+        </w:tc>
+        <w:tc>
+          <w:tcPr/>
+          <w:p>
+            <w:pPr>
+              <w:pStyle w:val="Compact"/>
+              <w:spacing w:after="0"/>
+              <w:jc w:val="right"/>
+            </w:pPr>
+            <w:r>
+              <w:t xml:space="preserve">WCP-S</w:t>
+            </w:r>
+          </w:p>
+        </w:tc>
+        <w:tc>
+          <w:tcPr/>
+          <w:p>
+            <w:pPr>
+              <w:pStyle w:val="Compact"/>
+              <w:spacing w:after="0"/>
+              <w:jc w:val="right"/>
+            </w:pPr>
+            <w:r>
+              <w:t xml:space="preserve">0.292 (0.15–0.47)</w:t>
+            </w:r>
+          </w:p>
+        </w:tc>
+        <w:tc>
+          <w:tcPr/>
+          <w:p>
+            <w:pPr>
+              <w:pStyle w:val="Compact"/>
+              <w:spacing w:after="0"/>
+              <w:jc w:val="right"/>
+            </w:pPr>
+            <w:r>
+              <w:t xml:space="preserve">12/12</w:t>
+            </w:r>
+          </w:p>
+        </w:tc>
+        <w:tc>
+          <w:tcPr/>
+          <w:p>
+            <w:pPr>
+              <w:pStyle w:val="Compact"/>
+              <w:spacing w:after="0"/>
+              <w:jc w:val="right"/>
+            </w:pPr>
+            <w:r>
+              <w:t xml:space="preserve">25</w:t>
+            </w:r>
+          </w:p>
+        </w:tc>
+        <w:tc>
+          <w:tcPr/>
+          <w:p>
+            <w:pPr>
+              <w:pStyle w:val="Compact"/>
+              <w:spacing w:after="0"/>
+              <w:jc w:val="right"/>
+            </w:pPr>
+            <w:r>
+              <w:t xml:space="preserve">2.24</w:t>
+            </w:r>
+          </w:p>
+        </w:tc>
+        <w:tc>
+          <w:tcPr/>
+          <w:p>
+            <w:pPr>
+              <w:pStyle w:val="Compact"/>
+              <w:spacing w:after="0"/>
+              <w:jc w:val="right"/>
+            </w:pPr>
+            <w:r>
+              <w:t xml:space="preserve">4.03</w:t>
+            </w:r>
+          </w:p>
+        </w:tc>
+      </w:tr>
+      <w:tr>
+        <w:tc>
+          <w:tcPr/>
+          <w:p>
+            <w:pPr>
+              <w:pStyle w:val="Compact"/>
+              <w:spacing w:after="0"/>
+              <w:jc w:val="left"/>
+            </w:pPr>
+            <w:r>
+              <w:t xml:space="preserve">PDS</w:t>
+            </w:r>
+          </w:p>
+        </w:tc>
+        <w:tc>
+          <w:tcPr/>
+          <w:p>
+            <w:pPr>
+              <w:pStyle w:val="Compact"/>
+              <w:spacing w:after="0"/>
+              <w:jc w:val="right"/>
+            </w:pPr>
+            <w:r>
+              <w:t xml:space="preserve">Transport</w:t>
+            </w:r>
+          </w:p>
+        </w:tc>
+        <w:tc>
+          <w:tcPr/>
+          <w:p>
+            <w:pPr>
+              <w:pStyle w:val="Compact"/>
+              <w:spacing w:after="0"/>
+              <w:jc w:val="right"/>
+            </w:pPr>
+            <w:r>
+              <w:t xml:space="preserve">0.978 (0.95–0.99)</w:t>
+            </w:r>
+          </w:p>
+        </w:tc>
+        <w:tc>
+          <w:tcPr/>
+          <w:p>
+            <w:pPr>
+              <w:pStyle w:val="Compact"/>
+              <w:spacing w:after="0"/>
+              <w:jc w:val="right"/>
+            </w:pPr>
+            <w:r>
+              <w:t xml:space="preserve">0/12</w:t>
+            </w:r>
+          </w:p>
+        </w:tc>
+        <w:tc>
+          <w:tcPr/>
+          <w:p>
+            <w:pPr>
+              <w:pStyle w:val="Compact"/>
+              <w:spacing w:after="0"/>
+              <w:jc w:val="right"/>
+            </w:pPr>
+            <w:r>
+              <w:t xml:space="preserve">0</w:t>
+            </w:r>
+          </w:p>
+        </w:tc>
+        <w:tc>
+          <w:tcPr/>
+          <w:p>
+            <w:pPr>
+              <w:pStyle w:val="Compact"/>
+              <w:spacing w:after="0"/>
+              <w:jc w:val="right"/>
+            </w:pPr>
+            <w:r>
+              <w:t xml:space="preserve">24.63</w:t>
+            </w:r>
+          </w:p>
+        </w:tc>
+        <w:tc>
+          <w:tcPr/>
+          <w:p>
+            <w:pPr>
+              <w:pStyle w:val="Compact"/>
+              <w:spacing w:after="0"/>
+              <w:jc w:val="right"/>
+            </w:pPr>
+            <w:r>
+              <w:t xml:space="preserve">4.03</w:t>
+            </w:r>
+          </w:p>
+        </w:tc>
+      </w:tr>
+      <w:tr>
+        <w:tc>
+          <w:tcPr/>
+          <w:p>
+            <w:pPr>
+              <w:pStyle w:val="Compact"/>
+              <w:spacing w:after="0"/>
+              <w:jc w:val="left"/>
+            </w:pPr>
+            <w:r>
+              <w:t xml:space="preserve">PDS</w:t>
+            </w:r>
+          </w:p>
+        </w:tc>
+        <w:tc>
+          <w:tcPr/>
+          <w:p>
+            <w:pPr>
+              <w:pStyle w:val="Compact"/>
+              <w:spacing w:after="0"/>
+              <w:jc w:val="right"/>
+            </w:pPr>
+            <w:r>
+              <w:t xml:space="preserve">LF-conv</w:t>
+            </w:r>
+          </w:p>
+        </w:tc>
+        <w:tc>
+          <w:tcPr/>
+          <w:p>
+            <w:pPr>
+              <w:pStyle w:val="Compact"/>
+              <w:spacing w:after="0"/>
+              <w:jc w:val="right"/>
+            </w:pPr>
+            <w:r>
+              <w:t xml:space="preserve">0.887 (0.86–0.91)</w:t>
+            </w:r>
+          </w:p>
+        </w:tc>
+        <w:tc>
+          <w:tcPr/>
+          <w:p>
+            <w:pPr>
+              <w:pStyle w:val="Compact"/>
+              <w:spacing w:after="0"/>
+              <w:jc w:val="right"/>
+            </w:pPr>
+            <w:r>
+              <w:t xml:space="preserve">6/12</w:t>
+            </w:r>
+          </w:p>
+        </w:tc>
+        <w:tc>
+          <w:tcPr/>
+          <w:p>
+            <w:pPr>
+              <w:pStyle w:val="Compact"/>
+              <w:spacing w:after="0"/>
+              <w:jc w:val="right"/>
+            </w:pPr>
+            <w:r>
+              <w:t xml:space="preserve">0</w:t>
+            </w:r>
+          </w:p>
+        </w:tc>
+        <w:tc>
+          <w:tcPr/>
+          <w:p>
+            <w:pPr>
+              <w:pStyle w:val="Compact"/>
+              <w:spacing w:after="0"/>
+              <w:jc w:val="right"/>
+            </w:pPr>
+            <w:r>
+              <w:t xml:space="preserve">11.83</w:t>
+            </w:r>
+          </w:p>
+        </w:tc>
+        <w:tc>
+          <w:tcPr/>
+          <w:p>
+            <w:pPr>
+              <w:pStyle w:val="Compact"/>
+              <w:spacing w:after="0"/>
+              <w:jc w:val="right"/>
+            </w:pPr>
+            <w:r>
+              <w:t xml:space="preserve">4.03</w:t>
+            </w:r>
+          </w:p>
+        </w:tc>
+      </w:tr>
+      <w:tr>
+        <w:tc>
+          <w:tcPr/>
+          <w:p>
+            <w:pPr>
+              <w:pStyle w:val="Compact"/>
+              <w:spacing w:after="0"/>
+              <w:jc w:val="left"/>
+            </w:pPr>
+            <w:r>
+              <w:t xml:space="preserve">SBC</w:t>
+            </w:r>
+          </w:p>
+        </w:tc>
+        <w:tc>
+          <w:tcPr/>
+          <w:p>
+            <w:pPr>
+              <w:pStyle w:val="Compact"/>
+              <w:spacing w:after="0"/>
+              <w:jc w:val="right"/>
+            </w:pPr>
+            <w:r>
+              <w:t xml:space="preserve">TJ+N</w:t>
+            </w:r>
+          </w:p>
+        </w:tc>
+        <w:tc>
+          <w:tcPr/>
+          <w:p>
+            <w:pPr>
+              <w:pStyle w:val="Compact"/>
+              <w:spacing w:after="0"/>
+              <w:jc w:val="right"/>
+            </w:pPr>
+            <w:r>
+              <w:t xml:space="preserve">0.906 (0.90–0.92)</w:t>
+            </w:r>
+          </w:p>
+        </w:tc>
+        <w:tc>
+          <w:tcPr/>
+          <w:p>
+            <w:pPr>
+              <w:pStyle w:val="Compact"/>
+              <w:spacing w:after="0"/>
+              <w:jc w:val="right"/>
+            </w:pPr>
+            <w:r>
+              <w:t xml:space="preserve">0/12</w:t>
+            </w:r>
+          </w:p>
+        </w:tc>
+        <w:tc>
+          <w:tcPr/>
+          <w:p>
+            <w:pPr>
+              <w:pStyle w:val="Compact"/>
+              <w:spacing w:after="0"/>
+              <w:jc w:val="right"/>
+            </w:pPr>
+            <w:r>
+              <w:t xml:space="preserve">0</w:t>
+            </w:r>
+          </w:p>
+        </w:tc>
+        <w:tc>
+          <w:tcPr/>
+          <w:p>
+            <w:pPr>
+              <w:pStyle w:val="Compact"/>
+              <w:spacing w:after="0"/>
+              <w:jc w:val="right"/>
+            </w:pPr>
+            <w:r>
+              <w:t xml:space="preserve">4.00</w:t>
+            </w:r>
+          </w:p>
+        </w:tc>
+        <w:tc>
+          <w:tcPr/>
+          <w:p>
+            <w:pPr>
+              <w:pStyle w:val="Compact"/>
+              <w:spacing w:after="0"/>
+              <w:jc w:val="right"/>
+            </w:pPr>
+            <w:r>
+              <w:t xml:space="preserve">1.14</w:t>
+            </w:r>
+          </w:p>
+        </w:tc>
+      </w:tr>
+      <w:tr>
+        <w:tc>
+          <w:tcPr/>
+          <w:p>
+            <w:pPr>
+              <w:pStyle w:val="Compact"/>
+              <w:spacing w:after="0"/>
+              <w:jc w:val="left"/>
+            </w:pPr>
+            <w:r>
+              <w:t xml:space="preserve">SBC</w:t>
+            </w:r>
+          </w:p>
+        </w:tc>
+        <w:tc>
+          <w:tcPr/>
+          <w:p>
+            <w:pPr>
+              <w:pStyle w:val="Compact"/>
+              <w:spacing w:after="0"/>
+              <w:jc w:val="right"/>
+            </w:pPr>
+            <w:r>
+              <w:t xml:space="preserve">TJ+</w:t>
+            </w:r>
+          </w:p>
+        </w:tc>
+        <w:tc>
+          <w:tcPr/>
+          <w:p>
+            <w:pPr>
+              <w:pStyle w:val="Compact"/>
+              <w:spacing w:after="0"/>
+              <w:jc w:val="right"/>
+            </w:pPr>
+            <w:r>
+              <w:t xml:space="preserve">0.906 (0.90–0.92)</w:t>
+            </w:r>
+          </w:p>
+        </w:tc>
+        <w:tc>
+          <w:tcPr/>
+          <w:p>
+            <w:pPr>
+              <w:pStyle w:val="Compact"/>
+              <w:spacing w:after="0"/>
+              <w:jc w:val="right"/>
+            </w:pPr>
+            <w:r>
+              <w:t xml:space="preserve">0/12</w:t>
+            </w:r>
+          </w:p>
+        </w:tc>
+        <w:tc>
+          <w:tcPr/>
+          <w:p>
+            <w:pPr>
+              <w:pStyle w:val="Compact"/>
+              <w:spacing w:after="0"/>
+              <w:jc w:val="right"/>
+            </w:pPr>
+            <w:r>
+              <w:t xml:space="preserve">0</w:t>
+            </w:r>
+          </w:p>
+        </w:tc>
+        <w:tc>
+          <w:tcPr/>
+          <w:p>
+            <w:pPr>
+              <w:pStyle w:val="Compact"/>
+              <w:spacing w:after="0"/>
+              <w:jc w:val="right"/>
+            </w:pPr>
+            <w:r>
+              <w:t xml:space="preserve">3.87</w:t>
+            </w:r>
+          </w:p>
+        </w:tc>
+        <w:tc>
+          <w:tcPr/>
+          <w:p>
+            <w:pPr>
+              <w:pStyle w:val="Compact"/>
+              <w:spacing w:after="0"/>
+              <w:jc w:val="right"/>
+            </w:pPr>
+            <w:r>
+              <w:t xml:space="preserve">1.14</w:t>
+            </w:r>
+          </w:p>
+        </w:tc>
+      </w:tr>
+      <w:tr>
+        <w:tc>
+          <w:tcPr/>
+          <w:p>
+            <w:pPr>
+              <w:pStyle w:val="Compact"/>
+              <w:spacing w:after="0"/>
+              <w:jc w:val="left"/>
+            </w:pPr>
+            <w:r>
+              <w:t xml:space="preserve">SBC</w:t>
+            </w:r>
+          </w:p>
+        </w:tc>
+        <w:tc>
+          <w:tcPr/>
+          <w:p>
+            <w:pPr>
+              <w:pStyle w:val="Compact"/>
+              <w:spacing w:after="0"/>
+              <w:jc w:val="right"/>
+            </w:pPr>
+            <w:r>
+              <w:t xml:space="preserve">SCP-T-split-N</w:t>
+            </w:r>
+          </w:p>
+        </w:tc>
+        <w:tc>
+          <w:tcPr/>
+          <w:p>
+            <w:pPr>
+              <w:pStyle w:val="Compact"/>
+              <w:spacing w:after="0"/>
+              <w:jc w:val="right"/>
+            </w:pPr>
+            <w:r>
+              <w:t xml:space="preserve">0.941 (0.90–1.00)</w:t>
+            </w:r>
+          </w:p>
+        </w:tc>
+        <w:tc>
+          <w:tcPr/>
+          <w:p>
+            <w:pPr>
+              <w:pStyle w:val="Compact"/>
+              <w:spacing w:after="0"/>
+              <w:jc w:val="right"/>
+            </w:pPr>
+            <w:r>
+              <w:t xml:space="preserve">0/12</w:t>
+            </w:r>
+          </w:p>
+        </w:tc>
+        <w:tc>
+          <w:tcPr/>
+          <w:p>
+            <w:pPr>
+              <w:pStyle w:val="Compact"/>
+              <w:spacing w:after="0"/>
+              <w:jc w:val="right"/>
+            </w:pPr>
+            <w:r>
+              <w:t xml:space="preserve">25</w:t>
+            </w:r>
+          </w:p>
+        </w:tc>
+        <w:tc>
+          <w:tcPr/>
+          <w:p>
+            <w:pPr>
+              <w:pStyle w:val="Compact"/>
+              <w:spacing w:after="0"/>
+              <w:jc w:val="right"/>
+            </w:pPr>
+            <w:r>
+              <w:t xml:space="preserve">4.56</w:t>
+            </w:r>
+          </w:p>
+        </w:tc>
+        <w:tc>
+          <w:tcPr/>
+          <w:p>
+            <w:pPr>
+              <w:pStyle w:val="Compact"/>
+              <w:spacing w:after="0"/>
+              <w:jc w:val="right"/>
+            </w:pPr>
+            <w:r>
+              <w:t xml:space="preserve">1.14</w:t>
+            </w:r>
+          </w:p>
+        </w:tc>
+      </w:tr>
+      <w:tr>
+        <w:tc>
+          <w:tcPr/>
+          <w:p>
+            <w:pPr>
+              <w:pStyle w:val="Compact"/>
+              <w:spacing w:after="0"/>
+              <w:jc w:val="left"/>
+            </w:pPr>
+            <w:r>
+              <w:t xml:space="preserve">SBC</w:t>
+            </w:r>
+          </w:p>
+        </w:tc>
+        <w:tc>
+          <w:tcPr/>
+          <w:p>
+            <w:pPr>
+              <w:pStyle w:val="Compact"/>
+              <w:spacing w:after="0"/>
+              <w:jc w:val="right"/>
+            </w:pPr>
+            <w:r>
+              <w:t xml:space="preserve">Gauss-LOO</w:t>
+            </w:r>
+          </w:p>
+        </w:tc>
+        <w:tc>
+          <w:tcPr/>
+          <w:p>
+            <w:pPr>
+              <w:pStyle w:val="Compact"/>
+              <w:spacing w:after="0"/>
+              <w:jc w:val="right"/>
+            </w:pPr>
+            <w:r>
+              <w:t xml:space="preserve">0.900 (0.89–0.91)</w:t>
+            </w:r>
+          </w:p>
+        </w:tc>
+        <w:tc>
+          <w:tcPr/>
+          <w:p>
+            <w:pPr>
+              <w:pStyle w:val="Compact"/>
+              <w:spacing w:after="0"/>
+              <w:jc w:val="right"/>
+            </w:pPr>
+            <w:r>
+              <w:t xml:space="preserve">0/12</w:t>
+            </w:r>
+          </w:p>
+        </w:tc>
+        <w:tc>
+          <w:tcPr/>
+          <w:p>
+            <w:pPr>
+              <w:pStyle w:val="Compact"/>
+              <w:spacing w:after="0"/>
+              <w:jc w:val="right"/>
+            </w:pPr>
+            <w:r>
+              <w:t xml:space="preserve">0</w:t>
+            </w:r>
+          </w:p>
+        </w:tc>
+        <w:tc>
+          <w:tcPr/>
+          <w:p>
+            <w:pPr>
+              <w:pStyle w:val="Compact"/>
+              <w:spacing w:after="0"/>
+              <w:jc w:val="right"/>
+            </w:pPr>
+            <w:r>
+              <w:t xml:space="preserve">3.85</w:t>
+            </w:r>
+          </w:p>
+        </w:tc>
+        <w:tc>
+          <w:tcPr/>
+          <w:p>
+            <w:pPr>
+              <w:pStyle w:val="Compact"/>
+              <w:spacing w:after="0"/>
+              <w:jc w:val="right"/>
+            </w:pPr>
+            <w:r>
+              <w:t xml:space="preserve">1.14</w:t>
+            </w:r>
+          </w:p>
+        </w:tc>
+      </w:tr>
+      <w:tr>
+        <w:tc>
+          <w:tcPr/>
+          <w:p>
+            <w:pPr>
+              <w:pStyle w:val="Compact"/>
+              <w:spacing w:after="0"/>
+              <w:jc w:val="left"/>
+            </w:pPr>
+            <w:r>
+              <w:t xml:space="preserve">SBC</w:t>
+            </w:r>
+          </w:p>
+        </w:tc>
+        <w:tc>
+          <w:tcPr/>
+          <w:p>
+            <w:pPr>
+              <w:pStyle w:val="Compact"/>
+              <w:spacing w:after="0"/>
+              <w:jc w:val="right"/>
+            </w:pPr>
+            <w:r>
+              <w:t xml:space="preserve">ASTM-PI</w:t>
+            </w:r>
+          </w:p>
+        </w:tc>
+        <w:tc>
+          <w:tcPr/>
+          <w:p>
+            <w:pPr>
+              <w:pStyle w:val="Compact"/>
+              <w:spacing w:after="0"/>
+              <w:jc w:val="right"/>
+            </w:pPr>
+            <w:r>
+              <w:t xml:space="preserve">0.781 (0.74–0.81)</w:t>
+            </w:r>
+          </w:p>
+        </w:tc>
+        <w:tc>
+          <w:tcPr/>
+          <w:p>
+            <w:pPr>
+              <w:pStyle w:val="Compact"/>
+              <w:spacing w:after="0"/>
+              <w:jc w:val="right"/>
+            </w:pPr>
+            <w:r>
+              <w:t xml:space="preserve">12/12</w:t>
+            </w:r>
+          </w:p>
+        </w:tc>
+        <w:tc>
+          <w:tcPr/>
+          <w:p>
+            <w:pPr>
+              <w:pStyle w:val="Compact"/>
+              <w:spacing w:after="0"/>
+              <w:jc w:val="right"/>
+            </w:pPr>
+            <w:r>
+              <w:t xml:space="preserve">0</w:t>
+            </w:r>
+          </w:p>
+        </w:tc>
+        <w:tc>
+          <w:tcPr/>
+          <w:p>
+            <w:pPr>
+              <w:pStyle w:val="Compact"/>
+              <w:spacing w:after="0"/>
+              <w:jc w:val="right"/>
+            </w:pPr>
+            <w:r>
+              <w:t xml:space="preserve">2.66</w:t>
+            </w:r>
+          </w:p>
+        </w:tc>
+        <w:tc>
+          <w:tcPr/>
+          <w:p>
+            <w:pPr>
+              <w:pStyle w:val="Compact"/>
+              <w:spacing w:after="0"/>
+              <w:jc w:val="right"/>
+            </w:pPr>
+            <w:r>
+              <w:t xml:space="preserve">1.14</w:t>
+            </w:r>
+          </w:p>
+        </w:tc>
+      </w:tr>
+      <w:tr>
+        <w:tc>
+          <w:tcPr/>
+          <w:p>
+            <w:pPr>
+              <w:pStyle w:val="Compact"/>
+              <w:spacing w:after="0"/>
+              <w:jc w:val="left"/>
+            </w:pPr>
+            <w:r>
+              <w:t xml:space="preserve">SBC</w:t>
+            </w:r>
+          </w:p>
+        </w:tc>
+        <w:tc>
+          <w:tcPr/>
+          <w:p>
+            <w:pPr>
+              <w:pStyle w:val="Compact"/>
+              <w:spacing w:after="0"/>
+              <w:jc w:val="right"/>
+            </w:pPr>
+            <w:r>
+              <w:t xml:space="preserve">SCP-S</w:t>
+            </w:r>
+          </w:p>
+        </w:tc>
+        <w:tc>
+          <w:tcPr/>
+          <w:p>
+            <w:pPr>
+              <w:pStyle w:val="Compact"/>
+              <w:spacing w:after="0"/>
+              <w:jc w:val="right"/>
+            </w:pPr>
+            <w:r>
+              <w:t xml:space="preserve">0.762 (0.73–0.80)</w:t>
+            </w:r>
+          </w:p>
+        </w:tc>
+        <w:tc>
+          <w:tcPr/>
+          <w:p>
+            <w:pPr>
+              <w:pStyle w:val="Compact"/>
+              <w:spacing w:after="0"/>
+              <w:jc w:val="right"/>
+            </w:pPr>
+            <w:r>
+              <w:t xml:space="preserve">12/12</w:t>
+            </w:r>
+          </w:p>
+        </w:tc>
+        <w:tc>
+          <w:tcPr/>
+          <w:p>
+            <w:pPr>
+              <w:pStyle w:val="Compact"/>
+              <w:spacing w:after="0"/>
+              <w:jc w:val="right"/>
+            </w:pPr>
+            <w:r>
+              <w:t xml:space="preserve">0</w:t>
+            </w:r>
+          </w:p>
+        </w:tc>
+        <w:tc>
+          <w:tcPr/>
+          <w:p>
+            <w:pPr>
+              <w:pStyle w:val="Compact"/>
+              <w:spacing w:after="0"/>
+              <w:jc w:val="right"/>
+            </w:pPr>
+            <w:r>
+              <w:t xml:space="preserve">2.60</w:t>
+            </w:r>
+          </w:p>
+        </w:tc>
+        <w:tc>
+          <w:tcPr/>
+          <w:p>
+            <w:pPr>
+              <w:pStyle w:val="Compact"/>
+              <w:spacing w:after="0"/>
+              <w:jc w:val="right"/>
+            </w:pPr>
+            <w:r>
+              <w:t xml:space="preserve">1.14</w:t>
+            </w:r>
+          </w:p>
+        </w:tc>
+      </w:tr>
+      <w:tr>
+        <w:tc>
+          <w:tcPr>
+            <w:tcBorders>
+              <w:bottom w:val="single" w:sz="8" w:color="000000"/>
+            </w:tcBorders>
+          </w:tcPr>
+          <w:p>
+            <w:pPr>
+              <w:pStyle w:val="Compact"/>
+              <w:spacing w:after="0"/>
+              <w:jc w:val="left"/>
+            </w:pPr>
+            <w:r>
+              <w:t xml:space="preserve">SBC</w:t>
+            </w:r>
+          </w:p>
+        </w:tc>
+        <w:tc>
+          <w:tcPr>
+            <w:tcBorders>
+              <w:bottom w:val="single" w:sz="8" w:color="000000"/>
+            </w:tcBorders>
+          </w:tcPr>
+          <w:p>
+            <w:pPr>
+              <w:pStyle w:val="Compact"/>
+              <w:spacing w:after="0"/>
+              <w:jc w:val="right"/>
+            </w:pPr>
+            <w:r>
+              <w:t xml:space="preserve">WCP-S</w:t>
+            </w:r>
+          </w:p>
+        </w:tc>
+        <w:tc>
+          <w:tcPr>
+            <w:tcBorders>
+              <w:bottom w:val="single" w:sz="8" w:color="000000"/>
+            </w:tcBorders>
+          </w:tcPr>
+          <w:p>
+            <w:pPr>
+              <w:pStyle w:val="Compact"/>
+              <w:spacing w:after="0"/>
+              <w:jc w:val="right"/>
+            </w:pPr>
+            <w:r>
+              <w:t xml:space="preserve">1.000 (1.00–1.00)</w:t>
+            </w:r>
+          </w:p>
+        </w:tc>
+        <w:tc>
+          <w:tcPr>
+            <w:tcBorders>
+              <w:bottom w:val="single" w:sz="8" w:color="000000"/>
+            </w:tcBorders>
+          </w:tcPr>
+          <w:p>
+            <w:pPr>
+              <w:pStyle w:val="Compact"/>
+              <w:spacing w:after="0"/>
+              <w:jc w:val="right"/>
+            </w:pPr>
+            <w:r>
+              <w:t xml:space="preserve">0/12</w:t>
+            </w:r>
+          </w:p>
+        </w:tc>
+        <w:tc>
+          <w:tcPr>
+            <w:tcBorders>
+              <w:bottom w:val="single" w:sz="8" w:color="000000"/>
+            </w:tcBorders>
+          </w:tcPr>
+          <w:p>
+            <w:pPr>
+              <w:pStyle w:val="Compact"/>
+              <w:spacing w:after="0"/>
+              <w:jc w:val="right"/>
+            </w:pPr>
+            <w:r>
+              <w:t xml:space="preserve">100</w:t>
+            </w:r>
+          </w:p>
+        </w:tc>
+        <w:tc>
+          <w:tcPr>
+            <w:tcBorders>
+              <w:bottom w:val="single" w:sz="8" w:color="000000"/>
+            </w:tcBorders>
+          </w:tcPr>
+          <w:p>
+            <w:pPr>
+              <w:pStyle w:val="Compact"/>
+              <w:spacing w:after="0"/>
+              <w:jc w:val="right"/>
+            </w:pPr>
+            <w:r>
+              <w:t xml:space="preserve">4.54</w:t>
+            </w:r>
+          </w:p>
+        </w:tc>
+        <w:tc>
+          <w:tcPr>
+            <w:tcBorders>
+              <w:bottom w:val="single" w:sz="8" w:color="000000"/>
+            </w:tcBorders>
+          </w:tcPr>
+          <w:p>
+            <w:pPr>
+              <w:pStyle w:val="Compact"/>
+              <w:spacing w:after="0"/>
+              <w:jc w:val="right"/>
+            </w:pPr>
+            <w:r>
+              <w:t xml:space="preserve">1.14</w:t>
+            </w:r>
+          </w:p>
+        </w:tc>
+      </w:tr>
+    </w:tbl>
+    <w:p/>
+    <w:p>
+      <w:pPr>
+        <w:pStyle w:val="TableCaption"/>
+        <w:keepNext/>
+      </w:pPr>
+      <w:r>
+        <w:rPr>
+          <w:bCs/>
+          <w:b/>
+        </w:rPr>
+        <w:t xml:space="preserve">Table 8.</w:t>
+      </w:r>
+      <w:r>
+        <w:t xml:space="preserve"> </w:t>
+      </w:r>
+      <w:r>
+        <w:t xml:space="preserve">Generalisation (E5; α = 0.10). Each cell: mean coverage (under-covering / scenarios); median interval score (lower is better).</w:t>
+      </w:r>
+    </w:p>
+    <w:tbl>
+      <w:tblPr>
+        <w:tblStyle w:val="Table"/>
+        <w:tblW w:type="pct" w:w="5000"/>
+        <w:jc w:val="center"/>
+        <w:tblLook w:firstRow="1" w:lastRow="0" w:firstColumn="0" w:lastColumn="0" w:noHBand="0" w:noVBand="0" w:val="0020"/>
+        <w:tblCaption w:val="Table 8. Generalisation (E5; α = 0.10). Each cell: mean coverage (under-covering / scenarios); median interval score (lower is better)."/>
       </w:tblPr>
       <w:tblGrid>
         <w:gridCol w:w="879"/>
@@ -16780,7 +18869,7 @@
         <w:t xml:space="preserve"> </w:t>
       </w:r>
       <w:r>
-        <w:t xml:space="preserve">= 15 was 0.281 with the pre-registered 5-channel window and 0.237 (3 channels), 0.348 (7 channels), 0.503 (11 channels) with the other windows. The pre-registered window was thus not the most accurate choice for corn; it was nevertheless kept, since it was fixed before any target data were analysed. Interval validity was unaffected: TJ+N under-covered in 0 of 27 sensitivity scenarios (coverage 0.899–0.972; Table S3). The source-calibrated intervals under-covered in 49 of 54 cases. Their validity also depended on the setting; for example, ASTM-PI coverage fell to 0.78 for the tablet assay with two latent variables fewer. Because TJ+ calibrates on the deployed pipeline itself, poorer transfer settings are reflected in wider, but still valid, intervals.</w:t>
+        <w:t xml:space="preserve">= 15 was 0.281 with the pre-registered 5-channel window and 0.237 (3 channels), 0.348 (7 channels), 0.503 (11 channels) with the other windows. The pre-registered window was thus not the most accurate choice for corn; it was nevertheless kept, since it was fixed before any target data were analysed. Interval validity was unaffected: TJ+N under-covered in 0 of 27 sensitivity scenarios (coverage 0.898–0.972; Table S3). The source-calibrated intervals under-covered in 48 of 54 cases. Their validity also depended on the setting. For example, with an 11-channel PDS window the tablet-assay coverage of ASTM-PI and SCP-S fell to 0.87 and 0.84. Because TJ+ calibrates on the deployed pipeline itself, poorer transfer settings are reflected in wider, but still valid, intervals.</w:t>
       </w:r>
     </w:p>
     <w:bookmarkEnd w:id="58"/>
@@ -17054,7 +19143,7 @@
         <w:t xml:space="preserve"> </w:t>
       </w:r>
       <w:r>
-        <w:t xml:space="preserve">= 50, 410 test spectra) and 0.4 ms (mango SBC). The complete TJ+N interval computation took 0.15 s, 2.79 s and 0.06 s, respectively, with peak memory below 15 MB (Fig. 10). The source model is never re-fitted. The added cost is therefore negligible for routine laboratory use, and it scales linearly with</w:t>
+        <w:t xml:space="preserve">= 50, 410 test spectra) and 0.4 ms (mango SBC). The complete TJ+N interval computation took 0.15 s, 2.79 s and 0.06 s, respectively, with peak memory below 15 MB (Fig. 10). The source model is never re-fitted. Measured over</w:t>
       </w:r>
       <w:r>
         <w:t xml:space="preserve"> </w:t>
@@ -17070,7 +19159,135 @@
         <w:t xml:space="preserve"> </w:t>
       </w:r>
       <w:r>
-        <w:t xml:space="preserve">and with the cost of one transfer fit.</w:t>
+        <w:t xml:space="preserve">= 10–50, the cost of TJ+N grew approximately linearly with the number of standards (corn: 0.10 s at m = 10 to 0.15 s at m = 20; tablets: 0.80 s at m = 10 to 2.56 s at m = 50; mango: 0.02 s at m = 10 to 0.06 s at m = 50; Supplementary Table S7). These timings include the five CV+ refits and are thus upper bounds.</w:t>
+      </w:r>
+    </w:p>
+    <w:p>
+      <w:pPr>
+        <w:pStyle w:val="BodyText"/>
+      </w:pPr>
+      <w:r>
+        <w:rPr>
+          <w:bCs/>
+          <w:b/>
+        </w:rPr>
+        <w:t xml:space="preserve">Deployment.</w:t>
+      </w:r>
+    </w:p>
+    <w:p>
+      <w:pPr>
+        <w:numPr>
+          <w:ilvl w:val="0"/>
+          <w:numId w:val="1021"/>
+        </w:numPr>
+      </w:pPr>
+      <w:r>
+        <w:t xml:space="preserve">The</w:t>
+      </w:r>
+      <w:r>
+        <w:t xml:space="preserve"> </w:t>
+      </w:r>
+      <w:r>
+        <w:rPr>
+          <w:iCs/>
+          <w:i/>
+        </w:rPr>
+        <w:t xml:space="preserve">m</w:t>
+      </w:r>
+      <w:r>
+        <w:t xml:space="preserve"> </w:t>
+      </w:r>
+      <w:r>
+        <w:t xml:space="preserve">leave-one-out transfers are fitted once, when the instrument is standardised.</w:t>
+      </w:r>
+    </w:p>
+    <w:p>
+      <w:pPr>
+        <w:numPr>
+          <w:ilvl w:val="0"/>
+          <w:numId w:val="1021"/>
+        </w:numPr>
+      </w:pPr>
+      <w:r>
+        <w:t xml:space="preserve">For each routine spectrum, TJ+N then requires</w:t>
+      </w:r>
+      <w:r>
+        <w:t xml:space="preserve"> </w:t>
+      </w:r>
+      <w:r>
+        <w:rPr>
+          <w:iCs/>
+          <w:i/>
+        </w:rPr>
+        <w:t xml:space="preserve">m</w:t>
+      </w:r>
+      <w:r>
+        <w:t xml:space="preserve"> </w:t>
+      </w:r>
+      <w:r>
+        <w:t xml:space="preserve">applications of a stored transfer map and</w:t>
+      </w:r>
+      <w:r>
+        <w:t xml:space="preserve"> </w:t>
+      </w:r>
+      <w:r>
+        <w:rPr>
+          <w:iCs/>
+          <w:i/>
+        </w:rPr>
+        <w:t xml:space="preserve">m</w:t>
+      </w:r>
+      <w:r>
+        <w:t xml:space="preserve"> </w:t>
+      </w:r>
+      <w:r>
+        <w:t xml:space="preserve">predictions of the source model. For PDS, each map is a</w:t>
+      </w:r>
+      <w:r>
+        <w:t xml:space="preserve"> </w:t>
+      </w:r>
+      <w:r>
+        <w:rPr>
+          <w:iCs/>
+          <w:i/>
+        </w:rPr>
+        <w:t xml:space="preserve">p</w:t>
+      </w:r>
+      <w:r>
+        <w:t xml:space="preserve"> </w:t>
+      </w:r>
+      <w:r>
+        <w:t xml:space="preserve">× 5 coefficient array (about 28 kB for 700 channels); for SBC, it is two numbers.</w:t>
+      </w:r>
+    </w:p>
+    <w:p>
+      <w:pPr>
+        <w:numPr>
+          <w:ilvl w:val="0"/>
+          <w:numId w:val="1021"/>
+        </w:numPr>
+      </w:pPr>
+      <w:r>
+        <w:t xml:space="preserve">Energy use is negligible at these scales.</w:t>
+      </w:r>
+    </w:p>
+    <w:p>
+      <w:pPr>
+        <w:numPr>
+          <w:ilvl w:val="0"/>
+          <w:numId w:val="1021"/>
+        </w:numPr>
+      </w:pPr>
+      <w:r>
+        <w:t xml:space="preserve">For computationally expensive adaptation methods, for example domain-adaptive PLS with hyperparameter search or neural domain adaptation, the five-fold CV+ variant reduces the cost to five refits. It remained valid in all scenarios, at the price of somewhat wider intervals (§4.4).</w:t>
+      </w:r>
+    </w:p>
+    <w:p>
+      <w:pPr>
+        <w:pStyle w:val="FirstParagraph"/>
+      </w:pPr>
+      <w:r>
+        <w:t xml:space="preserve">The added cost is therefore negligible for routine laboratory use.</w:t>
       </w:r>
     </w:p>
     <w:p>
@@ -17216,7 +19433,7 @@
       <w:pPr>
         <w:numPr>
           <w:ilvl w:val="0"/>
-          <w:numId w:val="1017"/>
+          <w:numId w:val="1022"/>
         </w:numPr>
       </w:pPr>
       <w:r>
@@ -17227,7 +19444,7 @@
       <w:pPr>
         <w:numPr>
           <w:ilvl w:val="0"/>
-          <w:numId w:val="1017"/>
+          <w:numId w:val="1022"/>
         </w:numPr>
       </w:pPr>
       <w:r>
@@ -17238,7 +19455,7 @@
       <w:pPr>
         <w:numPr>
           <w:ilvl w:val="0"/>
-          <w:numId w:val="1017"/>
+          <w:numId w:val="1022"/>
         </w:numPr>
       </w:pPr>
       <w:r>
@@ -17281,7 +19498,7 @@
       <w:pPr>
         <w:numPr>
           <w:ilvl w:val="0"/>
-          <w:numId w:val="1017"/>
+          <w:numId w:val="1022"/>
         </w:numPr>
       </w:pPr>
       <w:r>
@@ -17292,7 +19509,7 @@
       <w:pPr>
         <w:numPr>
           <w:ilvl w:val="0"/>
-          <w:numId w:val="1017"/>
+          <w:numId w:val="1022"/>
         </w:numPr>
       </w:pPr>
       <w:r>
@@ -17314,7 +19531,7 @@
       <w:pPr>
         <w:numPr>
           <w:ilvl w:val="0"/>
-          <w:numId w:val="1018"/>
+          <w:numId w:val="1023"/>
         </w:numPr>
       </w:pPr>
       <w:r>
@@ -17329,7 +19546,7 @@
       <w:pPr>
         <w:numPr>
           <w:ilvl w:val="1"/>
-          <w:numId w:val="1019"/>
+          <w:numId w:val="1024"/>
         </w:numPr>
       </w:pPr>
       <w:r>
@@ -17340,7 +19557,7 @@
       <w:pPr>
         <w:numPr>
           <w:ilvl w:val="1"/>
-          <w:numId w:val="1019"/>
+          <w:numId w:val="1024"/>
         </w:numPr>
       </w:pPr>
       <w:r>
@@ -17351,7 +19568,7 @@
       <w:pPr>
         <w:numPr>
           <w:ilvl w:val="1"/>
-          <w:numId w:val="1019"/>
+          <w:numId w:val="1024"/>
         </w:numPr>
       </w:pPr>
       <w:r>
@@ -17362,7 +19579,7 @@
       <w:pPr>
         <w:numPr>
           <w:ilvl w:val="0"/>
-          <w:numId w:val="1018"/>
+          <w:numId w:val="1023"/>
         </w:numPr>
       </w:pPr>
       <w:r>
@@ -17377,7 +19594,7 @@
       <w:pPr>
         <w:numPr>
           <w:ilvl w:val="1"/>
-          <w:numId w:val="1020"/>
+          <w:numId w:val="1025"/>
         </w:numPr>
       </w:pPr>
       <w:r>
@@ -17388,7 +19605,7 @@
       <w:pPr>
         <w:numPr>
           <w:ilvl w:val="1"/>
-          <w:numId w:val="1020"/>
+          <w:numId w:val="1025"/>
         </w:numPr>
       </w:pPr>
       <w:r>
@@ -17399,7 +19616,7 @@
       <w:pPr>
         <w:numPr>
           <w:ilvl w:val="1"/>
-          <w:numId w:val="1020"/>
+          <w:numId w:val="1025"/>
         </w:numPr>
       </w:pPr>
       <w:r>
@@ -17410,7 +19627,7 @@
       <w:pPr>
         <w:numPr>
           <w:ilvl w:val="0"/>
-          <w:numId w:val="1018"/>
+          <w:numId w:val="1023"/>
         </w:numPr>
       </w:pPr>
       <w:r>
@@ -17425,7 +19642,7 @@
       <w:pPr>
         <w:numPr>
           <w:ilvl w:val="1"/>
-          <w:numId w:val="1021"/>
+          <w:numId w:val="1026"/>
         </w:numPr>
       </w:pPr>
       <w:r>
@@ -17436,7 +19653,7 @@
       <w:pPr>
         <w:numPr>
           <w:ilvl w:val="1"/>
-          <w:numId w:val="1021"/>
+          <w:numId w:val="1026"/>
         </w:numPr>
       </w:pPr>
       <w:r>
@@ -17460,7 +19677,7 @@
       <w:pPr>
         <w:numPr>
           <w:ilvl w:val="1"/>
-          <w:numId w:val="1021"/>
+          <w:numId w:val="1026"/>
         </w:numPr>
       </w:pPr>
       <w:r>
@@ -17471,7 +19688,7 @@
       <w:pPr>
         <w:numPr>
           <w:ilvl w:val="0"/>
-          <w:numId w:val="1018"/>
+          <w:numId w:val="1023"/>
         </w:numPr>
       </w:pPr>
       <w:r>
@@ -17486,7 +19703,7 @@
       <w:pPr>
         <w:numPr>
           <w:ilvl w:val="1"/>
-          <w:numId w:val="1022"/>
+          <w:numId w:val="1027"/>
         </w:numPr>
       </w:pPr>
       <w:r>
@@ -17506,25 +19723,36 @@
         <w:t xml:space="preserve"> </w:t>
       </w:r>
       <w:r>
-        <w:t xml:space="preserve">= 80), with two instrument pairs and one season shift.</w:t>
+        <w:t xml:space="preserve">= 80). They cover two instrument pairs for corn, one for tablets, one season shift and three handheld-instrument pairs for mango.</w:t>
       </w:r>
     </w:p>
     <w:p>
       <w:pPr>
         <w:numPr>
           <w:ilvl w:val="1"/>
-          <w:numId w:val="1022"/>
+          <w:numId w:val="1027"/>
         </w:numPr>
       </w:pPr>
       <w:r>
-        <w:t xml:space="preserve">The noise, wavelength-shift and source-size perturbations are simulated.</w:t>
+        <w:t xml:space="preserve">Coverage refers to the samples in these data sets. Test samples recur across repetitions, so the results characterise the procedure on these populations, not on all possible samples.</w:t>
       </w:r>
     </w:p>
     <w:p>
       <w:pPr>
         <w:numPr>
           <w:ilvl w:val="1"/>
-          <w:numId w:val="1022"/>
+          <w:numId w:val="1027"/>
+        </w:numPr>
+      </w:pPr>
+      <w:r>
+        <w:t xml:space="preserve">The noise, wavelength-shift and source-size perturbations are simulated.</w:t>
+      </w:r>
+    </w:p>
+    <w:p>
+      <w:pPr>
+        <w:numPr>
+          <w:ilvl w:val="1"/>
+          <w:numId w:val="1027"/>
         </w:numPr>
       </w:pPr>
       <w:r>
@@ -17535,7 +19763,7 @@
       <w:pPr>
         <w:numPr>
           <w:ilvl w:val="0"/>
-          <w:numId w:val="1018"/>
+          <w:numId w:val="1023"/>
         </w:numPr>
       </w:pPr>
       <w:r>
@@ -17556,7 +19784,7 @@
       <w:pPr>
         <w:numPr>
           <w:ilvl w:val="0"/>
-          <w:numId w:val="1018"/>
+          <w:numId w:val="1023"/>
         </w:numPr>
       </w:pPr>
       <w:r>
@@ -17593,7 +19821,7 @@
       <w:pPr>
         <w:numPr>
           <w:ilvl w:val="0"/>
-          <w:numId w:val="1018"/>
+          <w:numId w:val="1023"/>
         </w:numPr>
       </w:pPr>
       <w:r>
@@ -17664,7 +19892,7 @@
       <w:pPr>
         <w:numPr>
           <w:ilvl w:val="0"/>
-          <w:numId w:val="1023"/>
+          <w:numId w:val="1028"/>
         </w:numPr>
       </w:pPr>
       <w:r>
@@ -17675,7 +19903,7 @@
       <w:pPr>
         <w:numPr>
           <w:ilvl w:val="0"/>
-          <w:numId w:val="1023"/>
+          <w:numId w:val="1028"/>
         </w:numPr>
       </w:pPr>
       <w:r>
@@ -17718,7 +19946,7 @@
       <w:pPr>
         <w:numPr>
           <w:ilvl w:val="0"/>
-          <w:numId w:val="1023"/>
+          <w:numId w:val="1028"/>
         </w:numPr>
       </w:pPr>
       <w:r>
@@ -17850,16 +20078,25 @@
         <w:t xml:space="preserve"> </w:t>
       </w:r>
       <w:r>
-        <w:t xml:space="preserve">[33]</w:t>
-      </w:r>
-      <w:r>
-        <w:t xml:space="preserve">, and mango DMC from Mendeley Data (doi:10.17632/46htwnp833, CC BY 4.0)</w:t>
-      </w:r>
-      <w:r>
-        <w:t xml:space="preserve"> </w:t>
-      </w:r>
-      <w:r>
-        <w:t xml:space="preserve">[34]</w:t>
+        <w:t xml:space="preserve">[36]</w:t>
+      </w:r>
+      <w:r>
+        <w:t xml:space="preserve">, and mango DMC from Mendeley Data (CC BY 4.0). Record version 1 (doi:10.17632/46htwnp833.1) was used for the season shift</w:t>
+      </w:r>
+      <w:r>
+        <w:t xml:space="preserve"> </w:t>
+      </w:r>
+      <w:r>
+        <w:t xml:space="preserve">[37]</w:t>
+      </w:r>
+      <w:r>
+        <w:t xml:space="preserve">, and record version 6 (doi:10.17632/46htwnp833.6) for the instrument shift</w:t>
+      </w:r>
+      <w:r>
+        <w:t xml:space="preserve"> </w:t>
+      </w:r>
+      <w:r>
+        <w:t xml:space="preserve">[45]</w:t>
       </w:r>
       <w:r>
         <w:t xml:space="preserve">. All code, configuration, raw per-repetition results and the scripts regenerating every table and figure are available at [repository URL / archived DOI to be inserted on acceptance].</w:t>
@@ -19409,7 +21646,7 @@
       <w:pPr>
         <w:numPr>
           <w:ilvl w:val="0"/>
-          <w:numId w:val="1024"/>
+          <w:numId w:val="1029"/>
         </w:numPr>
       </w:pPr>
       <w:r>
@@ -19662,7 +21899,7 @@
       <w:pPr>
         <w:numPr>
           <w:ilvl w:val="0"/>
-          <w:numId w:val="1024"/>
+          <w:numId w:val="1029"/>
         </w:numPr>
       </w:pPr>
       <w:r>
@@ -20722,7 +22959,7 @@
         <w:t xml:space="preserve"> </w:t>
       </w:r>
       <w:r>
-        <w:t xml:space="preserve">[30]</w:t>
+        <w:t xml:space="preserve">[32]</w:t>
       </w:r>
       <w:r>
         <w:t xml:space="preserve">, at most</w:t>
@@ -21094,7 +23331,7 @@
       <w:pPr>
         <w:numPr>
           <w:ilvl w:val="0"/>
-          <w:numId w:val="1025"/>
+          <w:numId w:val="1030"/>
         </w:numPr>
       </w:pPr>
       <w:r>
@@ -21297,7 +23534,7 @@
       <w:pPr>
         <w:numPr>
           <w:ilvl w:val="0"/>
-          <w:numId w:val="1025"/>
+          <w:numId w:val="1030"/>
         </w:numPr>
       </w:pPr>
       <w:r>
@@ -21347,15 +23584,26 @@
       <w:pPr>
         <w:numPr>
           <w:ilvl w:val="0"/>
-          <w:numId w:val="1025"/>
+          <w:numId w:val="1030"/>
         </w:numPr>
       </w:pPr>
       <w:r>
+        <w:t xml:space="preserve">Ties between scores have probability zero for continuous data; with ties, the strict inequalities in Step 2 make the interval only more conservative.</w:t>
+      </w:r>
+    </w:p>
+    <w:p>
+      <w:pPr>
+        <w:numPr>
+          <w:ilvl w:val="0"/>
+          <w:numId w:val="1030"/>
+        </w:numPr>
+      </w:pPr>
+      <w:r>
         <w:t xml:space="preserve">If the standards are chosen by a data-dependent design such as Kennard–Stone, they are no longer exchangeable with a random future sample, and Step 4 does not apply.</w:t>
       </w:r>
     </w:p>
     <w:bookmarkEnd w:id="76"/>
-    <w:bookmarkStart w:id="157" w:name="bibliography"/>
+    <w:bookmarkStart w:id="164" w:name="bibliography"/>
     <w:p>
       <w:r>
         <w:br w:type="page"/>
@@ -21369,7 +23617,7 @@
         <w:t xml:space="preserve">References</w:t>
       </w:r>
     </w:p>
-    <w:bookmarkStart w:id="156" w:name="refs"/>
+    <w:bookmarkStart w:id="163" w:name="refs"/>
     <w:bookmarkStart w:id="78" w:name="ref-pasquini2018"/>
     <w:p>
       <w:pPr>
@@ -21595,7 +23843,7 @@
         <w:t xml:space="preserve">	</w:t>
       </w:r>
       <w:r>
-        <w:t xml:space="preserve">P. Mishra, R. Nikzad-Langerodi, Partial least square regression versus domain invariant partial least square regression with application to near-infrared spectroscopy of fresh fruit, Infrared Physics &amp;Amp; Technology 111 (2020) 103547. https://doi.org/</w:t>
+        <w:t xml:space="preserve">P. Mishra, R. Nikzad-Langerodi, Partial least square regression versus domain invariant partial least square regression with application to near-infrared spectroscopy of fresh fruit, Infrared Physics &amp; Technology 111 (2020) 103547. https://doi.org/</w:t>
       </w:r>
       <w:hyperlink r:id="rId91">
         <w:r>
@@ -22202,7 +24450,7 @@
       </w:r>
     </w:p>
     <w:bookmarkEnd w:id="131"/>
-    <w:bookmarkStart w:id="133" w:name="ref-doula2026"/>
+    <w:bookmarkStart w:id="132" w:name="ref-prinster2022"/>
     <w:p>
       <w:pPr>
         <w:pStyle w:val="Bibliography"/>
@@ -22217,12 +24465,61 @@
         <w:t xml:space="preserve">	</w:t>
       </w:r>
       <w:r>
+        <w:t xml:space="preserve">D. Prinster, A. Liu, S. Saria, JAWS: auditing predictive uncertainty under covariate shift, in: Advances in Neural Information Processing Systems 35 (NeurIPS 2022), 2022.</w:t>
+      </w:r>
+    </w:p>
+    <w:bookmarkEnd w:id="132"/>
+    <w:bookmarkStart w:id="134" w:name="ref-zhivkov2026"/>
+    <w:p>
+      <w:pPr>
+        <w:pStyle w:val="Bibliography"/>
+      </w:pPr>
+      <w:r>
+        <w:t xml:space="preserve">[30]</w:t>
+      </w:r>
+      <w:r>
+        <w:t xml:space="preserve"> </w:t>
+      </w:r>
+      <w:r>
+        <w:t xml:space="preserve">	</w:t>
+      </w:r>
+      <w:r>
+        <w:t xml:space="preserve">P. Zhivkov, S. Fidanova, Machine learning calibration transfer for low-cost air quality sensors: distance-based uncertainty quantification in a hybrid urban monitoring network, Atmosphere 17 (2026) 335. https://doi.org/</w:t>
+      </w:r>
+      <w:hyperlink r:id="rId133">
+        <w:r>
+          <w:rPr>
+            <w:rStyle w:val="Hyperlink"/>
+          </w:rPr>
+          <w:t xml:space="preserve">10.3390/atmos17040335</w:t>
+        </w:r>
+      </w:hyperlink>
+      <w:r>
+        <w:t xml:space="preserve">.</w:t>
+      </w:r>
+    </w:p>
+    <w:bookmarkEnd w:id="134"/>
+    <w:bookmarkStart w:id="136" w:name="ref-doula2026"/>
+    <w:p>
+      <w:pPr>
+        <w:pStyle w:val="Bibliography"/>
+      </w:pPr>
+      <w:r>
+        <w:t xml:space="preserve">[31]</w:t>
+      </w:r>
+      <w:r>
+        <w:t xml:space="preserve"> </w:t>
+      </w:r>
+      <w:r>
+        <w:t xml:space="preserve">	</w:t>
+      </w:r>
+      <w:r>
         <w:t xml:space="preserve">A. Doula, Conformal calibration transfer, arXiv Preprint arXiv:2609.10737 (Accepted at ICML 2026) (2026).</w:t>
       </w:r>
       <w:r>
         <w:t xml:space="preserve"> </w:t>
       </w:r>
-      <w:hyperlink r:id="rId132">
+      <w:hyperlink r:id="rId135">
         <w:r>
           <w:rPr>
             <w:rStyle w:val="Hyperlink"/>
@@ -22234,14 +24531,14 @@
         <w:t xml:space="preserve">.</w:t>
       </w:r>
     </w:p>
-    <w:bookmarkEnd w:id="133"/>
-    <w:bookmarkStart w:id="135" w:name="ref-barber2021"/>
+    <w:bookmarkEnd w:id="136"/>
+    <w:bookmarkStart w:id="138" w:name="ref-barber2021"/>
     <w:p>
       <w:pPr>
         <w:pStyle w:val="Bibliography"/>
       </w:pPr>
       <w:r>
-        <w:t xml:space="preserve">[30]</w:t>
+        <w:t xml:space="preserve">[32]</w:t>
       </w:r>
       <w:r>
         <w:t xml:space="preserve"> </w:t>
@@ -22252,7 +24549,7 @@
       <w:r>
         <w:t xml:space="preserve">R.F. Barber, E.J. Candès, A. Ramdas, R.J. Tibshirani, Predictive inference with the jackknife+, The Annals of Statistics 49 (2021) 486–507. https://doi.org/</w:t>
       </w:r>
-      <w:hyperlink r:id="rId134">
+      <w:hyperlink r:id="rId137">
         <w:r>
           <w:rPr>
             <w:rStyle w:val="Hyperlink"/>
@@ -22264,14 +24561,14 @@
         <w:t xml:space="preserve">.</w:t>
       </w:r>
     </w:p>
-    <w:bookmarkEnd w:id="135"/>
-    <w:bookmarkStart w:id="137" w:name="ref-kennard1969"/>
+    <w:bookmarkEnd w:id="138"/>
+    <w:bookmarkStart w:id="140" w:name="ref-papadopoulos2011"/>
     <w:p>
       <w:pPr>
         <w:pStyle w:val="Bibliography"/>
       </w:pPr>
       <w:r>
-        <w:t xml:space="preserve">[31]</w:t>
+        <w:t xml:space="preserve">[33]</w:t>
       </w:r>
       <w:r>
         <w:t xml:space="preserve"> </w:t>
@@ -22280,9 +24577,39 @@
         <w:t xml:space="preserve">	</w:t>
       </w:r>
       <w:r>
+        <w:t xml:space="preserve">H. Papadopoulos, V. Vovk, A. Gammerman, Regression Conformal Prediction with Nearest Neighbours, Journal of Artificial Intelligence Research 40 (2011) 815–840. https://doi.org/</w:t>
+      </w:r>
+      <w:hyperlink r:id="rId139">
+        <w:r>
+          <w:rPr>
+            <w:rStyle w:val="Hyperlink"/>
+          </w:rPr>
+          <w:t xml:space="preserve">10.1613/jair.3198</w:t>
+        </w:r>
+      </w:hyperlink>
+      <w:r>
+        <w:t xml:space="preserve">.</w:t>
+      </w:r>
+    </w:p>
+    <w:bookmarkEnd w:id="140"/>
+    <w:bookmarkStart w:id="142" w:name="ref-kennard1969"/>
+    <w:p>
+      <w:pPr>
+        <w:pStyle w:val="Bibliography"/>
+      </w:pPr>
+      <w:r>
+        <w:t xml:space="preserve">[34]</w:t>
+      </w:r>
+      <w:r>
+        <w:t xml:space="preserve"> </w:t>
+      </w:r>
+      <w:r>
+        <w:t xml:space="preserve">	</w:t>
+      </w:r>
+      <w:r>
         <w:t xml:space="preserve">R.W. Kennard, L.A. Stone, Computer Aided Design of Experiments, Technometrics 11 (1969) 137–148. https://doi.org/</w:t>
       </w:r>
-      <w:hyperlink r:id="rId136">
+      <w:hyperlink r:id="rId141">
         <w:r>
           <w:rPr>
             <w:rStyle w:val="Hyperlink"/>
@@ -22294,14 +24621,14 @@
         <w:t xml:space="preserve">.</w:t>
       </w:r>
     </w:p>
-    <w:bookmarkEnd w:id="137"/>
-    <w:bookmarkStart w:id="138" w:name="ref-gal2016"/>
+    <w:bookmarkEnd w:id="142"/>
+    <w:bookmarkStart w:id="143" w:name="ref-gal2016"/>
     <w:p>
       <w:pPr>
         <w:pStyle w:val="Bibliography"/>
       </w:pPr>
       <w:r>
-        <w:t xml:space="preserve">[32]</w:t>
+        <w:t xml:space="preserve">[35]</w:t>
       </w:r>
       <w:r>
         <w:t xml:space="preserve"> </w:t>
@@ -22313,14 +24640,14 @@
         <w:t xml:space="preserve">Y. Gal, Z. Ghahramani, Dropout as a Bayesian approximation: representing model uncertainty in deep learning, in: Proceedings of the 33rd International Conference on Machine Learning, PMLR 48, 2016: pp. 1050–1059.</w:t>
       </w:r>
     </w:p>
-    <w:bookmarkEnd w:id="138"/>
-    <w:bookmarkStart w:id="140" w:name="ref-eigenvector_data"/>
+    <w:bookmarkEnd w:id="143"/>
+    <w:bookmarkStart w:id="145" w:name="ref-eigenvector_data"/>
     <w:p>
       <w:pPr>
         <w:pStyle w:val="Bibliography"/>
       </w:pPr>
       <w:r>
-        <w:t xml:space="preserve">[33]</w:t>
+        <w:t xml:space="preserve">[36]</w:t>
       </w:r>
       <w:r>
         <w:t xml:space="preserve"> </w:t>
@@ -22334,7 +24661,7 @@
       <w:r>
         <w:t xml:space="preserve"> </w:t>
       </w:r>
-      <w:hyperlink r:id="rId139">
+      <w:hyperlink r:id="rId144">
         <w:r>
           <w:rPr>
             <w:rStyle w:val="Hyperlink"/>
@@ -22349,14 +24676,14 @@
         <w:t xml:space="preserve">(accessed October 13, 2026).</w:t>
       </w:r>
     </w:p>
-    <w:bookmarkEnd w:id="140"/>
-    <w:bookmarkStart w:id="142" w:name="ref-mango_data"/>
+    <w:bookmarkEnd w:id="145"/>
+    <w:bookmarkStart w:id="147" w:name="ref-mango_data"/>
     <w:p>
       <w:pPr>
         <w:pStyle w:val="Bibliography"/>
       </w:pPr>
       <w:r>
-        <w:t xml:space="preserve">[34]</w:t>
+        <w:t xml:space="preserve">[37]</w:t>
       </w:r>
       <w:r>
         <w:t xml:space="preserve"> </w:t>
@@ -22365,9 +24692,238 @@
         <w:t xml:space="preserve">	</w:t>
       </w:r>
       <w:r>
+        <w:t xml:space="preserve">N. Anderson, Mango DMC and spectra Anderson et al. 2020 (Version 1), (2020). https://doi.org/</w:t>
+      </w:r>
+      <w:hyperlink r:id="rId146">
+        <w:r>
+          <w:rPr>
+            <w:rStyle w:val="Hyperlink"/>
+          </w:rPr>
+          <w:t xml:space="preserve">10.17632/46htwnp833.1</w:t>
+        </w:r>
+      </w:hyperlink>
+      <w:r>
+        <w:t xml:space="preserve">.</w:t>
+      </w:r>
+    </w:p>
+    <w:bookmarkEnd w:id="147"/>
+    <w:bookmarkStart w:id="149" w:name="ref-barnes1989"/>
+    <w:p>
+      <w:pPr>
+        <w:pStyle w:val="Bibliography"/>
+      </w:pPr>
+      <w:r>
+        <w:t xml:space="preserve">[38]</w:t>
+      </w:r>
+      <w:r>
+        <w:t xml:space="preserve"> </w:t>
+      </w:r>
+      <w:r>
+        <w:t xml:space="preserve">	</w:t>
+      </w:r>
+      <w:r>
+        <w:t xml:space="preserve">R.J. Barnes, M.S. Dhanoa, S.J. Lister, Standard Normal Variate Transformation and De-Trending of Near-Infrared Diffuse Reflectance Spectra, Applied Spectroscopy 43 (1989) 772–777. https://doi.org/</w:t>
+      </w:r>
+      <w:hyperlink r:id="rId148">
+        <w:r>
+          <w:rPr>
+            <w:rStyle w:val="Hyperlink"/>
+          </w:rPr>
+          <w:t xml:space="preserve">10.1366/0003702894202201</w:t>
+        </w:r>
+      </w:hyperlink>
+      <w:r>
+        <w:t xml:space="preserve">.</w:t>
+      </w:r>
+    </w:p>
+    <w:bookmarkEnd w:id="149"/>
+    <w:bookmarkStart w:id="151" w:name="ref-savitzky1964"/>
+    <w:p>
+      <w:pPr>
+        <w:pStyle w:val="Bibliography"/>
+      </w:pPr>
+      <w:r>
+        <w:t xml:space="preserve">[39]</w:t>
+      </w:r>
+      <w:r>
+        <w:t xml:space="preserve"> </w:t>
+      </w:r>
+      <w:r>
+        <w:t xml:space="preserve">	</w:t>
+      </w:r>
+      <w:r>
+        <w:t xml:space="preserve">Abraham. Savitzky, M.J.E. Golay, Smoothing and Differentiation of Data by Simplified Least Squares Procedures., Analytical Chemistry 36 (1964) 1627–1639. https://doi.org/</w:t>
+      </w:r>
+      <w:hyperlink r:id="rId150">
+        <w:r>
+          <w:rPr>
+            <w:rStyle w:val="Hyperlink"/>
+          </w:rPr>
+          <w:t xml:space="preserve">10.1021/ac60214a047</w:t>
+        </w:r>
+      </w:hyperlink>
+      <w:r>
+        <w:t xml:space="preserve">.</w:t>
+      </w:r>
+    </w:p>
+    <w:bookmarkEnd w:id="151"/>
+    <w:bookmarkStart w:id="153" w:name="ref-wold2001"/>
+    <w:p>
+      <w:pPr>
+        <w:pStyle w:val="Bibliography"/>
+      </w:pPr>
+      <w:r>
+        <w:t xml:space="preserve">[40]</w:t>
+      </w:r>
+      <w:r>
+        <w:t xml:space="preserve"> </w:t>
+      </w:r>
+      <w:r>
+        <w:t xml:space="preserve">	</w:t>
+      </w:r>
+      <w:r>
+        <w:t xml:space="preserve">S. Wold, M. Sjöström, L. Eriksson, PLS-regression: a basic tool of chemometrics, Chemometrics and Intelligent Laboratory Systems 58 (2001) 109–130. https://doi.org/</w:t>
+      </w:r>
+      <w:hyperlink r:id="rId152">
+        <w:r>
+          <w:rPr>
+            <w:rStyle w:val="Hyperlink"/>
+          </w:rPr>
+          <w:t xml:space="preserve">10.1016/S0169-7439(01)00155-1</w:t>
+        </w:r>
+      </w:hyperlink>
+      <w:r>
+        <w:t xml:space="preserve">.</w:t>
+      </w:r>
+    </w:p>
+    <w:bookmarkEnd w:id="153"/>
+    <w:bookmarkStart w:id="155" w:name="ref-gneiting2007"/>
+    <w:p>
+      <w:pPr>
+        <w:pStyle w:val="Bibliography"/>
+      </w:pPr>
+      <w:r>
+        <w:t xml:space="preserve">[41]</w:t>
+      </w:r>
+      <w:r>
+        <w:t xml:space="preserve"> </w:t>
+      </w:r>
+      <w:r>
+        <w:t xml:space="preserve">	</w:t>
+      </w:r>
+      <w:r>
+        <w:t xml:space="preserve">T. Gneiting, A.E. Raftery, Strictly Proper Scoring Rules, Prediction, and Estimation, Journal of the American Statistical Association 102 (2007) 359–378. https://doi.org/</w:t>
+      </w:r>
+      <w:hyperlink r:id="rId154">
+        <w:r>
+          <w:rPr>
+            <w:rStyle w:val="Hyperlink"/>
+          </w:rPr>
+          <w:t xml:space="preserve">10.1198/016214506000001437</w:t>
+        </w:r>
+      </w:hyperlink>
+      <w:r>
+        <w:t xml:space="preserve">.</w:t>
+      </w:r>
+    </w:p>
+    <w:bookmarkEnd w:id="155"/>
+    <w:bookmarkStart w:id="157" w:name="ref-holm1979"/>
+    <w:p>
+      <w:pPr>
+        <w:pStyle w:val="Bibliography"/>
+      </w:pPr>
+      <w:r>
+        <w:t xml:space="preserve">[42]</w:t>
+      </w:r>
+      <w:r>
+        <w:t xml:space="preserve"> </w:t>
+      </w:r>
+      <w:r>
+        <w:t xml:space="preserve">	</w:t>
+      </w:r>
+      <w:r>
+        <w:t xml:space="preserve">S. Holm, A simple sequentially rejective multiple test procedure, Scandinavian Journal of Statistics 6 (1979) 65–70. https://doi.org/</w:t>
+      </w:r>
+      <w:hyperlink r:id="rId156">
+        <w:r>
+          <w:rPr>
+            <w:rStyle w:val="Hyperlink"/>
+          </w:rPr>
+          <w:t xml:space="preserve">10.2307/4615733</w:t>
+        </w:r>
+      </w:hyperlink>
+      <w:r>
+        <w:t xml:space="preserve">.</w:t>
+      </w:r>
+    </w:p>
+    <w:bookmarkEnd w:id="157"/>
+    <w:bookmarkStart w:id="158" w:name="ref-demsar2006"/>
+    <w:p>
+      <w:pPr>
+        <w:pStyle w:val="Bibliography"/>
+      </w:pPr>
+      <w:r>
+        <w:t xml:space="preserve">[43]</w:t>
+      </w:r>
+      <w:r>
+        <w:t xml:space="preserve"> </w:t>
+      </w:r>
+      <w:r>
+        <w:t xml:space="preserve">	</w:t>
+      </w:r>
+      <w:r>
+        <w:t xml:space="preserve">J. Demšar, Statistical comparisons of classifiers over multiple data sets, Journal of Machine Learning Research 7 (2006) 1–30.</w:t>
+      </w:r>
+    </w:p>
+    <w:bookmarkEnd w:id="158"/>
+    <w:bookmarkStart w:id="160" w:name="ref-maxime2025"/>
+    <w:p>
+      <w:pPr>
+        <w:pStyle w:val="Bibliography"/>
+      </w:pPr>
+      <w:r>
+        <w:t xml:space="preserve">[44]</w:t>
+      </w:r>
+      <w:r>
+        <w:t xml:space="preserve"> </w:t>
+      </w:r>
+      <w:r>
+        <w:t xml:space="preserve">	</w:t>
+      </w:r>
+      <w:r>
+        <w:t xml:space="preserve">M. Maxime, K. Lamdibih, J.-M. Roger, D. Esteve, R. Bendoula, F. Abdelghafour, Simple methods for uncertainty estimation in neural networks applied to spectral data processing: A case study on mango dry matter prediction, Chemometrics and Intelligent Laboratory Systems 267 (2025) 105532. https://doi.org/</w:t>
+      </w:r>
+      <w:hyperlink r:id="rId159">
+        <w:r>
+          <w:rPr>
+            <w:rStyle w:val="Hyperlink"/>
+          </w:rPr>
+          <w:t xml:space="preserve">10.1016/j.chemolab.2025.105532</w:t>
+        </w:r>
+      </w:hyperlink>
+      <w:r>
+        <w:t xml:space="preserve">.</w:t>
+      </w:r>
+    </w:p>
+    <w:bookmarkEnd w:id="160"/>
+    <w:bookmarkStart w:id="162" w:name="ref-mango_data_v6"/>
+    <w:p>
+      <w:pPr>
+        <w:pStyle w:val="Bibliography"/>
+      </w:pPr>
+      <w:r>
+        <w:t xml:space="preserve">[45]</w:t>
+      </w:r>
+      <w:r>
+        <w:t xml:space="preserve"> </w:t>
+      </w:r>
+      <w:r>
+        <w:t xml:space="preserve">	</w:t>
+      </w:r>
+      <w:r>
         <w:t xml:space="preserve">N. Anderson, K. Walsh, P. Subedi, J. Walsh, Mango DMC and NIR spectra (Version 6), (2026). https://doi.org/</w:t>
       </w:r>
-      <w:hyperlink r:id="rId141">
+      <w:hyperlink r:id="rId161">
         <w:r>
           <w:rPr>
             <w:rStyle w:val="Hyperlink"/>
@@ -22379,208 +24935,9 @@
         <w:t xml:space="preserve">.</w:t>
       </w:r>
     </w:p>
-    <w:bookmarkEnd w:id="142"/>
-    <w:bookmarkStart w:id="144" w:name="ref-barnes1989"/>
-    <w:p>
-      <w:pPr>
-        <w:pStyle w:val="Bibliography"/>
-      </w:pPr>
-      <w:r>
-        <w:t xml:space="preserve">[35]</w:t>
-      </w:r>
-      <w:r>
-        <w:t xml:space="preserve"> </w:t>
-      </w:r>
-      <w:r>
-        <w:t xml:space="preserve">	</w:t>
-      </w:r>
-      <w:r>
-        <w:t xml:space="preserve">R.J. Barnes, M.S. Dhanoa, S.J. Lister, Standard Normal Variate Transformation and De-Trending of Near-Infrared Diffuse Reflectance Spectra, Applied Spectroscopy 43 (1989) 772–777. https://doi.org/</w:t>
-      </w:r>
-      <w:hyperlink r:id="rId143">
-        <w:r>
-          <w:rPr>
-            <w:rStyle w:val="Hyperlink"/>
-          </w:rPr>
-          <w:t xml:space="preserve">10.1366/0003702894202201</w:t>
-        </w:r>
-      </w:hyperlink>
-      <w:r>
-        <w:t xml:space="preserve">.</w:t>
-      </w:r>
-    </w:p>
-    <w:bookmarkEnd w:id="144"/>
-    <w:bookmarkStart w:id="146" w:name="ref-savitzky1964"/>
-    <w:p>
-      <w:pPr>
-        <w:pStyle w:val="Bibliography"/>
-      </w:pPr>
-      <w:r>
-        <w:t xml:space="preserve">[36]</w:t>
-      </w:r>
-      <w:r>
-        <w:t xml:space="preserve"> </w:t>
-      </w:r>
-      <w:r>
-        <w:t xml:space="preserve">	</w:t>
-      </w:r>
-      <w:r>
-        <w:t xml:space="preserve">Abraham. Savitzky, M.J.E. Golay, Smoothing and Differentiation of Data by Simplified Least Squares Procedures., Analytical Chemistry 36 (1964) 1627–1639. https://doi.org/</w:t>
-      </w:r>
-      <w:hyperlink r:id="rId145">
-        <w:r>
-          <w:rPr>
-            <w:rStyle w:val="Hyperlink"/>
-          </w:rPr>
-          <w:t xml:space="preserve">10.1021/ac60214a047</w:t>
-        </w:r>
-      </w:hyperlink>
-      <w:r>
-        <w:t xml:space="preserve">.</w:t>
-      </w:r>
-    </w:p>
-    <w:bookmarkEnd w:id="146"/>
-    <w:bookmarkStart w:id="148" w:name="ref-wold2001"/>
-    <w:p>
-      <w:pPr>
-        <w:pStyle w:val="Bibliography"/>
-      </w:pPr>
-      <w:r>
-        <w:t xml:space="preserve">[37]</w:t>
-      </w:r>
-      <w:r>
-        <w:t xml:space="preserve"> </w:t>
-      </w:r>
-      <w:r>
-        <w:t xml:space="preserve">	</w:t>
-      </w:r>
-      <w:r>
-        <w:t xml:space="preserve">S. Wold, M. Sjöström, L. Eriksson, PLS-regression: a basic tool of chemometrics, Chemometrics and Intelligent Laboratory Systems 58 (2001) 109–130. https://doi.org/</w:t>
-      </w:r>
-      <w:hyperlink r:id="rId147">
-        <w:r>
-          <w:rPr>
-            <w:rStyle w:val="Hyperlink"/>
-          </w:rPr>
-          <w:t xml:space="preserve">10.1016/S0169-7439(01)00155-1</w:t>
-        </w:r>
-      </w:hyperlink>
-      <w:r>
-        <w:t xml:space="preserve">.</w:t>
-      </w:r>
-    </w:p>
-    <w:bookmarkEnd w:id="148"/>
-    <w:bookmarkStart w:id="150" w:name="ref-gneiting2007"/>
-    <w:p>
-      <w:pPr>
-        <w:pStyle w:val="Bibliography"/>
-      </w:pPr>
-      <w:r>
-        <w:t xml:space="preserve">[38]</w:t>
-      </w:r>
-      <w:r>
-        <w:t xml:space="preserve"> </w:t>
-      </w:r>
-      <w:r>
-        <w:t xml:space="preserve">	</w:t>
-      </w:r>
-      <w:r>
-        <w:t xml:space="preserve">T. Gneiting, A.E. Raftery, Strictly Proper Scoring Rules, Prediction, and Estimation, Journal of the American Statistical Association 102 (2007) 359–378. https://doi.org/</w:t>
-      </w:r>
-      <w:hyperlink r:id="rId149">
-        <w:r>
-          <w:rPr>
-            <w:rStyle w:val="Hyperlink"/>
-          </w:rPr>
-          <w:t xml:space="preserve">10.1198/016214506000001437</w:t>
-        </w:r>
-      </w:hyperlink>
-      <w:r>
-        <w:t xml:space="preserve">.</w:t>
-      </w:r>
-    </w:p>
-    <w:bookmarkEnd w:id="150"/>
-    <w:bookmarkStart w:id="152" w:name="ref-holm1979"/>
-    <w:p>
-      <w:pPr>
-        <w:pStyle w:val="Bibliography"/>
-      </w:pPr>
-      <w:r>
-        <w:t xml:space="preserve">[39]</w:t>
-      </w:r>
-      <w:r>
-        <w:t xml:space="preserve"> </w:t>
-      </w:r>
-      <w:r>
-        <w:t xml:space="preserve">	</w:t>
-      </w:r>
-      <w:r>
-        <w:t xml:space="preserve">S. Holm, A simple sequentially rejective multiple test procedure, Scandinavian Journal of Statistics 6 (1979) 65–70. https://doi.org/</w:t>
-      </w:r>
-      <w:hyperlink r:id="rId151">
-        <w:r>
-          <w:rPr>
-            <w:rStyle w:val="Hyperlink"/>
-          </w:rPr>
-          <w:t xml:space="preserve">10.2307/4615733</w:t>
-        </w:r>
-      </w:hyperlink>
-      <w:r>
-        <w:t xml:space="preserve">.</w:t>
-      </w:r>
-    </w:p>
-    <w:bookmarkEnd w:id="152"/>
-    <w:bookmarkStart w:id="153" w:name="ref-demsar2006"/>
-    <w:p>
-      <w:pPr>
-        <w:pStyle w:val="Bibliography"/>
-      </w:pPr>
-      <w:r>
-        <w:t xml:space="preserve">[40]</w:t>
-      </w:r>
-      <w:r>
-        <w:t xml:space="preserve"> </w:t>
-      </w:r>
-      <w:r>
-        <w:t xml:space="preserve">	</w:t>
-      </w:r>
-      <w:r>
-        <w:t xml:space="preserve">J. Demšar, Statistical comparisons of classifiers over multiple data sets, Journal of Machine Learning Research 7 (2006) 1–30.</w:t>
-      </w:r>
-    </w:p>
-    <w:bookmarkEnd w:id="153"/>
-    <w:bookmarkStart w:id="155" w:name="ref-maxime2025"/>
-    <w:p>
-      <w:pPr>
-        <w:pStyle w:val="Bibliography"/>
-      </w:pPr>
-      <w:r>
-        <w:t xml:space="preserve">[41]</w:t>
-      </w:r>
-      <w:r>
-        <w:t xml:space="preserve"> </w:t>
-      </w:r>
-      <w:r>
-        <w:t xml:space="preserve">	</w:t>
-      </w:r>
-      <w:r>
-        <w:t xml:space="preserve">M. Maxime, K. Lamdibih, J.-M. Roger, D. Esteve, R. Bendoula, F. Abdelghafour, Simple methods for uncertainty estimation in neural networks applied to spectral data processing: A case study on mango dry matter prediction, Chemometrics and Intelligent Laboratory Systems 267 (2025) 105532. https://doi.org/</w:t>
-      </w:r>
-      <w:hyperlink r:id="rId154">
-        <w:r>
-          <w:rPr>
-            <w:rStyle w:val="Hyperlink"/>
-          </w:rPr>
-          <w:t xml:space="preserve">10.1016/j.chemolab.2025.105532</w:t>
-        </w:r>
-      </w:hyperlink>
-      <w:r>
-        <w:t xml:space="preserve">.</w:t>
-      </w:r>
-    </w:p>
-    <w:bookmarkEnd w:id="155"/>
-    <w:bookmarkEnd w:id="156"/>
-    <w:bookmarkEnd w:id="157"/>
+    <w:bookmarkEnd w:id="162"/>
+    <w:bookmarkEnd w:id="163"/>
+    <w:bookmarkEnd w:id="164"/>
     <w:sectPr>
       <w:footerReference r:id="rId9" w:type="default"/>
       <w:pgSz w:h="16838" w:w="11906"/>
@@ -22708,6 +25065,82 @@
       </w:pPr>
     </w:lvl>
   </w:abstractNum>
+  <w:abstractNum w:abstractNumId="991">
+    <w:nsid w:val="A991"/>
+    <w:multiLevelType w:val="multilevel"/>
+    <w:lvl w:ilvl="0">
+      <w:numFmt w:val="bullet"/>
+      <w:lvlText w:val="•"/>
+      <w:lvlJc w:val="left"/>
+      <w:pPr>
+        <w:ind w:left="720" w:hanging="480"/>
+      </w:pPr>
+    </w:lvl>
+    <w:lvl w:ilvl="1">
+      <w:numFmt w:val="bullet"/>
+      <w:lvlText w:val="–"/>
+      <w:lvlJc w:val="left"/>
+      <w:pPr>
+        <w:ind w:left="1440" w:hanging="480"/>
+      </w:pPr>
+    </w:lvl>
+    <w:lvl w:ilvl="2">
+      <w:numFmt w:val="bullet"/>
+      <w:lvlText w:val="•"/>
+      <w:lvlJc w:val="left"/>
+      <w:pPr>
+        <w:ind w:left="2160" w:hanging="480"/>
+      </w:pPr>
+    </w:lvl>
+    <w:lvl w:ilvl="3">
+      <w:numFmt w:val="bullet"/>
+      <w:lvlText w:val="–"/>
+      <w:lvlJc w:val="left"/>
+      <w:pPr>
+        <w:ind w:left="2880" w:hanging="480"/>
+      </w:pPr>
+    </w:lvl>
+    <w:lvl w:ilvl="4">
+      <w:numFmt w:val="bullet"/>
+      <w:lvlText w:val="•"/>
+      <w:lvlJc w:val="left"/>
+      <w:pPr>
+        <w:ind w:left="3600" w:hanging="480"/>
+      </w:pPr>
+    </w:lvl>
+    <w:lvl w:ilvl="5">
+      <w:numFmt w:val="bullet"/>
+      <w:lvlText w:val="–"/>
+      <w:lvlJc w:val="left"/>
+      <w:pPr>
+        <w:ind w:left="4320" w:hanging="480"/>
+      </w:pPr>
+    </w:lvl>
+    <w:lvl w:ilvl="6">
+      <w:numFmt w:val="bullet"/>
+      <w:lvlText w:val="•"/>
+      <w:lvlJc w:val="left"/>
+      <w:pPr>
+        <w:ind w:left="5040" w:hanging="480"/>
+      </w:pPr>
+    </w:lvl>
+    <w:lvl w:ilvl="7">
+      <w:numFmt w:val="bullet"/>
+      <w:lvlText w:val="–"/>
+      <w:lvlJc w:val="left"/>
+      <w:pPr>
+        <w:ind w:left="5760" w:hanging="480"/>
+      </w:pPr>
+    </w:lvl>
+    <w:lvl w:ilvl="8">
+      <w:numFmt w:val="bullet"/>
+      <w:lvlText w:val="•"/>
+      <w:lvlJc w:val="left"/>
+      <w:pPr>
+        <w:ind w:left="6480" w:hanging="480"/>
+      </w:pPr>
+    </w:lvl>
+  </w:abstractNum>
   <w:abstractNum w:abstractNumId="99411">
     <w:nsid w:val="A99411"/>
     <w:multiLevelType w:val="multilevel"/>
@@ -22793,86 +25226,13 @@
       </w:pPr>
     </w:lvl>
   </w:abstractNum>
-  <w:abstractNum w:abstractNumId="991">
-    <w:nsid w:val="A991"/>
-    <w:multiLevelType w:val="multilevel"/>
-    <w:lvl w:ilvl="0">
-      <w:numFmt w:val="bullet"/>
-      <w:lvlText w:val="•"/>
-      <w:lvlJc w:val="left"/>
-      <w:pPr>
-        <w:ind w:left="720" w:hanging="480"/>
-      </w:pPr>
-    </w:lvl>
-    <w:lvl w:ilvl="1">
-      <w:numFmt w:val="bullet"/>
-      <w:lvlText w:val="–"/>
-      <w:lvlJc w:val="left"/>
-      <w:pPr>
-        <w:ind w:left="1440" w:hanging="480"/>
-      </w:pPr>
-    </w:lvl>
-    <w:lvl w:ilvl="2">
-      <w:numFmt w:val="bullet"/>
-      <w:lvlText w:val="•"/>
-      <w:lvlJc w:val="left"/>
-      <w:pPr>
-        <w:ind w:left="2160" w:hanging="480"/>
-      </w:pPr>
-    </w:lvl>
-    <w:lvl w:ilvl="3">
-      <w:numFmt w:val="bullet"/>
-      <w:lvlText w:val="–"/>
-      <w:lvlJc w:val="left"/>
-      <w:pPr>
-        <w:ind w:left="2880" w:hanging="480"/>
-      </w:pPr>
-    </w:lvl>
-    <w:lvl w:ilvl="4">
-      <w:numFmt w:val="bullet"/>
-      <w:lvlText w:val="•"/>
-      <w:lvlJc w:val="left"/>
-      <w:pPr>
-        <w:ind w:left="3600" w:hanging="480"/>
-      </w:pPr>
-    </w:lvl>
-    <w:lvl w:ilvl="5">
-      <w:numFmt w:val="bullet"/>
-      <w:lvlText w:val="–"/>
-      <w:lvlJc w:val="left"/>
-      <w:pPr>
-        <w:ind w:left="4320" w:hanging="480"/>
-      </w:pPr>
-    </w:lvl>
-    <w:lvl w:ilvl="6">
-      <w:numFmt w:val="bullet"/>
-      <w:lvlText w:val="•"/>
-      <w:lvlJc w:val="left"/>
-      <w:pPr>
-        <w:ind w:left="5040" w:hanging="480"/>
-      </w:pPr>
-    </w:lvl>
-    <w:lvl w:ilvl="7">
-      <w:numFmt w:val="bullet"/>
-      <w:lvlText w:val="–"/>
-      <w:lvlJc w:val="left"/>
-      <w:pPr>
-        <w:ind w:left="5760" w:hanging="480"/>
-      </w:pPr>
-    </w:lvl>
-    <w:lvl w:ilvl="8">
-      <w:numFmt w:val="bullet"/>
-      <w:lvlText w:val="•"/>
-      <w:lvlJc w:val="left"/>
-      <w:pPr>
-        <w:ind w:left="6480" w:hanging="480"/>
-      </w:pPr>
-    </w:lvl>
-  </w:abstractNum>
   <w:num w:numId="1000">
     <w:abstractNumId w:val="990"/>
   </w:num>
   <w:num w:numId="1001">
+    <w:abstractNumId w:val="991"/>
+  </w:num>
+  <w:num w:numId="1002">
     <w:abstractNumId w:val="99411"/>
     <w:lvlOverride w:ilvl="0">
       <w:startOverride w:val="1"/>
@@ -22901,9 +25261,6 @@
     <w:lvlOverride w:ilvl="8">
       <w:startOverride w:val="1"/>
     </w:lvlOverride>
-  </w:num>
-  <w:num w:numId="1002">
-    <w:abstractNumId w:val="991"/>
   </w:num>
   <w:num w:numId="1003">
     <w:abstractNumId w:val="991"/>
@@ -22948,6 +25305,21 @@
     <w:abstractNumId w:val="991"/>
   </w:num>
   <w:num w:numId="1017">
+    <w:abstractNumId w:val="991"/>
+  </w:num>
+  <w:num w:numId="1018">
+    <w:abstractNumId w:val="991"/>
+  </w:num>
+  <w:num w:numId="1019">
+    <w:abstractNumId w:val="991"/>
+  </w:num>
+  <w:num w:numId="1020">
+    <w:abstractNumId w:val="991"/>
+  </w:num>
+  <w:num w:numId="1021">
+    <w:abstractNumId w:val="991"/>
+  </w:num>
+  <w:num w:numId="1022">
     <w:abstractNumId w:val="99411"/>
     <w:lvlOverride w:ilvl="0">
       <w:startOverride w:val="1"/>
@@ -22976,48 +25348,6 @@
     <w:lvlOverride w:ilvl="8">
       <w:startOverride w:val="1"/>
     </w:lvlOverride>
-  </w:num>
-  <w:num w:numId="1018">
-    <w:abstractNumId w:val="99411"/>
-    <w:lvlOverride w:ilvl="0">
-      <w:startOverride w:val="1"/>
-    </w:lvlOverride>
-    <w:lvlOverride w:ilvl="1">
-      <w:startOverride w:val="1"/>
-    </w:lvlOverride>
-    <w:lvlOverride w:ilvl="2">
-      <w:startOverride w:val="1"/>
-    </w:lvlOverride>
-    <w:lvlOverride w:ilvl="3">
-      <w:startOverride w:val="1"/>
-    </w:lvlOverride>
-    <w:lvlOverride w:ilvl="4">
-      <w:startOverride w:val="1"/>
-    </w:lvlOverride>
-    <w:lvlOverride w:ilvl="5">
-      <w:startOverride w:val="1"/>
-    </w:lvlOverride>
-    <w:lvlOverride w:ilvl="6">
-      <w:startOverride w:val="1"/>
-    </w:lvlOverride>
-    <w:lvlOverride w:ilvl="7">
-      <w:startOverride w:val="1"/>
-    </w:lvlOverride>
-    <w:lvlOverride w:ilvl="8">
-      <w:startOverride w:val="1"/>
-    </w:lvlOverride>
-  </w:num>
-  <w:num w:numId="1019">
-    <w:abstractNumId w:val="991"/>
-  </w:num>
-  <w:num w:numId="1020">
-    <w:abstractNumId w:val="991"/>
-  </w:num>
-  <w:num w:numId="1021">
-    <w:abstractNumId w:val="991"/>
-  </w:num>
-  <w:num w:numId="1022">
-    <w:abstractNumId w:val="991"/>
   </w:num>
   <w:num w:numId="1023">
     <w:abstractNumId w:val="99411"/>
@@ -23053,6 +25383,48 @@
     <w:abstractNumId w:val="991"/>
   </w:num>
   <w:num w:numId="1025">
+    <w:abstractNumId w:val="991"/>
+  </w:num>
+  <w:num w:numId="1026">
+    <w:abstractNumId w:val="991"/>
+  </w:num>
+  <w:num w:numId="1027">
+    <w:abstractNumId w:val="991"/>
+  </w:num>
+  <w:num w:numId="1028">
+    <w:abstractNumId w:val="99411"/>
+    <w:lvlOverride w:ilvl="0">
+      <w:startOverride w:val="1"/>
+    </w:lvlOverride>
+    <w:lvlOverride w:ilvl="1">
+      <w:startOverride w:val="1"/>
+    </w:lvlOverride>
+    <w:lvlOverride w:ilvl="2">
+      <w:startOverride w:val="1"/>
+    </w:lvlOverride>
+    <w:lvlOverride w:ilvl="3">
+      <w:startOverride w:val="1"/>
+    </w:lvlOverride>
+    <w:lvlOverride w:ilvl="4">
+      <w:startOverride w:val="1"/>
+    </w:lvlOverride>
+    <w:lvlOverride w:ilvl="5">
+      <w:startOverride w:val="1"/>
+    </w:lvlOverride>
+    <w:lvlOverride w:ilvl="6">
+      <w:startOverride w:val="1"/>
+    </w:lvlOverride>
+    <w:lvlOverride w:ilvl="7">
+      <w:startOverride w:val="1"/>
+    </w:lvlOverride>
+    <w:lvlOverride w:ilvl="8">
+      <w:startOverride w:val="1"/>
+    </w:lvlOverride>
+  </w:num>
+  <w:num w:numId="1029">
+    <w:abstractNumId w:val="991"/>
+  </w:num>
+  <w:num w:numId="1030">
     <w:abstractNumId w:val="991"/>
   </w:num>
 </w:numbering>

</xml_diff>

<commit_message>
E9 competitor results integrated; analysis, tables, figures, manuscript and supplement rebuilt
Co-Authored-By: Claude Opus 5.5 <noreply@anthropic.com>
Claude-Session: https://claude.ai/code/session_01GRaL3aKCgpJNtcS7frCXJ4
</commit_message>
<xml_diff>
--- a/Target_Journal_Submission/manuscript/Final_Manuscript.docx
+++ b/Target_Journal_Submission/manuscript/Final_Manuscript.docx
@@ -11221,7 +11221,72 @@
         <w:t xml:space="preserve"> </w:t>
       </w:r>
       <w:r>
-        <w:t xml:space="preserve">≥ 19 standards. With fewer standards it returns unbounded intervals rather than over-confident ones. Over all four transfer pipelines (PDS, DS, SBC and no transfer) and the three data sets, TJ+N under-covered in 0 of 152 pipeline × scenario combinations at α = 0.10. The corresponding numbers were 12 of 152 for Gauss-LOO, 120 of 152 for ASTM-PI and 129 of 152 for SCP-S (Table S2).</w:t>
+        <w:t xml:space="preserve">≥ 19 standards. With fewer standards it returns unbounded intervals rather than over-confident ones.</w:t>
+      </w:r>
+    </w:p>
+    <w:p>
+      <w:pPr>
+        <w:pStyle w:val="BodyText"/>
+      </w:pPr>
+      <w:r>
+        <w:rPr>
+          <w:bCs/>
+          <w:b/>
+        </w:rPr>
+        <w:t xml:space="preserve">Normalised Gaussian competitor (E9).</w:t>
+      </w:r>
+      <w:r>
+        <w:t xml:space="preserve"> </w:t>
+      </w:r>
+      <w:r>
+        <w:t xml:space="preserve">One might expect a heteroscedastic Gaussian interval using the same difficulty function to combine the efficiency of Gauss-LOO with the adaptivity of TJ+N: μ(x) ± t₁₋α/₂,ₘ₋₁ · RMS(Rᵢ) · σ(x), with Rᵢ from Eq. (3) (Gauss-LOO-N). We tested this in an additional experiment specified during review (200 repetitions; all primary pipelines and the instrument shift of E8; three α levels; Table S8).</w:t>
+      </w:r>
+    </w:p>
+    <w:p>
+      <w:pPr>
+        <w:numPr>
+          <w:ilvl w:val="0"/>
+          <w:numId w:val="1014"/>
+        </w:numPr>
+      </w:pPr>
+      <w:r>
+        <w:t xml:space="preserve">Under-covering scenarios over all α levels: TJ+N 0/192, Gauss-LOO 19/192, Gauss-LOO-N 14/192.</w:t>
+      </w:r>
+    </w:p>
+    <w:p>
+      <w:pPr>
+        <w:numPr>
+          <w:ilvl w:val="0"/>
+          <w:numId w:val="1014"/>
+        </w:numPr>
+      </w:pPr>
+      <w:r>
+        <w:t xml:space="preserve">At α = 0.05: 0/64, 17/64 and 8/64, respectively.</w:t>
+      </w:r>
+    </w:p>
+    <w:p>
+      <w:pPr>
+        <w:numPr>
+          <w:ilvl w:val="0"/>
+          <w:numId w:val="1014"/>
+        </w:numPr>
+      </w:pPr>
+      <w:r>
+        <w:t xml:space="preserve">At α = 0.10, Gauss-LOO-N had a lower median interval score than TJ+N in 59 of 64 scenarios (median score ratio 0.970).</w:t>
+      </w:r>
+    </w:p>
+    <w:p>
+      <w:pPr>
+        <w:pStyle w:val="FirstParagraph"/>
+      </w:pPr>
+      <w:r>
+        <w:t xml:space="preserve">The normalised Gaussian interval was therefore slightly more efficient, by about 3% in interval score, but it under-covered in several scenarios, mostly at 95%. TJ+N trades this small loss of efficiency for validity without distributional assumptions. Where a few percent of interval width matter more than a coverage guarantee, Gauss-LOO-N is a defensible pragmatic choice, provided its coverage is checked.</w:t>
+      </w:r>
+      <w:r>
+        <w:t xml:space="preserve"> </w:t>
+      </w:r>
+      <w:r>
+        <w:t xml:space="preserve">Over all four transfer pipelines (PDS, DS, SBC and no transfer) and the three data sets, TJ+N under-covered in 0 of 152 pipeline × scenario combinations at α = 0.10. The corresponding numbers were 12 of 152 for Gauss-LOO, 120 of 152 for ASTM-PI and 129 of 152 for SCP-S (Table S2).</w:t>
       </w:r>
     </w:p>
     <w:p>
@@ -11805,7 +11870,7 @@
       <w:pPr>
         <w:numPr>
           <w:ilvl w:val="0"/>
-          <w:numId w:val="1014"/>
+          <w:numId w:val="1015"/>
         </w:numPr>
       </w:pPr>
       <w:r>
@@ -11826,7 +11891,7 @@
       <w:pPr>
         <w:numPr>
           <w:ilvl w:val="0"/>
-          <w:numId w:val="1014"/>
+          <w:numId w:val="1015"/>
         </w:numPr>
       </w:pPr>
       <w:r>
@@ -11847,7 +11912,7 @@
       <w:pPr>
         <w:numPr>
           <w:ilvl w:val="0"/>
-          <w:numId w:val="1014"/>
+          <w:numId w:val="1015"/>
         </w:numPr>
       </w:pPr>
       <w:r>
@@ -11903,14 +11968,62 @@
         <w:t xml:space="preserve"> </w:t>
       </w:r>
       <w:r>
-        <w:t xml:space="preserve">Centring the interval on the full-fit prediction (TJ-naive-N) gave equal or slightly lower coverage than TJ+N. It was not flagged as under-covering here, but it carries no finite-sample guarantee.</w:t>
+        <w:t xml:space="preserve">Centring the interval on the full-fit prediction (TJ-naive-N) gave equal or slightly lower coverage than TJ+N. It is a reasonable practical alternative, but it carries no finite-sample guarantee.</w:t>
       </w:r>
     </w:p>
     <w:p>
       <w:pPr>
         <w:numPr>
           <w:ilvl w:val="0"/>
-          <w:numId w:val="1014"/>
+          <w:numId w:val="1015"/>
+        </w:numPr>
+      </w:pPr>
+      <w:r>
+        <w:rPr>
+          <w:bCs/>
+          <w:b/>
+        </w:rPr>
+        <w:t xml:space="preserve">Over all pipelines and α levels (E1 and E8 together):</w:t>
+      </w:r>
+    </w:p>
+    <w:p>
+      <w:pPr>
+        <w:numPr>
+          <w:ilvl w:val="1"/>
+          <w:numId w:val="1016"/>
+        </w:numPr>
+      </w:pPr>
+      <w:r>
+        <w:t xml:space="preserve">TJ-naive-N under-covered in 3 of 528 scenario cells, against 0 of 528 for TJ+N and 0 of 528 for TCV+N.</w:t>
+      </w:r>
+    </w:p>
+    <w:p>
+      <w:pPr>
+        <w:numPr>
+          <w:ilvl w:val="1"/>
+          <w:numId w:val="1016"/>
+        </w:numPr>
+      </w:pPr>
+      <w:r>
+        <w:t xml:space="preserve">Residuals without leave-one-out re-fitting (TJ-insample-N) under-covered in 199 of 528.</w:t>
+      </w:r>
+    </w:p>
+    <w:p>
+      <w:pPr>
+        <w:numPr>
+          <w:ilvl w:val="1"/>
+          <w:numId w:val="1016"/>
+        </w:numPr>
+      </w:pPr>
+      <w:r>
+        <w:t xml:space="preserve">Gauss-LOO under-covered in 77 of 528.</w:t>
+      </w:r>
+    </w:p>
+    <w:p>
+      <w:pPr>
+        <w:numPr>
+          <w:ilvl w:val="0"/>
+          <w:numId w:val="1015"/>
         </w:numPr>
       </w:pPr>
       <w:r>
@@ -11931,7 +12044,7 @@
       <w:pPr>
         <w:numPr>
           <w:ilvl w:val="1"/>
-          <w:numId w:val="1015"/>
+          <w:numId w:val="1017"/>
         </w:numPr>
       </w:pPr>
       <w:r>
@@ -11942,7 +12055,7 @@
       <w:pPr>
         <w:numPr>
           <w:ilvl w:val="1"/>
-          <w:numId w:val="1015"/>
+          <w:numId w:val="1017"/>
         </w:numPr>
       </w:pPr>
       <w:r>
@@ -11953,7 +12066,7 @@
       <w:pPr>
         <w:numPr>
           <w:ilvl w:val="1"/>
-          <w:numId w:val="1015"/>
+          <w:numId w:val="1017"/>
         </w:numPr>
       </w:pPr>
       <w:r>
@@ -11964,7 +12077,7 @@
       <w:pPr>
         <w:numPr>
           <w:ilvl w:val="1"/>
-          <w:numId w:val="1015"/>
+          <w:numId w:val="1017"/>
         </w:numPr>
       </w:pPr>
       <w:r>
@@ -13466,7 +13579,7 @@
       <w:pPr>
         <w:numPr>
           <w:ilvl w:val="0"/>
-          <w:numId w:val="1016"/>
+          <w:numId w:val="1018"/>
         </w:numPr>
       </w:pPr>
       <w:r>
@@ -13477,7 +13590,7 @@
       <w:pPr>
         <w:numPr>
           <w:ilvl w:val="0"/>
-          <w:numId w:val="1016"/>
+          <w:numId w:val="1018"/>
         </w:numPr>
       </w:pPr>
       <w:r>
@@ -13488,7 +13601,7 @@
       <w:pPr>
         <w:numPr>
           <w:ilvl w:val="0"/>
-          <w:numId w:val="1016"/>
+          <w:numId w:val="1018"/>
         </w:numPr>
       </w:pPr>
       <w:r>
@@ -16037,7 +16150,7 @@
       <w:pPr>
         <w:numPr>
           <w:ilvl w:val="0"/>
-          <w:numId w:val="1017"/>
+          <w:numId w:val="1019"/>
         </w:numPr>
       </w:pPr>
       <w:r>
@@ -16058,7 +16171,7 @@
       <w:pPr>
         <w:numPr>
           <w:ilvl w:val="0"/>
-          <w:numId w:val="1017"/>
+          <w:numId w:val="1019"/>
         </w:numPr>
       </w:pPr>
       <w:r>
@@ -16079,7 +16192,7 @@
       <w:pPr>
         <w:numPr>
           <w:ilvl w:val="0"/>
-          <w:numId w:val="1017"/>
+          <w:numId w:val="1019"/>
         </w:numPr>
       </w:pPr>
       <w:r>
@@ -16100,7 +16213,7 @@
       <w:pPr>
         <w:numPr>
           <w:ilvl w:val="0"/>
-          <w:numId w:val="1017"/>
+          <w:numId w:val="1019"/>
         </w:numPr>
       </w:pPr>
       <w:r>
@@ -16121,7 +16234,7 @@
       <w:pPr>
         <w:numPr>
           <w:ilvl w:val="1"/>
-          <w:numId w:val="1018"/>
+          <w:numId w:val="1020"/>
         </w:numPr>
       </w:pPr>
       <w:r>
@@ -16132,7 +16245,7 @@
       <w:pPr>
         <w:numPr>
           <w:ilvl w:val="1"/>
-          <w:numId w:val="1018"/>
+          <w:numId w:val="1020"/>
         </w:numPr>
       </w:pPr>
       <w:r>
@@ -16143,7 +16256,7 @@
       <w:pPr>
         <w:numPr>
           <w:ilvl w:val="1"/>
-          <w:numId w:val="1018"/>
+          <w:numId w:val="1020"/>
         </w:numPr>
       </w:pPr>
       <w:r>
@@ -16207,7 +16320,7 @@
       <w:pPr>
         <w:numPr>
           <w:ilvl w:val="0"/>
-          <w:numId w:val="1019"/>
+          <w:numId w:val="1021"/>
         </w:numPr>
       </w:pPr>
       <w:r>
@@ -16218,7 +16331,7 @@
       <w:pPr>
         <w:numPr>
           <w:ilvl w:val="0"/>
-          <w:numId w:val="1019"/>
+          <w:numId w:val="1021"/>
         </w:numPr>
       </w:pPr>
       <w:r>
@@ -16229,7 +16342,7 @@
       <w:pPr>
         <w:numPr>
           <w:ilvl w:val="0"/>
-          <w:numId w:val="1019"/>
+          <w:numId w:val="1021"/>
         </w:numPr>
       </w:pPr>
       <w:r>
@@ -16240,7 +16353,7 @@
       <w:pPr>
         <w:numPr>
           <w:ilvl w:val="0"/>
-          <w:numId w:val="1019"/>
+          <w:numId w:val="1021"/>
         </w:numPr>
       </w:pPr>
       <w:r>
@@ -16269,7 +16382,7 @@
       <w:pPr>
         <w:numPr>
           <w:ilvl w:val="0"/>
-          <w:numId w:val="1020"/>
+          <w:numId w:val="1022"/>
         </w:numPr>
       </w:pPr>
       <w:r>
@@ -16280,7 +16393,7 @@
       <w:pPr>
         <w:numPr>
           <w:ilvl w:val="0"/>
-          <w:numId w:val="1020"/>
+          <w:numId w:val="1022"/>
         </w:numPr>
       </w:pPr>
       <w:r>
@@ -16291,7 +16404,7 @@
       <w:pPr>
         <w:numPr>
           <w:ilvl w:val="0"/>
-          <w:numId w:val="1020"/>
+          <w:numId w:val="1022"/>
         </w:numPr>
       </w:pPr>
       <w:r>
@@ -19178,7 +19291,7 @@
       <w:pPr>
         <w:numPr>
           <w:ilvl w:val="0"/>
-          <w:numId w:val="1021"/>
+          <w:numId w:val="1023"/>
         </w:numPr>
       </w:pPr>
       <w:r>
@@ -19205,7 +19318,7 @@
       <w:pPr>
         <w:numPr>
           <w:ilvl w:val="0"/>
-          <w:numId w:val="1021"/>
+          <w:numId w:val="1023"/>
         </w:numPr>
       </w:pPr>
       <w:r>
@@ -19264,7 +19377,7 @@
       <w:pPr>
         <w:numPr>
           <w:ilvl w:val="0"/>
-          <w:numId w:val="1021"/>
+          <w:numId w:val="1023"/>
         </w:numPr>
       </w:pPr>
       <w:r>
@@ -19275,7 +19388,7 @@
       <w:pPr>
         <w:numPr>
           <w:ilvl w:val="0"/>
-          <w:numId w:val="1021"/>
+          <w:numId w:val="1023"/>
         </w:numPr>
       </w:pPr>
       <w:r>
@@ -19433,7 +19546,7 @@
       <w:pPr>
         <w:numPr>
           <w:ilvl w:val="0"/>
-          <w:numId w:val="1022"/>
+          <w:numId w:val="1024"/>
         </w:numPr>
       </w:pPr>
       <w:r>
@@ -19444,7 +19557,7 @@
       <w:pPr>
         <w:numPr>
           <w:ilvl w:val="0"/>
-          <w:numId w:val="1022"/>
+          <w:numId w:val="1024"/>
         </w:numPr>
       </w:pPr>
       <w:r>
@@ -19455,7 +19568,7 @@
       <w:pPr>
         <w:numPr>
           <w:ilvl w:val="0"/>
-          <w:numId w:val="1022"/>
+          <w:numId w:val="1024"/>
         </w:numPr>
       </w:pPr>
       <w:r>
@@ -19498,7 +19611,7 @@
       <w:pPr>
         <w:numPr>
           <w:ilvl w:val="0"/>
-          <w:numId w:val="1022"/>
+          <w:numId w:val="1024"/>
         </w:numPr>
       </w:pPr>
       <w:r>
@@ -19509,7 +19622,7 @@
       <w:pPr>
         <w:numPr>
           <w:ilvl w:val="0"/>
-          <w:numId w:val="1022"/>
+          <w:numId w:val="1024"/>
         </w:numPr>
       </w:pPr>
       <w:r>
@@ -19531,7 +19644,7 @@
       <w:pPr>
         <w:numPr>
           <w:ilvl w:val="0"/>
-          <w:numId w:val="1023"/>
+          <w:numId w:val="1025"/>
         </w:numPr>
       </w:pPr>
       <w:r>
@@ -19546,7 +19659,7 @@
       <w:pPr>
         <w:numPr>
           <w:ilvl w:val="1"/>
-          <w:numId w:val="1024"/>
+          <w:numId w:val="1026"/>
         </w:numPr>
       </w:pPr>
       <w:r>
@@ -19557,7 +19670,7 @@
       <w:pPr>
         <w:numPr>
           <w:ilvl w:val="1"/>
-          <w:numId w:val="1024"/>
+          <w:numId w:val="1026"/>
         </w:numPr>
       </w:pPr>
       <w:r>
@@ -19568,7 +19681,7 @@
       <w:pPr>
         <w:numPr>
           <w:ilvl w:val="1"/>
-          <w:numId w:val="1024"/>
+          <w:numId w:val="1026"/>
         </w:numPr>
       </w:pPr>
       <w:r>
@@ -19579,7 +19692,7 @@
       <w:pPr>
         <w:numPr>
           <w:ilvl w:val="0"/>
-          <w:numId w:val="1023"/>
+          <w:numId w:val="1025"/>
         </w:numPr>
       </w:pPr>
       <w:r>
@@ -19594,7 +19707,7 @@
       <w:pPr>
         <w:numPr>
           <w:ilvl w:val="1"/>
-          <w:numId w:val="1025"/>
+          <w:numId w:val="1027"/>
         </w:numPr>
       </w:pPr>
       <w:r>
@@ -19605,7 +19718,7 @@
       <w:pPr>
         <w:numPr>
           <w:ilvl w:val="1"/>
-          <w:numId w:val="1025"/>
+          <w:numId w:val="1027"/>
         </w:numPr>
       </w:pPr>
       <w:r>
@@ -19616,7 +19729,7 @@
       <w:pPr>
         <w:numPr>
           <w:ilvl w:val="1"/>
-          <w:numId w:val="1025"/>
+          <w:numId w:val="1027"/>
         </w:numPr>
       </w:pPr>
       <w:r>
@@ -19627,7 +19740,7 @@
       <w:pPr>
         <w:numPr>
           <w:ilvl w:val="0"/>
-          <w:numId w:val="1023"/>
+          <w:numId w:val="1025"/>
         </w:numPr>
       </w:pPr>
       <w:r>
@@ -19642,7 +19755,7 @@
       <w:pPr>
         <w:numPr>
           <w:ilvl w:val="1"/>
-          <w:numId w:val="1026"/>
+          <w:numId w:val="1028"/>
         </w:numPr>
       </w:pPr>
       <w:r>
@@ -19653,7 +19766,7 @@
       <w:pPr>
         <w:numPr>
           <w:ilvl w:val="1"/>
-          <w:numId w:val="1026"/>
+          <w:numId w:val="1028"/>
         </w:numPr>
       </w:pPr>
       <w:r>
@@ -19677,7 +19790,7 @@
       <w:pPr>
         <w:numPr>
           <w:ilvl w:val="1"/>
-          <w:numId w:val="1026"/>
+          <w:numId w:val="1028"/>
         </w:numPr>
       </w:pPr>
       <w:r>
@@ -19688,7 +19801,7 @@
       <w:pPr>
         <w:numPr>
           <w:ilvl w:val="0"/>
-          <w:numId w:val="1023"/>
+          <w:numId w:val="1025"/>
         </w:numPr>
       </w:pPr>
       <w:r>
@@ -19703,7 +19816,7 @@
       <w:pPr>
         <w:numPr>
           <w:ilvl w:val="1"/>
-          <w:numId w:val="1027"/>
+          <w:numId w:val="1029"/>
         </w:numPr>
       </w:pPr>
       <w:r>
@@ -19730,7 +19843,7 @@
       <w:pPr>
         <w:numPr>
           <w:ilvl w:val="1"/>
-          <w:numId w:val="1027"/>
+          <w:numId w:val="1029"/>
         </w:numPr>
       </w:pPr>
       <w:r>
@@ -19741,7 +19854,7 @@
       <w:pPr>
         <w:numPr>
           <w:ilvl w:val="1"/>
-          <w:numId w:val="1027"/>
+          <w:numId w:val="1029"/>
         </w:numPr>
       </w:pPr>
       <w:r>
@@ -19752,7 +19865,7 @@
       <w:pPr>
         <w:numPr>
           <w:ilvl w:val="1"/>
-          <w:numId w:val="1027"/>
+          <w:numId w:val="1029"/>
         </w:numPr>
       </w:pPr>
       <w:r>
@@ -19763,7 +19876,7 @@
       <w:pPr>
         <w:numPr>
           <w:ilvl w:val="0"/>
-          <w:numId w:val="1023"/>
+          <w:numId w:val="1025"/>
         </w:numPr>
       </w:pPr>
       <w:r>
@@ -19784,7 +19897,7 @@
       <w:pPr>
         <w:numPr>
           <w:ilvl w:val="0"/>
-          <w:numId w:val="1023"/>
+          <w:numId w:val="1025"/>
         </w:numPr>
       </w:pPr>
       <w:r>
@@ -19821,7 +19934,7 @@
       <w:pPr>
         <w:numPr>
           <w:ilvl w:val="0"/>
-          <w:numId w:val="1023"/>
+          <w:numId w:val="1025"/>
         </w:numPr>
       </w:pPr>
       <w:r>
@@ -19892,7 +20005,7 @@
       <w:pPr>
         <w:numPr>
           <w:ilvl w:val="0"/>
-          <w:numId w:val="1028"/>
+          <w:numId w:val="1030"/>
         </w:numPr>
       </w:pPr>
       <w:r>
@@ -19903,7 +20016,7 @@
       <w:pPr>
         <w:numPr>
           <w:ilvl w:val="0"/>
-          <w:numId w:val="1028"/>
+          <w:numId w:val="1030"/>
         </w:numPr>
       </w:pPr>
       <w:r>
@@ -19946,7 +20059,7 @@
       <w:pPr>
         <w:numPr>
           <w:ilvl w:val="0"/>
-          <w:numId w:val="1028"/>
+          <w:numId w:val="1030"/>
         </w:numPr>
       </w:pPr>
       <w:r>
@@ -21646,7 +21759,7 @@
       <w:pPr>
         <w:numPr>
           <w:ilvl w:val="0"/>
-          <w:numId w:val="1029"/>
+          <w:numId w:val="1031"/>
         </w:numPr>
       </w:pPr>
       <w:r>
@@ -21899,7 +22012,7 @@
       <w:pPr>
         <w:numPr>
           <w:ilvl w:val="0"/>
-          <w:numId w:val="1029"/>
+          <w:numId w:val="1031"/>
         </w:numPr>
       </w:pPr>
       <w:r>
@@ -23331,7 +23444,7 @@
       <w:pPr>
         <w:numPr>
           <w:ilvl w:val="0"/>
-          <w:numId w:val="1030"/>
+          <w:numId w:val="1032"/>
         </w:numPr>
       </w:pPr>
       <w:r>
@@ -23534,7 +23647,7 @@
       <w:pPr>
         <w:numPr>
           <w:ilvl w:val="0"/>
-          <w:numId w:val="1030"/>
+          <w:numId w:val="1032"/>
         </w:numPr>
       </w:pPr>
       <w:r>
@@ -23584,7 +23697,7 @@
       <w:pPr>
         <w:numPr>
           <w:ilvl w:val="0"/>
-          <w:numId w:val="1030"/>
+          <w:numId w:val="1032"/>
         </w:numPr>
       </w:pPr>
       <w:r>
@@ -23595,7 +23708,7 @@
       <w:pPr>
         <w:numPr>
           <w:ilvl w:val="0"/>
-          <w:numId w:val="1030"/>
+          <w:numId w:val="1032"/>
         </w:numPr>
       </w:pPr>
       <w:r>
@@ -25320,6 +25433,12 @@
     <w:abstractNumId w:val="991"/>
   </w:num>
   <w:num w:numId="1022">
+    <w:abstractNumId w:val="991"/>
+  </w:num>
+  <w:num w:numId="1023">
+    <w:abstractNumId w:val="991"/>
+  </w:num>
+  <w:num w:numId="1024">
     <w:abstractNumId w:val="99411"/>
     <w:lvlOverride w:ilvl="0">
       <w:startOverride w:val="1"/>
@@ -25349,7 +25468,7 @@
       <w:startOverride w:val="1"/>
     </w:lvlOverride>
   </w:num>
-  <w:num w:numId="1023">
+  <w:num w:numId="1025">
     <w:abstractNumId w:val="99411"/>
     <w:lvlOverride w:ilvl="0">
       <w:startOverride w:val="1"/>
@@ -25379,12 +25498,6 @@
       <w:startOverride w:val="1"/>
     </w:lvlOverride>
   </w:num>
-  <w:num w:numId="1024">
-    <w:abstractNumId w:val="991"/>
-  </w:num>
-  <w:num w:numId="1025">
-    <w:abstractNumId w:val="991"/>
-  </w:num>
   <w:num w:numId="1026">
     <w:abstractNumId w:val="991"/>
   </w:num>
@@ -25392,6 +25505,12 @@
     <w:abstractNumId w:val="991"/>
   </w:num>
   <w:num w:numId="1028">
+    <w:abstractNumId w:val="991"/>
+  </w:num>
+  <w:num w:numId="1029">
+    <w:abstractNumId w:val="991"/>
+  </w:num>
+  <w:num w:numId="1030">
     <w:abstractNumId w:val="99411"/>
     <w:lvlOverride w:ilvl="0">
       <w:startOverride w:val="1"/>
@@ -25421,10 +25540,10 @@
       <w:startOverride w:val="1"/>
     </w:lvlOverride>
   </w:num>
-  <w:num w:numId="1029">
+  <w:num w:numId="1031">
     <w:abstractNumId w:val="991"/>
   </w:num>
-  <w:num w:numId="1030">
+  <w:num w:numId="1032">
     <w:abstractNumId w:val="991"/>
   </w:num>
 </w:numbering>

</xml_diff>

<commit_message>
Review 10 experiments (E4b sub-channel drift), realised-coverage tails, limitations; rebuilt documents
Co-Authored-By: Claude Opus 5.5 <noreply@anthropic.com>
Claude-Session: https://claude.ai/code/session_01GRaL3aKCgpJNtcS7frCXJ4
</commit_message>
<xml_diff>
--- a/Target_Journal_Submission/manuscript/Final_Manuscript.docx
+++ b/Target_Journal_Submission/manuscript/Final_Manuscript.docx
@@ -210,7 +210,7 @@
         <w:t xml:space="preserve"> </w:t>
       </w:r>
       <w:r>
-        <w:t xml:space="preserve">≤ 15. Gaussian intervals from leave-one-out residuals were similarly efficient at 90% but under-covered in 14 of 40 scenarios at 95%. All methods failed under wavelength drift occurring after standardisation.</w:t>
+        <w:t xml:space="preserve">≤ 15. Gaussian intervals from leave-one-out residuals were similarly efficient at 90% but under-covered in 14 of 40 scenarios at 95%. Wavelength drift after standardisation, even by a quarter channel, compromised all methods.</w:t>
       </w:r>
     </w:p>
     <w:p>
@@ -11250,7 +11250,7 @@
         </w:numPr>
       </w:pPr>
       <w:r>
-        <w:t xml:space="preserve">Under-covering scenarios over all α levels: TJ+N 0/192, Gauss-LOO 19/192, Gauss-LOO-N 14/192.</w:t>
+        <w:t xml:space="preserve">Under-covering scenarios over all α levels: TJ+N 0/192, Gauss-LOO 18/192, Gauss-LOO-N 14/192.</w:t>
       </w:r>
     </w:p>
     <w:p>
@@ -11261,7 +11261,7 @@
         </w:numPr>
       </w:pPr>
       <w:r>
-        <w:t xml:space="preserve">At α = 0.05: 0/64, 17/64 and 8/64, respectively.</w:t>
+        <w:t xml:space="preserve">At α = 0.05: 0/64, 16/64 and 8/64, respectively.</w:t>
       </w:r>
     </w:p>
     <w:p>
@@ -13613,7 +13613,48 @@
         <w:pStyle w:val="FirstParagraph"/>
       </w:pPr>
       <w:r>
-        <w:t xml:space="preserve">On corn and mango, the Q residual of the shifted spectra inflated σ(x) and recovered a large part of the coverage. On tablets, where the assay information is concentrated in a few sharp bands, it did not. Drift after standardisation must therefore be detected (for example by monitoring Q) and corrected by re-standardisation. No interval method compensates for it reliably.</w:t>
+        <w:t xml:space="preserve">On corn and mango, the Q residual of the shifted spectra inflated σ(x) and recovered a large part of the coverage. On tablets, where the assay information is concentrated in a few sharp bands, it did not. A one-channel shift is a large drift. In an additional test with a sub-channel shift of ±0.25 channel (linear interpolation; specified during review; Supplementary Table S10), coverage was:</w:t>
+      </w:r>
+    </w:p>
+    <w:p>
+      <w:pPr>
+        <w:numPr>
+          <w:ilvl w:val="0"/>
+          <w:numId w:val="1019"/>
+        </w:numPr>
+      </w:pPr>
+      <w:r>
+        <w:t xml:space="preserve">TJ+N: corn 0.84–0.96, tablets 0.59–0.62, mango 0.86–0.96 (4/12 scenarios under-covering);</w:t>
+      </w:r>
+    </w:p>
+    <w:p>
+      <w:pPr>
+        <w:numPr>
+          <w:ilvl w:val="0"/>
+          <w:numId w:val="1019"/>
+        </w:numPr>
+      </w:pPr>
+      <w:r>
+        <w:t xml:space="preserve">Gauss-LOO: corn 0.62–0.71, tablets 0.66–0.66, mango 0.78–0.83 (12/12);</w:t>
+      </w:r>
+    </w:p>
+    <w:p>
+      <w:pPr>
+        <w:numPr>
+          <w:ilvl w:val="0"/>
+          <w:numId w:val="1019"/>
+        </w:numPr>
+      </w:pPr>
+      <w:r>
+        <w:t xml:space="preserve">ASTM-PI: corn 0.02–0.31, tablets 0.66–0.66, mango 0.62–0.68.</w:t>
+      </w:r>
+    </w:p>
+    <w:p>
+      <w:pPr>
+        <w:pStyle w:val="FirstParagraph"/>
+      </w:pPr>
+      <w:r>
+        <w:t xml:space="preserve">TJ+N degraded least on corn and mango, but even this small drift invalidated all methods for the tablet assay. Drift after standardisation must therefore be detected (for example by monitoring Q) and corrected by re-standardisation. No interval method compensates for it reliably.</w:t>
       </w:r>
     </w:p>
     <w:p>
@@ -13705,7 +13746,7 @@
       <w:pPr>
         <w:numPr>
           <w:ilvl w:val="0"/>
-          <w:numId w:val="1019"/>
+          <w:numId w:val="1020"/>
         </w:numPr>
       </w:pPr>
       <w:r>
@@ -13726,7 +13767,7 @@
       <w:pPr>
         <w:numPr>
           <w:ilvl w:val="0"/>
-          <w:numId w:val="1019"/>
+          <w:numId w:val="1020"/>
         </w:numPr>
       </w:pPr>
       <w:r>
@@ -13747,7 +13788,7 @@
       <w:pPr>
         <w:numPr>
           <w:ilvl w:val="0"/>
-          <w:numId w:val="1019"/>
+          <w:numId w:val="1020"/>
         </w:numPr>
       </w:pPr>
       <w:r>
@@ -13768,7 +13809,7 @@
       <w:pPr>
         <w:numPr>
           <w:ilvl w:val="0"/>
-          <w:numId w:val="1019"/>
+          <w:numId w:val="1020"/>
         </w:numPr>
       </w:pPr>
       <w:r>
@@ -13789,7 +13830,7 @@
       <w:pPr>
         <w:numPr>
           <w:ilvl w:val="1"/>
-          <w:numId w:val="1020"/>
+          <w:numId w:val="1021"/>
         </w:numPr>
       </w:pPr>
       <w:r>
@@ -13800,7 +13841,7 @@
       <w:pPr>
         <w:numPr>
           <w:ilvl w:val="1"/>
-          <w:numId w:val="1020"/>
+          <w:numId w:val="1021"/>
         </w:numPr>
       </w:pPr>
       <w:r>
@@ -13811,7 +13852,7 @@
       <w:pPr>
         <w:numPr>
           <w:ilvl w:val="1"/>
-          <w:numId w:val="1020"/>
+          <w:numId w:val="1021"/>
         </w:numPr>
       </w:pPr>
       <w:r>
@@ -13875,7 +13916,7 @@
       <w:pPr>
         <w:numPr>
           <w:ilvl w:val="0"/>
-          <w:numId w:val="1021"/>
+          <w:numId w:val="1022"/>
         </w:numPr>
       </w:pPr>
       <w:r>
@@ -13886,7 +13927,7 @@
       <w:pPr>
         <w:numPr>
           <w:ilvl w:val="0"/>
-          <w:numId w:val="1021"/>
+          <w:numId w:val="1022"/>
         </w:numPr>
       </w:pPr>
       <w:r>
@@ -13897,7 +13938,7 @@
       <w:pPr>
         <w:numPr>
           <w:ilvl w:val="0"/>
-          <w:numId w:val="1021"/>
+          <w:numId w:val="1022"/>
         </w:numPr>
       </w:pPr>
       <w:r>
@@ -13908,7 +13949,7 @@
       <w:pPr>
         <w:numPr>
           <w:ilvl w:val="0"/>
-          <w:numId w:val="1021"/>
+          <w:numId w:val="1022"/>
         </w:numPr>
       </w:pPr>
       <w:r>
@@ -13937,7 +13978,7 @@
       <w:pPr>
         <w:numPr>
           <w:ilvl w:val="0"/>
-          <w:numId w:val="1022"/>
+          <w:numId w:val="1023"/>
         </w:numPr>
       </w:pPr>
       <w:r>
@@ -13948,7 +13989,7 @@
       <w:pPr>
         <w:numPr>
           <w:ilvl w:val="0"/>
-          <w:numId w:val="1022"/>
+          <w:numId w:val="1023"/>
         </w:numPr>
       </w:pPr>
       <w:r>
@@ -13959,7 +14000,7 @@
       <w:pPr>
         <w:numPr>
           <w:ilvl w:val="0"/>
-          <w:numId w:val="1022"/>
+          <w:numId w:val="1023"/>
         </w:numPr>
       </w:pPr>
       <w:r>
@@ -14272,7 +14313,7 @@
               <w:jc w:val="right"/>
             </w:pPr>
             <w:r>
-              <w:t xml:space="preserve">0.800 (11/12); 1.53</w:t>
+              <w:t xml:space="preserve">0.800 (12/12); 1.53</w:t>
             </w:r>
           </w:p>
         </w:tc>
@@ -16611,7 +16652,7 @@
         <w:t xml:space="preserve"> </w:t>
       </w:r>
       <w:r>
-        <w:t xml:space="preserve">= 50 for tablets and mango).</w:t>
+        <w:t xml:space="preserve">= 50 for tablets and mango). Put differently, the share of repetitions whose realised coverage on the test set fell below 0.80 was corn m = 20: 8%; tablets m = 20: 6%; tablets m = 50: 2%; mango m = 20: 10%; mango m = 50: 2%. Users who need a guarantee for their particular set of standards (training-conditional coverage) should use more standards or a more conservative α.</w:t>
       </w:r>
     </w:p>
     <w:p>
@@ -16846,7 +16887,7 @@
       <w:pPr>
         <w:numPr>
           <w:ilvl w:val="0"/>
-          <w:numId w:val="1023"/>
+          <w:numId w:val="1024"/>
         </w:numPr>
       </w:pPr>
       <w:r>
@@ -16873,7 +16914,7 @@
       <w:pPr>
         <w:numPr>
           <w:ilvl w:val="0"/>
-          <w:numId w:val="1023"/>
+          <w:numId w:val="1024"/>
         </w:numPr>
       </w:pPr>
       <w:r>
@@ -16932,7 +16973,7 @@
       <w:pPr>
         <w:numPr>
           <w:ilvl w:val="0"/>
-          <w:numId w:val="1023"/>
+          <w:numId w:val="1024"/>
         </w:numPr>
       </w:pPr>
       <w:r>
@@ -16943,7 +16984,7 @@
       <w:pPr>
         <w:numPr>
           <w:ilvl w:val="0"/>
-          <w:numId w:val="1023"/>
+          <w:numId w:val="1024"/>
         </w:numPr>
       </w:pPr>
       <w:r>
@@ -17034,7 +17075,7 @@
       <w:pPr>
         <w:numPr>
           <w:ilvl w:val="0"/>
-          <w:numId w:val="1024"/>
+          <w:numId w:val="1025"/>
         </w:numPr>
       </w:pPr>
       <w:r>
@@ -17045,7 +17086,7 @@
       <w:pPr>
         <w:numPr>
           <w:ilvl w:val="0"/>
-          <w:numId w:val="1024"/>
+          <w:numId w:val="1025"/>
         </w:numPr>
       </w:pPr>
       <w:r>
@@ -17056,7 +17097,7 @@
       <w:pPr>
         <w:numPr>
           <w:ilvl w:val="0"/>
-          <w:numId w:val="1024"/>
+          <w:numId w:val="1025"/>
         </w:numPr>
       </w:pPr>
       <w:r>
@@ -17099,7 +17140,7 @@
       <w:pPr>
         <w:numPr>
           <w:ilvl w:val="0"/>
-          <w:numId w:val="1024"/>
+          <w:numId w:val="1025"/>
         </w:numPr>
       </w:pPr>
       <w:r>
@@ -17110,11 +17151,11 @@
       <w:pPr>
         <w:numPr>
           <w:ilvl w:val="0"/>
-          <w:numId w:val="1024"/>
+          <w:numId w:val="1025"/>
         </w:numPr>
       </w:pPr>
       <w:r>
-        <w:t xml:space="preserve">Flag predictions with large Q residuals after transfer.</w:t>
+        <w:t xml:space="preserve">Flag predictions with large Q residuals after transfer. Re-check coverage periodically on a few fresh reference samples, because drift after standardisation invalidates any interval calibrated at standardisation time.</w:t>
       </w:r>
     </w:p>
     <w:bookmarkEnd w:id="68"/>
@@ -17132,7 +17173,7 @@
       <w:pPr>
         <w:numPr>
           <w:ilvl w:val="0"/>
-          <w:numId w:val="1025"/>
+          <w:numId w:val="1026"/>
         </w:numPr>
       </w:pPr>
       <w:r>
@@ -17147,7 +17188,7 @@
       <w:pPr>
         <w:numPr>
           <w:ilvl w:val="1"/>
-          <w:numId w:val="1026"/>
+          <w:numId w:val="1027"/>
         </w:numPr>
       </w:pPr>
       <w:r>
@@ -17158,7 +17199,7 @@
       <w:pPr>
         <w:numPr>
           <w:ilvl w:val="1"/>
-          <w:numId w:val="1026"/>
+          <w:numId w:val="1027"/>
         </w:numPr>
       </w:pPr>
       <w:r>
@@ -17169,7 +17210,7 @@
       <w:pPr>
         <w:numPr>
           <w:ilvl w:val="1"/>
-          <w:numId w:val="1026"/>
+          <w:numId w:val="1027"/>
         </w:numPr>
       </w:pPr>
       <w:r>
@@ -17180,7 +17221,7 @@
       <w:pPr>
         <w:numPr>
           <w:ilvl w:val="0"/>
-          <w:numId w:val="1025"/>
+          <w:numId w:val="1026"/>
         </w:numPr>
       </w:pPr>
       <w:r>
@@ -17195,7 +17236,7 @@
       <w:pPr>
         <w:numPr>
           <w:ilvl w:val="1"/>
-          <w:numId w:val="1027"/>
+          <w:numId w:val="1028"/>
         </w:numPr>
       </w:pPr>
       <w:r>
@@ -17206,7 +17247,7 @@
       <w:pPr>
         <w:numPr>
           <w:ilvl w:val="1"/>
-          <w:numId w:val="1027"/>
+          <w:numId w:val="1028"/>
         </w:numPr>
       </w:pPr>
       <w:r>
@@ -17217,7 +17258,7 @@
       <w:pPr>
         <w:numPr>
           <w:ilvl w:val="1"/>
-          <w:numId w:val="1027"/>
+          <w:numId w:val="1028"/>
         </w:numPr>
       </w:pPr>
       <w:r>
@@ -17228,7 +17269,7 @@
       <w:pPr>
         <w:numPr>
           <w:ilvl w:val="0"/>
-          <w:numId w:val="1025"/>
+          <w:numId w:val="1026"/>
         </w:numPr>
       </w:pPr>
       <w:r>
@@ -17243,7 +17284,7 @@
       <w:pPr>
         <w:numPr>
           <w:ilvl w:val="1"/>
-          <w:numId w:val="1028"/>
+          <w:numId w:val="1029"/>
         </w:numPr>
       </w:pPr>
       <w:r>
@@ -17254,7 +17295,7 @@
       <w:pPr>
         <w:numPr>
           <w:ilvl w:val="1"/>
-          <w:numId w:val="1028"/>
+          <w:numId w:val="1029"/>
         </w:numPr>
       </w:pPr>
       <w:r>
@@ -17278,7 +17319,7 @@
       <w:pPr>
         <w:numPr>
           <w:ilvl w:val="1"/>
-          <w:numId w:val="1028"/>
+          <w:numId w:val="1029"/>
         </w:numPr>
       </w:pPr>
       <w:r>
@@ -17289,7 +17330,7 @@
       <w:pPr>
         <w:numPr>
           <w:ilvl w:val="0"/>
-          <w:numId w:val="1025"/>
+          <w:numId w:val="1026"/>
         </w:numPr>
       </w:pPr>
       <w:r>
@@ -17304,7 +17345,7 @@
       <w:pPr>
         <w:numPr>
           <w:ilvl w:val="1"/>
-          <w:numId w:val="1029"/>
+          <w:numId w:val="1030"/>
         </w:numPr>
       </w:pPr>
       <w:r>
@@ -17331,7 +17372,7 @@
       <w:pPr>
         <w:numPr>
           <w:ilvl w:val="1"/>
-          <w:numId w:val="1029"/>
+          <w:numId w:val="1030"/>
         </w:numPr>
       </w:pPr>
       <w:r>
@@ -17342,7 +17383,7 @@
       <w:pPr>
         <w:numPr>
           <w:ilvl w:val="1"/>
-          <w:numId w:val="1029"/>
+          <w:numId w:val="1030"/>
         </w:numPr>
       </w:pPr>
       <w:r>
@@ -17353,18 +17394,56 @@
       <w:pPr>
         <w:numPr>
           <w:ilvl w:val="1"/>
-          <w:numId w:val="1029"/>
+          <w:numId w:val="1030"/>
         </w:numPr>
       </w:pPr>
       <w:r>
         <w:t xml:space="preserve">Other techniques (Raman, MIR), non-linear or deep domain-adaptation transfers, and process data streams with drift were not tested.</w:t>
+      </w:r>
+    </w:p>
+    <w:p>
+      <w:pPr>
+        <w:numPr>
+          <w:ilvl w:val="1"/>
+          <w:numId w:val="1030"/>
+        </w:numPr>
+      </w:pPr>
+      <w:r>
+        <w:t xml:space="preserve">Probabilistic alternatives that model the transfer jointly (for example Gaussian-process or Bayesian PLS models) were not compared; their intervals depend on model assumptions that would themselves need validation after transfer.</w:t>
+      </w:r>
+    </w:p>
+    <w:p>
+      <w:pPr>
+        <w:numPr>
+          <w:ilvl w:val="1"/>
+          <w:numId w:val="1030"/>
+        </w:numPr>
+      </w:pPr>
+      <w:r>
+        <w:t xml:space="preserve">Very high confidence levels are expensive: at α = 0.01, a bounded TJ+ interval requires</w:t>
+      </w:r>
+      <w:r>
+        <w:t xml:space="preserve"> </w:t>
+      </w:r>
+      <w:r>
+        <w:rPr>
+          <w:iCs/>
+          <w:i/>
+        </w:rPr>
+        <w:t xml:space="preserve">m</w:t>
+      </w:r>
+      <w:r>
+        <w:t xml:space="preserve"> </w:t>
+      </w:r>
+      <w:r>
+        <w:t xml:space="preserve">≥ 99 standards.</w:t>
       </w:r>
     </w:p>
     <w:p>
       <w:pPr>
         <w:numPr>
           <w:ilvl w:val="0"/>
-          <w:numId w:val="1025"/>
+          <w:numId w:val="1026"/>
         </w:numPr>
       </w:pPr>
       <w:r>
@@ -17385,7 +17464,7 @@
       <w:pPr>
         <w:numPr>
           <w:ilvl w:val="0"/>
-          <w:numId w:val="1025"/>
+          <w:numId w:val="1026"/>
         </w:numPr>
       </w:pPr>
       <w:r>
@@ -17422,7 +17501,7 @@
       <w:pPr>
         <w:numPr>
           <w:ilvl w:val="0"/>
-          <w:numId w:val="1025"/>
+          <w:numId w:val="1026"/>
         </w:numPr>
       </w:pPr>
       <w:r>
@@ -17436,7 +17515,7 @@
         <w:t xml:space="preserve"> </w:t>
       </w:r>
       <w:r>
-        <w:t xml:space="preserve">A shift of the routine spectra after the transfer has been fitted (simulated as a one-channel wavelength shift) invalidated all intervals, including TJ+N (§4.5). The guarantee presupposes a stable target instrument between standardisation and use.</w:t>
+        <w:t xml:space="preserve">A wavelength shift of the routine spectra after the transfer had been fitted invalidated the intervals of all methods, including TJ+N. This happened for a one-channel shift and, for some responses, already for a quarter-channel shift (§4.5). The guarantee presupposes a stable target instrument between standardisation and use.</w:t>
       </w:r>
     </w:p>
     <w:bookmarkEnd w:id="70"/>
@@ -17478,7 +17557,7 @@
         <w:t xml:space="preserve"> </w:t>
       </w:r>
       <w:r>
-        <w:t xml:space="preserve">refits of the transfer step, which took seconds or less in all cases studied.</w:t>
+        <w:t xml:space="preserve">refits of the transfer step, which took seconds or less in all cases studied. No interval method, TJ+N included, protects against drift that occurs after standardisation; it must be monitored.</w:t>
       </w:r>
     </w:p>
     <w:p>
@@ -17493,7 +17572,7 @@
       <w:pPr>
         <w:numPr>
           <w:ilvl w:val="0"/>
-          <w:numId w:val="1030"/>
+          <w:numId w:val="1031"/>
         </w:numPr>
       </w:pPr>
       <w:r>
@@ -17504,7 +17583,7 @@
       <w:pPr>
         <w:numPr>
           <w:ilvl w:val="0"/>
-          <w:numId w:val="1030"/>
+          <w:numId w:val="1031"/>
         </w:numPr>
       </w:pPr>
       <w:r>
@@ -17547,7 +17626,7 @@
       <w:pPr>
         <w:numPr>
           <w:ilvl w:val="0"/>
-          <w:numId w:val="1030"/>
+          <w:numId w:val="1031"/>
         </w:numPr>
       </w:pPr>
       <w:r>
@@ -19247,7 +19326,7 @@
       <w:pPr>
         <w:numPr>
           <w:ilvl w:val="0"/>
-          <w:numId w:val="1031"/>
+          <w:numId w:val="1032"/>
         </w:numPr>
       </w:pPr>
       <w:r>
@@ -19500,7 +19579,7 @@
       <w:pPr>
         <w:numPr>
           <w:ilvl w:val="0"/>
-          <w:numId w:val="1031"/>
+          <w:numId w:val="1032"/>
         </w:numPr>
       </w:pPr>
       <w:r>
@@ -20932,7 +21011,7 @@
       <w:pPr>
         <w:numPr>
           <w:ilvl w:val="0"/>
-          <w:numId w:val="1032"/>
+          <w:numId w:val="1033"/>
         </w:numPr>
       </w:pPr>
       <w:r>
@@ -21135,7 +21214,7 @@
       <w:pPr>
         <w:numPr>
           <w:ilvl w:val="0"/>
-          <w:numId w:val="1032"/>
+          <w:numId w:val="1033"/>
         </w:numPr>
       </w:pPr>
       <w:r>
@@ -21185,7 +21264,7 @@
       <w:pPr>
         <w:numPr>
           <w:ilvl w:val="0"/>
-          <w:numId w:val="1032"/>
+          <w:numId w:val="1033"/>
         </w:numPr>
       </w:pPr>
       <w:r>
@@ -21196,7 +21275,7 @@
       <w:pPr>
         <w:numPr>
           <w:ilvl w:val="0"/>
-          <w:numId w:val="1032"/>
+          <w:numId w:val="1033"/>
         </w:numPr>
       </w:pPr>
       <w:r>
@@ -22927,34 +23006,7 @@
     <w:abstractNumId w:val="991"/>
   </w:num>
   <w:num w:numId="1024">
-    <w:abstractNumId w:val="99411"/>
-    <w:lvlOverride w:ilvl="0">
-      <w:startOverride w:val="1"/>
-    </w:lvlOverride>
-    <w:lvlOverride w:ilvl="1">
-      <w:startOverride w:val="1"/>
-    </w:lvlOverride>
-    <w:lvlOverride w:ilvl="2">
-      <w:startOverride w:val="1"/>
-    </w:lvlOverride>
-    <w:lvlOverride w:ilvl="3">
-      <w:startOverride w:val="1"/>
-    </w:lvlOverride>
-    <w:lvlOverride w:ilvl="4">
-      <w:startOverride w:val="1"/>
-    </w:lvlOverride>
-    <w:lvlOverride w:ilvl="5">
-      <w:startOverride w:val="1"/>
-    </w:lvlOverride>
-    <w:lvlOverride w:ilvl="6">
-      <w:startOverride w:val="1"/>
-    </w:lvlOverride>
-    <w:lvlOverride w:ilvl="7">
-      <w:startOverride w:val="1"/>
-    </w:lvlOverride>
-    <w:lvlOverride w:ilvl="8">
-      <w:startOverride w:val="1"/>
-    </w:lvlOverride>
+    <w:abstractNumId w:val="991"/>
   </w:num>
   <w:num w:numId="1025">
     <w:abstractNumId w:val="99411"/>
@@ -22987,18 +23039,6 @@
     </w:lvlOverride>
   </w:num>
   <w:num w:numId="1026">
-    <w:abstractNumId w:val="991"/>
-  </w:num>
-  <w:num w:numId="1027">
-    <w:abstractNumId w:val="991"/>
-  </w:num>
-  <w:num w:numId="1028">
-    <w:abstractNumId w:val="991"/>
-  </w:num>
-  <w:num w:numId="1029">
-    <w:abstractNumId w:val="991"/>
-  </w:num>
-  <w:num w:numId="1030">
     <w:abstractNumId w:val="99411"/>
     <w:lvlOverride w:ilvl="0">
       <w:startOverride w:val="1"/>
@@ -23028,10 +23068,52 @@
       <w:startOverride w:val="1"/>
     </w:lvlOverride>
   </w:num>
-  <w:num w:numId="1031">
+  <w:num w:numId="1027">
     <w:abstractNumId w:val="991"/>
   </w:num>
+  <w:num w:numId="1028">
+    <w:abstractNumId w:val="991"/>
+  </w:num>
+  <w:num w:numId="1029">
+    <w:abstractNumId w:val="991"/>
+  </w:num>
+  <w:num w:numId="1030">
+    <w:abstractNumId w:val="991"/>
+  </w:num>
+  <w:num w:numId="1031">
+    <w:abstractNumId w:val="99411"/>
+    <w:lvlOverride w:ilvl="0">
+      <w:startOverride w:val="1"/>
+    </w:lvlOverride>
+    <w:lvlOverride w:ilvl="1">
+      <w:startOverride w:val="1"/>
+    </w:lvlOverride>
+    <w:lvlOverride w:ilvl="2">
+      <w:startOverride w:val="1"/>
+    </w:lvlOverride>
+    <w:lvlOverride w:ilvl="3">
+      <w:startOverride w:val="1"/>
+    </w:lvlOverride>
+    <w:lvlOverride w:ilvl="4">
+      <w:startOverride w:val="1"/>
+    </w:lvlOverride>
+    <w:lvlOverride w:ilvl="5">
+      <w:startOverride w:val="1"/>
+    </w:lvlOverride>
+    <w:lvlOverride w:ilvl="6">
+      <w:startOverride w:val="1"/>
+    </w:lvlOverride>
+    <w:lvlOverride w:ilvl="7">
+      <w:startOverride w:val="1"/>
+    </w:lvlOverride>
+    <w:lvlOverride w:ilvl="8">
+      <w:startOverride w:val="1"/>
+    </w:lvlOverride>
+  </w:num>
   <w:num w:numId="1032">
+    <w:abstractNumId w:val="991"/>
+  </w:num>
+  <w:num w:numId="1033">
     <w:abstractNumId w:val="991"/>
   </w:num>
 </w:numbering>

</xml_diff>

<commit_message>
Add submission README, rejection-risk report, experiments index and numbered figure set
Final packaging: top-level manifest and Phase 42 decision, rejection-risk
report, experiment ID map, submission figure files named by manuscript
number, math-delimiter and cover-letter formatting fixes, literature matrix
update (JAWS, Papadopoulos 2011, Zhivkov 2026).

Co-Authored-By: Claude Opus 5.5 <noreply@anthropic.com>
Claude-Session: https://claude.ai/code/session_01GRaL3aKCgpJNtcS7frCXJ4
</commit_message>
<xml_diff>
--- a/Target_Journal_Submission/manuscript/Final_Manuscript.docx
+++ b/Target_Journal_Submission/manuscript/Final_Manuscript.docx
@@ -2812,7 +2812,7 @@
               <m:rPr>
                 <m:sty m:val="p"/>
               </m:rPr>
-              <m:t>\</m:t>
+              <m:t>∖</m:t>
             </m:r>
             <m:r>
               <m:rPr>
@@ -2884,7 +2884,7 @@
               <m:rPr>
                 <m:sty m:val="p"/>
               </m:rPr>
-              <m:t>\</m:t>
+              <m:t>∖</m:t>
             </m:r>
             <m:r>
               <m:rPr>
@@ -2940,63 +2940,18 @@
               <m:type m:val="bar"/>
             </m:fPr>
             <m:num>
-              <m:r>
-                <m:rPr>
-                  <m:sty m:val="p"/>
-                </m:rPr>
-                <m:t>|</m:t>
-              </m:r>
-              <m:sSub>
-                <m:e>
-                  <m:r>
-                    <m:t>y</m:t>
-                  </m:r>
-                </m:e>
-                <m:sub>
-                  <m:r>
-                    <m:t>i</m:t>
-                  </m:r>
-                </m:sub>
-              </m:sSub>
-              <m:r>
-                <m:rPr>
-                  <m:sty m:val="p"/>
-                </m:rPr>
-                <m:t>−</m:t>
-              </m:r>
-              <m:sSub>
-                <m:e>
-                  <m:r>
-                    <m:t>μ</m:t>
-                  </m:r>
-                </m:e>
-                <m:sub>
-                  <m:r>
-                    <m:rPr>
-                      <m:sty m:val="p"/>
-                    </m:rPr>
-                    <m:t>−</m:t>
-                  </m:r>
-                  <m:r>
-                    <m:t>i</m:t>
-                  </m:r>
-                </m:sub>
-              </m:sSub>
               <m:d>
                 <m:dPr>
-                  <m:begChr m:val="("/>
-                  <m:endChr m:val=")"/>
+                  <m:begChr m:val="|"/>
+                  <m:endChr m:val="|"/>
                   <m:sepChr m:val=""/>
                   <m:grow/>
                 </m:dPr>
                 <m:e>
-                  <m:sSubSup>
+                  <m:sSub>
                     <m:e>
                       <m:r>
-                        <m:rPr>
-                          <m:sty m:val="b"/>
-                        </m:rPr>
-                        <m:t>x</m:t>
+                        <m:t>y</m:t>
                       </m:r>
                     </m:e>
                     <m:sub>
@@ -3004,20 +2959,63 @@
                         <m:t>i</m:t>
                       </m:r>
                     </m:sub>
-                    <m:sup>
+                  </m:sSub>
+                  <m:r>
+                    <m:rPr>
+                      <m:sty m:val="p"/>
+                    </m:rPr>
+                    <m:t>−</m:t>
+                  </m:r>
+                  <m:sSub>
+                    <m:e>
                       <m:r>
-                        <m:t>T</m:t>
+                        <m:t>μ</m:t>
                       </m:r>
-                    </m:sup>
-                  </m:sSubSup>
+                    </m:e>
+                    <m:sub>
+                      <m:r>
+                        <m:rPr>
+                          <m:sty m:val="p"/>
+                        </m:rPr>
+                        <m:t>−</m:t>
+                      </m:r>
+                      <m:r>
+                        <m:t>i</m:t>
+                      </m:r>
+                    </m:sub>
+                  </m:sSub>
+                  <m:d>
+                    <m:dPr>
+                      <m:begChr m:val="("/>
+                      <m:endChr m:val=")"/>
+                      <m:sepChr m:val=""/>
+                      <m:grow/>
+                    </m:dPr>
+                    <m:e>
+                      <m:sSubSup>
+                        <m:e>
+                          <m:r>
+                            <m:rPr>
+                              <m:sty m:val="b"/>
+                            </m:rPr>
+                            <m:t>x</m:t>
+                          </m:r>
+                        </m:e>
+                        <m:sub>
+                          <m:r>
+                            <m:t>i</m:t>
+                          </m:r>
+                        </m:sub>
+                        <m:sup>
+                          <m:r>
+                            <m:t>T</m:t>
+                          </m:r>
+                        </m:sup>
+                      </m:sSubSup>
+                    </m:e>
+                  </m:d>
                 </m:e>
               </m:d>
-              <m:r>
-                <m:rPr>
-                  <m:sty m:val="p"/>
-                </m:rPr>
-                <m:t>|</m:t>
-              </m:r>
             </m:num>
             <m:den>
               <m:sSub>
@@ -4420,55 +4418,10 @@
           </m:rPr>
           <m:t>=</m:t>
         </m:r>
-        <m:r>
-          <m:rPr>
-            <m:sty m:val="p"/>
-          </m:rPr>
-          <m:t>|</m:t>
-        </m:r>
-        <m:sSub>
-          <m:e>
-            <m:r>
-              <m:t>y</m:t>
-            </m:r>
-          </m:e>
-          <m:sub>
-            <m:r>
-              <m:t>i</m:t>
-            </m:r>
-          </m:sub>
-        </m:sSub>
-        <m:r>
-          <m:rPr>
-            <m:sty m:val="p"/>
-          </m:rPr>
-          <m:t>−</m:t>
-        </m:r>
-        <m:sSub>
-          <m:e>
-            <m:r>
-              <m:t>μ</m:t>
-            </m:r>
-          </m:e>
-          <m:sub>
-            <m:r>
-              <m:rPr>
-                <m:sty m:val="p"/>
-              </m:rPr>
-              <m:t>−</m:t>
-            </m:r>
-            <m:r>
-              <m:t>i</m:t>
-            </m:r>
-            <m:r>
-              <m:t>j</m:t>
-            </m:r>
-          </m:sub>
-        </m:sSub>
         <m:d>
           <m:dPr>
-            <m:begChr m:val="("/>
-            <m:endChr m:val=")"/>
+            <m:begChr m:val="|"/>
+            <m:endChr m:val="|"/>
             <m:sepChr m:val=""/>
             <m:grow/>
           </m:dPr>
@@ -4476,10 +4429,7 @@
             <m:sSub>
               <m:e>
                 <m:r>
-                  <m:rPr>
-                    <m:sty m:val="b"/>
-                  </m:rPr>
-                  <m:t>x</m:t>
+                  <m:t>y</m:t>
                 </m:r>
               </m:e>
               <m:sub>
@@ -4488,14 +4438,60 @@
                 </m:r>
               </m:sub>
             </m:sSub>
+            <m:r>
+              <m:rPr>
+                <m:sty m:val="p"/>
+              </m:rPr>
+              <m:t>−</m:t>
+            </m:r>
+            <m:sSub>
+              <m:e>
+                <m:r>
+                  <m:t>μ</m:t>
+                </m:r>
+              </m:e>
+              <m:sub>
+                <m:r>
+                  <m:rPr>
+                    <m:sty m:val="p"/>
+                  </m:rPr>
+                  <m:t>−</m:t>
+                </m:r>
+                <m:r>
+                  <m:t>i</m:t>
+                </m:r>
+                <m:r>
+                  <m:t>j</m:t>
+                </m:r>
+              </m:sub>
+            </m:sSub>
+            <m:d>
+              <m:dPr>
+                <m:begChr m:val="("/>
+                <m:endChr m:val=")"/>
+                <m:sepChr m:val=""/>
+                <m:grow/>
+              </m:dPr>
+              <m:e>
+                <m:sSub>
+                  <m:e>
+                    <m:r>
+                      <m:rPr>
+                        <m:sty m:val="b"/>
+                      </m:rPr>
+                      <m:t>x</m:t>
+                    </m:r>
+                  </m:e>
+                  <m:sub>
+                    <m:r>
+                      <m:t>i</m:t>
+                    </m:r>
+                  </m:sub>
+                </m:sSub>
+              </m:e>
+            </m:d>
           </m:e>
         </m:d>
-        <m:r>
-          <m:rPr>
-            <m:sty m:val="p"/>
-          </m:rPr>
-          <m:t>|</m:t>
-        </m:r>
         <m:r>
           <m:rPr>
             <m:sty m:val="p"/>
@@ -18453,7 +18449,7 @@
           <m:rPr>
             <m:sty m:val="p"/>
           </m:rPr>
-          <m:t>\</m:t>
+          <m:t>∖</m:t>
         </m:r>
         <m:r>
           <m:rPr>
@@ -18522,66 +18518,18 @@
               <m:type m:val="bar"/>
             </m:fPr>
             <m:num>
-              <m:r>
-                <m:rPr>
-                  <m:sty m:val="p"/>
-                </m:rPr>
-                <m:t>|</m:t>
-              </m:r>
-              <m:sSub>
-                <m:e>
-                  <m:r>
-                    <m:t>y</m:t>
-                  </m:r>
-                </m:e>
-                <m:sub>
-                  <m:r>
-                    <m:t>i</m:t>
-                  </m:r>
-                </m:sub>
-              </m:sSub>
-              <m:r>
-                <m:rPr>
-                  <m:sty m:val="p"/>
-                </m:rPr>
-                <m:t>−</m:t>
-              </m:r>
-              <m:sSub>
-                <m:e>
-                  <m:r>
-                    <m:t>μ</m:t>
-                  </m:r>
-                </m:e>
-                <m:sub>
-                  <m:r>
-                    <m:rPr>
-                      <m:sty m:val="p"/>
-                    </m:rPr>
-                    <m:t>−</m:t>
-                  </m:r>
-                  <m:r>
-                    <m:t>i</m:t>
-                  </m:r>
-                  <m:r>
-                    <m:t>j</m:t>
-                  </m:r>
-                </m:sub>
-              </m:sSub>
               <m:d>
                 <m:dPr>
-                  <m:begChr m:val="("/>
-                  <m:endChr m:val=")"/>
+                  <m:begChr m:val="|"/>
+                  <m:endChr m:val="|"/>
                   <m:sepChr m:val=""/>
                   <m:grow/>
                 </m:dPr>
                 <m:e>
-                  <m:sSubSup>
+                  <m:sSub>
                     <m:e>
                       <m:r>
-                        <m:rPr>
-                          <m:sty m:val="b"/>
-                        </m:rPr>
-                        <m:t>x</m:t>
+                        <m:t>y</m:t>
                       </m:r>
                     </m:e>
                     <m:sub>
@@ -18589,20 +18537,66 @@
                         <m:t>i</m:t>
                       </m:r>
                     </m:sub>
-                    <m:sup>
+                  </m:sSub>
+                  <m:r>
+                    <m:rPr>
+                      <m:sty m:val="p"/>
+                    </m:rPr>
+                    <m:t>−</m:t>
+                  </m:r>
+                  <m:sSub>
+                    <m:e>
                       <m:r>
-                        <m:t>T</m:t>
+                        <m:t>μ</m:t>
                       </m:r>
-                    </m:sup>
-                  </m:sSubSup>
+                    </m:e>
+                    <m:sub>
+                      <m:r>
+                        <m:rPr>
+                          <m:sty m:val="p"/>
+                        </m:rPr>
+                        <m:t>−</m:t>
+                      </m:r>
+                      <m:r>
+                        <m:t>i</m:t>
+                      </m:r>
+                      <m:r>
+                        <m:t>j</m:t>
+                      </m:r>
+                    </m:sub>
+                  </m:sSub>
+                  <m:d>
+                    <m:dPr>
+                      <m:begChr m:val="("/>
+                      <m:endChr m:val=")"/>
+                      <m:sepChr m:val=""/>
+                      <m:grow/>
+                    </m:dPr>
+                    <m:e>
+                      <m:sSubSup>
+                        <m:e>
+                          <m:r>
+                            <m:rPr>
+                              <m:sty m:val="b"/>
+                            </m:rPr>
+                            <m:t>x</m:t>
+                          </m:r>
+                        </m:e>
+                        <m:sub>
+                          <m:r>
+                            <m:t>i</m:t>
+                          </m:r>
+                        </m:sub>
+                        <m:sup>
+                          <m:r>
+                            <m:t>T</m:t>
+                          </m:r>
+                        </m:sup>
+                      </m:sSubSup>
+                    </m:e>
+                  </m:d>
                 </m:e>
               </m:d>
-              <m:r>
-                <m:rPr>
-                  <m:sty m:val="p"/>
-                </m:rPr>
-                <m:t>|</m:t>
-              </m:r>
             </m:num>
             <m:den>
               <m:sSub>
@@ -18825,43 +18819,110 @@
         <w:t xml:space="preserve"> </w:t>
       </w:r>
       <m:oMath>
+        <m:d>
+          <m:dPr>
+            <m:begChr m:val="|"/>
+            <m:endChr m:val="|"/>
+            <m:sepChr m:val=""/>
+            <m:grow/>
+          </m:dPr>
+          <m:e>
+            <m:sSub>
+              <m:e>
+                <m:r>
+                  <m:t>y</m:t>
+                </m:r>
+              </m:e>
+              <m:sub>
+                <m:r>
+                  <m:t>m</m:t>
+                </m:r>
+                <m:r>
+                  <m:rPr>
+                    <m:sty m:val="p"/>
+                  </m:rPr>
+                  <m:t>+</m:t>
+                </m:r>
+                <m:r>
+                  <m:t>1</m:t>
+                </m:r>
+              </m:sub>
+            </m:sSub>
+            <m:r>
+              <m:rPr>
+                <m:sty m:val="p"/>
+              </m:rPr>
+              <m:t>−</m:t>
+            </m:r>
+            <m:sSub>
+              <m:e>
+                <m:r>
+                  <m:t>μ</m:t>
+                </m:r>
+              </m:e>
+              <m:sub>
+                <m:r>
+                  <m:rPr>
+                    <m:sty m:val="p"/>
+                  </m:rPr>
+                  <m:t>−</m:t>
+                </m:r>
+                <m:r>
+                  <m:t>i</m:t>
+                </m:r>
+              </m:sub>
+            </m:sSub>
+            <m:d>
+              <m:dPr>
+                <m:begChr m:val="("/>
+                <m:endChr m:val=")"/>
+                <m:sepChr m:val=""/>
+                <m:grow/>
+              </m:dPr>
+              <m:e>
+                <m:sSubSup>
+                  <m:e>
+                    <m:r>
+                      <m:rPr>
+                        <m:sty m:val="b"/>
+                      </m:rPr>
+                      <m:t>x</m:t>
+                    </m:r>
+                  </m:e>
+                  <m:sub>
+                    <m:r>
+                      <m:t>m</m:t>
+                    </m:r>
+                    <m:r>
+                      <m:rPr>
+                        <m:sty m:val="p"/>
+                      </m:rPr>
+                      <m:t>+</m:t>
+                    </m:r>
+                    <m:r>
+                      <m:t>1</m:t>
+                    </m:r>
+                  </m:sub>
+                  <m:sup>
+                    <m:r>
+                      <m:t>T</m:t>
+                    </m:r>
+                  </m:sup>
+                </m:sSubSup>
+              </m:e>
+            </m:d>
+          </m:e>
+        </m:d>
         <m:r>
           <m:rPr>
             <m:sty m:val="p"/>
           </m:rPr>
-          <m:t>|</m:t>
+          <m:t>/</m:t>
         </m:r>
         <m:sSub>
           <m:e>
             <m:r>
-              <m:t>y</m:t>
-            </m:r>
-          </m:e>
-          <m:sub>
-            <m:r>
-              <m:t>m</m:t>
-            </m:r>
-            <m:r>
-              <m:rPr>
-                <m:sty m:val="p"/>
-              </m:rPr>
-              <m:t>+</m:t>
-            </m:r>
-            <m:r>
-              <m:t>1</m:t>
-            </m:r>
-          </m:sub>
-        </m:sSub>
-        <m:r>
-          <m:rPr>
-            <m:sty m:val="p"/>
-          </m:rPr>
-          <m:t>−</m:t>
-        </m:r>
-        <m:sSub>
-          <m:e>
-            <m:r>
-              <m:t>μ</m:t>
+              <m:t>σ</m:t>
             </m:r>
           </m:e>
           <m:sub>
@@ -18919,18 +18980,86 @@
           <m:rPr>
             <m:sty m:val="p"/>
           </m:rPr>
-          <m:t>|</m:t>
-        </m:r>
+          <m:t>=</m:t>
+        </m:r>
+        <m:sSub>
+          <m:e>
+            <m:r>
+              <m:t>R</m:t>
+            </m:r>
+          </m:e>
+          <m:sub>
+            <m:r>
+              <m:t>m</m:t>
+            </m:r>
+            <m:r>
+              <m:rPr>
+                <m:sty m:val="p"/>
+              </m:rPr>
+              <m:t>+</m:t>
+            </m:r>
+            <m:r>
+              <m:t>1</m:t>
+            </m:r>
+            <m:r>
+              <m:rPr>
+                <m:sty m:val="p"/>
+              </m:rPr>
+              <m:t>,</m:t>
+            </m:r>
+            <m:r>
+              <m:t>i</m:t>
+            </m:r>
+          </m:sub>
+        </m:sSub>
+      </m:oMath>
+      <w:r>
+        <w:t xml:space="preserve">.</w:t>
+      </w:r>
+    </w:p>
+    <w:p>
+      <w:pPr>
+        <w:pStyle w:val="BodyText"/>
+      </w:pPr>
+      <w:r>
+        <w:rPr>
+          <w:bCs/>
+          <w:b/>
+        </w:rPr>
+        <w:t xml:space="preserve">Step 2 (miscoverage implies many lost comparisons).</w:t>
+      </w:r>
+      <w:r>
+        <w:t xml:space="preserve"> </w:t>
+      </w:r>
+      <w:r>
+        <w:t xml:space="preserve">Let</w:t>
+      </w:r>
+      <w:r>
+        <w:t xml:space="preserve"> </w:t>
+      </w:r>
+      <m:oMath>
+        <m:sSub>
+          <m:e>
+            <m:r>
+              <m:t>U</m:t>
+            </m:r>
+          </m:e>
+          <m:sub>
+            <m:r>
+              <m:t>i</m:t>
+            </m:r>
+          </m:sub>
+        </m:sSub>
         <m:r>
           <m:rPr>
             <m:sty m:val="p"/>
           </m:rPr>
-          <m:t>/</m:t>
+          <m:t>=</m:t>
         </m:r>
         <m:sSub>
           <m:e>
             <m:r>
-              <m:t>σ</m:t>
+              <m:t>μ</m:t>
             </m:r>
           </m:e>
           <m:sub>
@@ -18953,13 +19082,787 @@
             <m:grow/>
           </m:dPr>
           <m:e>
-            <m:sSubSup>
+            <m:r>
+              <m:rPr>
+                <m:sty m:val="b"/>
+              </m:rPr>
+              <m:t>x</m:t>
+            </m:r>
+          </m:e>
+        </m:d>
+        <m:r>
+          <m:rPr>
+            <m:sty m:val="p"/>
+          </m:rPr>
+          <m:t>+</m:t>
+        </m:r>
+        <m:sSub>
+          <m:e>
+            <m:r>
+              <m:t>σ</m:t>
+            </m:r>
+          </m:e>
+          <m:sub>
+            <m:r>
+              <m:rPr>
+                <m:sty m:val="p"/>
+              </m:rPr>
+              <m:t>−</m:t>
+            </m:r>
+            <m:r>
+              <m:t>i</m:t>
+            </m:r>
+          </m:sub>
+        </m:sSub>
+        <m:d>
+          <m:dPr>
+            <m:begChr m:val="("/>
+            <m:endChr m:val=")"/>
+            <m:sepChr m:val=""/>
+            <m:grow/>
+          </m:dPr>
+          <m:e>
+            <m:r>
+              <m:rPr>
+                <m:sty m:val="b"/>
+              </m:rPr>
+              <m:t>x</m:t>
+            </m:r>
+          </m:e>
+        </m:d>
+        <m:sSub>
+          <m:e>
+            <m:r>
+              <m:t>R</m:t>
+            </m:r>
+          </m:e>
+          <m:sub>
+            <m:r>
+              <m:t>i</m:t>
+            </m:r>
+          </m:sub>
+        </m:sSub>
+      </m:oMath>
+      <w:r>
+        <w:t xml:space="preserve"> </w:t>
+      </w:r>
+      <w:r>
+        <w:t xml:space="preserve">and</w:t>
+      </w:r>
+      <w:r>
+        <w:t xml:space="preserve"> </w:t>
+      </w:r>
+      <m:oMath>
+        <m:sSub>
+          <m:e>
+            <m:r>
+              <m:t>L</m:t>
+            </m:r>
+          </m:e>
+          <m:sub>
+            <m:r>
+              <m:t>i</m:t>
+            </m:r>
+          </m:sub>
+        </m:sSub>
+        <m:r>
+          <m:rPr>
+            <m:sty m:val="p"/>
+          </m:rPr>
+          <m:t>=</m:t>
+        </m:r>
+        <m:sSub>
+          <m:e>
+            <m:r>
+              <m:t>μ</m:t>
+            </m:r>
+          </m:e>
+          <m:sub>
+            <m:r>
+              <m:rPr>
+                <m:sty m:val="p"/>
+              </m:rPr>
+              <m:t>−</m:t>
+            </m:r>
+            <m:r>
+              <m:t>i</m:t>
+            </m:r>
+          </m:sub>
+        </m:sSub>
+        <m:d>
+          <m:dPr>
+            <m:begChr m:val="("/>
+            <m:endChr m:val=")"/>
+            <m:sepChr m:val=""/>
+            <m:grow/>
+          </m:dPr>
+          <m:e>
+            <m:r>
+              <m:rPr>
+                <m:sty m:val="b"/>
+              </m:rPr>
+              <m:t>x</m:t>
+            </m:r>
+          </m:e>
+        </m:d>
+        <m:r>
+          <m:rPr>
+            <m:sty m:val="p"/>
+          </m:rPr>
+          <m:t>−</m:t>
+        </m:r>
+        <m:sSub>
+          <m:e>
+            <m:r>
+              <m:t>σ</m:t>
+            </m:r>
+          </m:e>
+          <m:sub>
+            <m:r>
+              <m:rPr>
+                <m:sty m:val="p"/>
+              </m:rPr>
+              <m:t>−</m:t>
+            </m:r>
+            <m:r>
+              <m:t>i</m:t>
+            </m:r>
+          </m:sub>
+        </m:sSub>
+        <m:d>
+          <m:dPr>
+            <m:begChr m:val="("/>
+            <m:endChr m:val=")"/>
+            <m:sepChr m:val=""/>
+            <m:grow/>
+          </m:dPr>
+          <m:e>
+            <m:r>
+              <m:rPr>
+                <m:sty m:val="b"/>
+              </m:rPr>
+              <m:t>x</m:t>
+            </m:r>
+          </m:e>
+        </m:d>
+        <m:sSub>
+          <m:e>
+            <m:r>
+              <m:t>R</m:t>
+            </m:r>
+          </m:e>
+          <m:sub>
+            <m:r>
+              <m:t>i</m:t>
+            </m:r>
+          </m:sub>
+        </m:sSub>
+      </m:oMath>
+      <w:r>
+        <w:t xml:space="preserve"> </w:t>
+      </w:r>
+      <w:r>
+        <w:t xml:space="preserve">with</w:t>
+      </w:r>
+      <w:r>
+        <w:t xml:space="preserve"> </w:t>
+      </w:r>
+      <m:oMath>
+        <m:r>
+          <m:rPr>
+            <m:sty m:val="b"/>
+          </m:rPr>
+          <m:t>x</m:t>
+        </m:r>
+        <m:r>
+          <m:rPr>
+            <m:sty m:val="p"/>
+          </m:rPr>
+          <m:t>=</m:t>
+        </m:r>
+        <m:sSubSup>
+          <m:e>
+            <m:r>
+              <m:rPr>
+                <m:sty m:val="b"/>
+              </m:rPr>
+              <m:t>x</m:t>
+            </m:r>
+          </m:e>
+          <m:sub>
+            <m:r>
+              <m:t>m</m:t>
+            </m:r>
+            <m:r>
+              <m:rPr>
+                <m:sty m:val="p"/>
+              </m:rPr>
+              <m:t>+</m:t>
+            </m:r>
+            <m:r>
+              <m:t>1</m:t>
+            </m:r>
+          </m:sub>
+          <m:sup>
+            <m:r>
+              <m:t>T</m:t>
+            </m:r>
+          </m:sup>
+        </m:sSubSup>
+      </m:oMath>
+      <w:r>
+        <w:t xml:space="preserve">.</w:t>
+      </w:r>
+    </w:p>
+    <w:p>
+      <w:pPr>
+        <w:numPr>
+          <w:ilvl w:val="0"/>
+          <w:numId w:val="1032"/>
+        </w:numPr>
+      </w:pPr>
+      <w:r>
+        <w:rPr>
+          <w:iCs/>
+          <w:i/>
+        </w:rPr>
+        <w:t xml:space="preserve">Upper tail.</w:t>
+      </w:r>
+      <w:r>
+        <w:t xml:space="preserve"> </w:t>
+      </w:r>
+      <w:r>
+        <w:t xml:space="preserve">If</w:t>
+      </w:r>
+      <w:r>
+        <w:t xml:space="preserve"> </w:t>
+      </w:r>
+      <m:oMath>
+        <m:sSub>
+          <m:e>
+            <m:r>
+              <m:t>y</m:t>
+            </m:r>
+          </m:e>
+          <m:sub>
+            <m:r>
+              <m:t>m</m:t>
+            </m:r>
+            <m:r>
+              <m:rPr>
+                <m:sty m:val="p"/>
+              </m:rPr>
+              <m:t>+</m:t>
+            </m:r>
+            <m:r>
+              <m:t>1</m:t>
+            </m:r>
+          </m:sub>
+        </m:sSub>
+      </m:oMath>
+      <w:r>
+        <w:t xml:space="preserve"> </w:t>
+      </w:r>
+      <w:r>
+        <w:t xml:space="preserve">exceeds the upper bound in Eq. (4), the</w:t>
+      </w:r>
+      <w:r>
+        <w:t xml:space="preserve"> </w:t>
+      </w:r>
+      <m:oMath>
+        <m:r>
+          <m:rPr>
+            <m:sty m:val="p"/>
+          </m:rPr>
+          <m:t>⌈</m:t>
+        </m:r>
+        <m:d>
+          <m:dPr>
+            <m:begChr m:val="("/>
+            <m:endChr m:val=")"/>
+            <m:sepChr m:val=""/>
+            <m:grow/>
+          </m:dPr>
+          <m:e>
+            <m:r>
+              <m:t>1</m:t>
+            </m:r>
+            <m:r>
+              <m:rPr>
+                <m:sty m:val="p"/>
+              </m:rPr>
+              <m:t>−</m:t>
+            </m:r>
+            <m:r>
+              <m:t>α</m:t>
+            </m:r>
+          </m:e>
+        </m:d>
+        <m:d>
+          <m:dPr>
+            <m:begChr m:val="("/>
+            <m:endChr m:val=")"/>
+            <m:sepChr m:val=""/>
+            <m:grow/>
+          </m:dPr>
+          <m:e>
+            <m:r>
+              <m:t>m</m:t>
+            </m:r>
+            <m:r>
+              <m:rPr>
+                <m:sty m:val="p"/>
+              </m:rPr>
+              <m:t>+</m:t>
+            </m:r>
+            <m:r>
+              <m:t>1</m:t>
+            </m:r>
+          </m:e>
+        </m:d>
+        <m:r>
+          <m:rPr>
+            <m:sty m:val="p"/>
+          </m:rPr>
+          <m:t>⌉</m:t>
+        </m:r>
+      </m:oMath>
+      <w:r>
+        <w:t xml:space="preserve">-th smallest</w:t>
+      </w:r>
+      <w:r>
+        <w:t xml:space="preserve"> </w:t>
+      </w:r>
+      <m:oMath>
+        <m:sSub>
+          <m:e>
+            <m:r>
+              <m:t>U</m:t>
+            </m:r>
+          </m:e>
+          <m:sub>
+            <m:r>
+              <m:t>i</m:t>
+            </m:r>
+          </m:sub>
+        </m:sSub>
+      </m:oMath>
+      <w:r>
+        <w:t xml:space="preserve">, then</w:t>
+      </w:r>
+      <w:r>
+        <w:t xml:space="preserve"> </w:t>
+      </w:r>
+      <m:oMath>
+        <m:sSub>
+          <m:e>
+            <m:r>
+              <m:t>y</m:t>
+            </m:r>
+          </m:e>
+          <m:sub>
+            <m:r>
+              <m:t>m</m:t>
+            </m:r>
+            <m:r>
+              <m:rPr>
+                <m:sty m:val="p"/>
+              </m:rPr>
+              <m:t>+</m:t>
+            </m:r>
+            <m:r>
+              <m:t>1</m:t>
+            </m:r>
+          </m:sub>
+        </m:sSub>
+        <m:r>
+          <m:rPr>
+            <m:sty m:val="p"/>
+          </m:rPr>
+          <m:t>&gt;</m:t>
+        </m:r>
+        <m:sSub>
+          <m:e>
+            <m:r>
+              <m:t>U</m:t>
+            </m:r>
+          </m:e>
+          <m:sub>
+            <m:r>
+              <m:t>i</m:t>
+            </m:r>
+          </m:sub>
+        </m:sSub>
+      </m:oMath>
+      <w:r>
+        <w:t xml:space="preserve"> </w:t>
+      </w:r>
+      <w:r>
+        <w:t xml:space="preserve">for at least</w:t>
+      </w:r>
+      <w:r>
+        <w:t xml:space="preserve"> </w:t>
+      </w:r>
+      <m:oMath>
+        <m:d>
+          <m:dPr>
+            <m:begChr m:val="("/>
+            <m:endChr m:val=")"/>
+            <m:sepChr m:val=""/>
+            <m:grow/>
+          </m:dPr>
+          <m:e>
+            <m:r>
+              <m:t>1</m:t>
+            </m:r>
+            <m:r>
+              <m:rPr>
+                <m:sty m:val="p"/>
+              </m:rPr>
+              <m:t>−</m:t>
+            </m:r>
+            <m:r>
+              <m:t>α</m:t>
+            </m:r>
+          </m:e>
+        </m:d>
+        <m:d>
+          <m:dPr>
+            <m:begChr m:val="("/>
+            <m:endChr m:val=")"/>
+            <m:sepChr m:val=""/>
+            <m:grow/>
+          </m:dPr>
+          <m:e>
+            <m:r>
+              <m:t>m</m:t>
+            </m:r>
+            <m:r>
+              <m:rPr>
+                <m:sty m:val="p"/>
+              </m:rPr>
+              <m:t>+</m:t>
+            </m:r>
+            <m:r>
+              <m:t>1</m:t>
+            </m:r>
+          </m:e>
+        </m:d>
+      </m:oMath>
+      <w:r>
+        <w:t xml:space="preserve"> </w:t>
+      </w:r>
+      <w:r>
+        <w:t xml:space="preserve">indices</w:t>
+      </w:r>
+      <w:r>
+        <w:t xml:space="preserve"> </w:t>
+      </w:r>
+      <m:oMath>
+        <m:r>
+          <m:t>i</m:t>
+        </m:r>
+      </m:oMath>
+      <w:r>
+        <w:t xml:space="preserve">.</w:t>
+      </w:r>
+    </w:p>
+    <w:p>
+      <w:pPr>
+        <w:numPr>
+          <w:ilvl w:val="0"/>
+          <w:numId w:val="1032"/>
+        </w:numPr>
+      </w:pPr>
+      <w:r>
+        <w:rPr>
+          <w:iCs/>
+          <w:i/>
+        </w:rPr>
+        <w:t xml:space="preserve">Lower tail.</w:t>
+      </w:r>
+      <w:r>
+        <w:t xml:space="preserve"> </w:t>
+      </w:r>
+      <w:r>
+        <w:t xml:space="preserve">If</w:t>
+      </w:r>
+      <w:r>
+        <w:t xml:space="preserve"> </w:t>
+      </w:r>
+      <m:oMath>
+        <m:sSub>
+          <m:e>
+            <m:r>
+              <m:t>y</m:t>
+            </m:r>
+          </m:e>
+          <m:sub>
+            <m:r>
+              <m:t>m</m:t>
+            </m:r>
+            <m:r>
+              <m:rPr>
+                <m:sty m:val="p"/>
+              </m:rPr>
+              <m:t>+</m:t>
+            </m:r>
+            <m:r>
+              <m:t>1</m:t>
+            </m:r>
+          </m:sub>
+        </m:sSub>
+      </m:oMath>
+      <w:r>
+        <w:t xml:space="preserve"> </w:t>
+      </w:r>
+      <w:r>
+        <w:t xml:space="preserve">is below the lower bound, the</w:t>
+      </w:r>
+      <w:r>
+        <w:t xml:space="preserve"> </w:t>
+      </w:r>
+      <m:oMath>
+        <m:r>
+          <m:t>k</m:t>
+        </m:r>
+      </m:oMath>
+      <w:r>
+        <w:t xml:space="preserve">-th smallest</w:t>
+      </w:r>
+      <w:r>
+        <w:t xml:space="preserve"> </w:t>
+      </w:r>
+      <m:oMath>
+        <m:sSub>
+          <m:e>
+            <m:r>
+              <m:t>L</m:t>
+            </m:r>
+          </m:e>
+          <m:sub>
+            <m:r>
+              <m:t>i</m:t>
+            </m:r>
+          </m:sub>
+        </m:sSub>
+      </m:oMath>
+      <w:r>
+        <w:t xml:space="preserve"> </w:t>
+      </w:r>
+      <w:r>
+        <w:t xml:space="preserve">with</w:t>
+      </w:r>
+      <w:r>
+        <w:t xml:space="preserve"> </w:t>
+      </w:r>
+      <m:oMath>
+        <m:r>
+          <m:t>k</m:t>
+        </m:r>
+        <m:r>
+          <m:rPr>
+            <m:sty m:val="p"/>
+          </m:rPr>
+          <m:t>=</m:t>
+        </m:r>
+        <m:r>
+          <m:rPr>
+            <m:sty m:val="p"/>
+          </m:rPr>
+          <m:t>⌊</m:t>
+        </m:r>
+        <m:r>
+          <m:t>α</m:t>
+        </m:r>
+        <m:d>
+          <m:dPr>
+            <m:begChr m:val="("/>
+            <m:endChr m:val=")"/>
+            <m:sepChr m:val=""/>
+            <m:grow/>
+          </m:dPr>
+          <m:e>
+            <m:r>
+              <m:t>m</m:t>
+            </m:r>
+            <m:r>
+              <m:rPr>
+                <m:sty m:val="p"/>
+              </m:rPr>
+              <m:t>+</m:t>
+            </m:r>
+            <m:r>
+              <m:t>1</m:t>
+            </m:r>
+          </m:e>
+        </m:d>
+        <m:r>
+          <m:rPr>
+            <m:sty m:val="p"/>
+          </m:rPr>
+          <m:t>⌋</m:t>
+        </m:r>
+      </m:oMath>
+      <w:r>
+        <w:t xml:space="preserve">, then</w:t>
+      </w:r>
+      <w:r>
+        <w:t xml:space="preserve"> </w:t>
+      </w:r>
+      <m:oMath>
+        <m:sSub>
+          <m:e>
+            <m:r>
+              <m:t>y</m:t>
+            </m:r>
+          </m:e>
+          <m:sub>
+            <m:r>
+              <m:t>m</m:t>
+            </m:r>
+            <m:r>
+              <m:rPr>
+                <m:sty m:val="p"/>
+              </m:rPr>
+              <m:t>+</m:t>
+            </m:r>
+            <m:r>
+              <m:t>1</m:t>
+            </m:r>
+          </m:sub>
+        </m:sSub>
+        <m:r>
+          <m:rPr>
+            <m:sty m:val="p"/>
+          </m:rPr>
+          <m:t>&lt;</m:t>
+        </m:r>
+        <m:sSub>
+          <m:e>
+            <m:r>
+              <m:t>L</m:t>
+            </m:r>
+          </m:e>
+          <m:sub>
+            <m:r>
+              <m:t>i</m:t>
+            </m:r>
+          </m:sub>
+        </m:sSub>
+      </m:oMath>
+      <w:r>
+        <w:t xml:space="preserve"> </w:t>
+      </w:r>
+      <w:r>
+        <w:t xml:space="preserve">for at least</w:t>
+      </w:r>
+      <w:r>
+        <w:t xml:space="preserve"> </w:t>
+      </w:r>
+      <m:oMath>
+        <m:r>
+          <m:t>m</m:t>
+        </m:r>
+        <m:r>
+          <m:rPr>
+            <m:sty m:val="p"/>
+          </m:rPr>
+          <m:t>−</m:t>
+        </m:r>
+        <m:r>
+          <m:t>k</m:t>
+        </m:r>
+        <m:r>
+          <m:rPr>
+            <m:sty m:val="p"/>
+          </m:rPr>
+          <m:t>+</m:t>
+        </m:r>
+        <m:r>
+          <m:t>1</m:t>
+        </m:r>
+        <m:r>
+          <m:rPr>
+            <m:sty m:val="p"/>
+          </m:rPr>
+          <m:t>≥</m:t>
+        </m:r>
+        <m:d>
+          <m:dPr>
+            <m:begChr m:val="("/>
+            <m:endChr m:val=")"/>
+            <m:sepChr m:val=""/>
+            <m:grow/>
+          </m:dPr>
+          <m:e>
+            <m:r>
+              <m:t>1</m:t>
+            </m:r>
+            <m:r>
+              <m:rPr>
+                <m:sty m:val="p"/>
+              </m:rPr>
+              <m:t>−</m:t>
+            </m:r>
+            <m:r>
+              <m:t>α</m:t>
+            </m:r>
+          </m:e>
+        </m:d>
+        <m:d>
+          <m:dPr>
+            <m:begChr m:val="("/>
+            <m:endChr m:val=")"/>
+            <m:sepChr m:val=""/>
+            <m:grow/>
+          </m:dPr>
+          <m:e>
+            <m:r>
+              <m:t>m</m:t>
+            </m:r>
+            <m:r>
+              <m:rPr>
+                <m:sty m:val="p"/>
+              </m:rPr>
+              <m:t>+</m:t>
+            </m:r>
+            <m:r>
+              <m:t>1</m:t>
+            </m:r>
+          </m:e>
+        </m:d>
+      </m:oMath>
+      <w:r>
+        <w:t xml:space="preserve"> </w:t>
+      </w:r>
+      <w:r>
+        <w:t xml:space="preserve">indices.</w:t>
+      </w:r>
+    </w:p>
+    <w:p>
+      <w:pPr>
+        <w:pStyle w:val="FirstParagraph"/>
+      </w:pPr>
+      <w:r>
+        <w:t xml:space="preserve">In both cases</w:t>
+      </w:r>
+      <w:r>
+        <w:t xml:space="preserve"> </w:t>
+      </w:r>
+      <m:oMath>
+        <m:d>
+          <m:dPr>
+            <m:begChr m:val="|"/>
+            <m:endChr m:val="|"/>
+            <m:sepChr m:val=""/>
+            <m:grow/>
+          </m:dPr>
+          <m:e>
+            <m:sSub>
               <m:e>
                 <m:r>
-                  <m:rPr>
-                    <m:sty m:val="b"/>
-                  </m:rPr>
-                  <m:t>x</m:t>
+                  <m:t>y</m:t>
                 </m:r>
               </m:e>
               <m:sub>
@@ -18976,962 +19879,49 @@
                   <m:t>1</m:t>
                 </m:r>
               </m:sub>
-              <m:sup>
-                <m:r>
-                  <m:t>T</m:t>
-                </m:r>
-              </m:sup>
-            </m:sSubSup>
-          </m:e>
-        </m:d>
-        <m:r>
-          <m:rPr>
-            <m:sty m:val="p"/>
-          </m:rPr>
-          <m:t>=</m:t>
-        </m:r>
-        <m:sSub>
-          <m:e>
-            <m:r>
-              <m:t>R</m:t>
-            </m:r>
-          </m:e>
-          <m:sub>
-            <m:r>
-              <m:t>m</m:t>
-            </m:r>
-            <m:r>
-              <m:rPr>
-                <m:sty m:val="p"/>
-              </m:rPr>
-              <m:t>+</m:t>
-            </m:r>
-            <m:r>
-              <m:t>1</m:t>
-            </m:r>
-            <m:r>
-              <m:rPr>
-                <m:sty m:val="p"/>
-              </m:rPr>
-              <m:t>,</m:t>
-            </m:r>
-            <m:r>
-              <m:t>i</m:t>
-            </m:r>
-          </m:sub>
-        </m:sSub>
-      </m:oMath>
-      <w:r>
-        <w:t xml:space="preserve">.</w:t>
-      </w:r>
-    </w:p>
-    <w:p>
-      <w:pPr>
-        <w:pStyle w:val="BodyText"/>
-      </w:pPr>
-      <w:r>
-        <w:rPr>
-          <w:bCs/>
-          <w:b/>
-        </w:rPr>
-        <w:t xml:space="preserve">Step 2 (miscoverage implies many lost comparisons).</w:t>
-      </w:r>
-      <w:r>
-        <w:t xml:space="preserve"> </w:t>
-      </w:r>
-      <w:r>
-        <w:t xml:space="preserve">Let</w:t>
-      </w:r>
-      <w:r>
-        <w:t xml:space="preserve"> </w:t>
-      </w:r>
-      <m:oMath>
-        <m:sSub>
-          <m:e>
-            <m:r>
-              <m:t>U</m:t>
-            </m:r>
-          </m:e>
-          <m:sub>
-            <m:r>
-              <m:t>i</m:t>
-            </m:r>
-          </m:sub>
-        </m:sSub>
-        <m:r>
-          <m:rPr>
-            <m:sty m:val="p"/>
-          </m:rPr>
-          <m:t>=</m:t>
-        </m:r>
-        <m:sSub>
-          <m:e>
-            <m:r>
-              <m:t>μ</m:t>
-            </m:r>
-          </m:e>
-          <m:sub>
+            </m:sSub>
             <m:r>
               <m:rPr>
                 <m:sty m:val="p"/>
               </m:rPr>
               <m:t>−</m:t>
             </m:r>
-            <m:r>
-              <m:t>i</m:t>
-            </m:r>
-          </m:sub>
-        </m:sSub>
-        <m:d>
-          <m:dPr>
-            <m:begChr m:val="("/>
-            <m:endChr m:val=")"/>
-            <m:sepChr m:val=""/>
-            <m:grow/>
-          </m:dPr>
-          <m:e>
-            <m:r>
-              <m:rPr>
-                <m:sty m:val="b"/>
-              </m:rPr>
-              <m:t>x</m:t>
-            </m:r>
+            <m:sSub>
+              <m:e>
+                <m:r>
+                  <m:t>μ</m:t>
+                </m:r>
+              </m:e>
+              <m:sub>
+                <m:r>
+                  <m:rPr>
+                    <m:sty m:val="p"/>
+                  </m:rPr>
+                  <m:t>−</m:t>
+                </m:r>
+                <m:r>
+                  <m:t>i</m:t>
+                </m:r>
+              </m:sub>
+            </m:sSub>
+            <m:d>
+              <m:dPr>
+                <m:begChr m:val="("/>
+                <m:endChr m:val=")"/>
+                <m:sepChr m:val=""/>
+                <m:grow/>
+              </m:dPr>
+              <m:e>
+                <m:r>
+                  <m:rPr>
+                    <m:sty m:val="b"/>
+                  </m:rPr>
+                  <m:t>x</m:t>
+                </m:r>
+              </m:e>
+            </m:d>
           </m:e>
         </m:d>
-        <m:r>
-          <m:rPr>
-            <m:sty m:val="p"/>
-          </m:rPr>
-          <m:t>+</m:t>
-        </m:r>
-        <m:sSub>
-          <m:e>
-            <m:r>
-              <m:t>σ</m:t>
-            </m:r>
-          </m:e>
-          <m:sub>
-            <m:r>
-              <m:rPr>
-                <m:sty m:val="p"/>
-              </m:rPr>
-              <m:t>−</m:t>
-            </m:r>
-            <m:r>
-              <m:t>i</m:t>
-            </m:r>
-          </m:sub>
-        </m:sSub>
-        <m:d>
-          <m:dPr>
-            <m:begChr m:val="("/>
-            <m:endChr m:val=")"/>
-            <m:sepChr m:val=""/>
-            <m:grow/>
-          </m:dPr>
-          <m:e>
-            <m:r>
-              <m:rPr>
-                <m:sty m:val="b"/>
-              </m:rPr>
-              <m:t>x</m:t>
-            </m:r>
-          </m:e>
-        </m:d>
-        <m:sSub>
-          <m:e>
-            <m:r>
-              <m:t>R</m:t>
-            </m:r>
-          </m:e>
-          <m:sub>
-            <m:r>
-              <m:t>i</m:t>
-            </m:r>
-          </m:sub>
-        </m:sSub>
-      </m:oMath>
-      <w:r>
-        <w:t xml:space="preserve"> </w:t>
-      </w:r>
-      <w:r>
-        <w:t xml:space="preserve">and</w:t>
-      </w:r>
-      <w:r>
-        <w:t xml:space="preserve"> </w:t>
-      </w:r>
-      <m:oMath>
-        <m:sSub>
-          <m:e>
-            <m:r>
-              <m:t>L</m:t>
-            </m:r>
-          </m:e>
-          <m:sub>
-            <m:r>
-              <m:t>i</m:t>
-            </m:r>
-          </m:sub>
-        </m:sSub>
-        <m:r>
-          <m:rPr>
-            <m:sty m:val="p"/>
-          </m:rPr>
-          <m:t>=</m:t>
-        </m:r>
-        <m:sSub>
-          <m:e>
-            <m:r>
-              <m:t>μ</m:t>
-            </m:r>
-          </m:e>
-          <m:sub>
-            <m:r>
-              <m:rPr>
-                <m:sty m:val="p"/>
-              </m:rPr>
-              <m:t>−</m:t>
-            </m:r>
-            <m:r>
-              <m:t>i</m:t>
-            </m:r>
-          </m:sub>
-        </m:sSub>
-        <m:d>
-          <m:dPr>
-            <m:begChr m:val="("/>
-            <m:endChr m:val=")"/>
-            <m:sepChr m:val=""/>
-            <m:grow/>
-          </m:dPr>
-          <m:e>
-            <m:r>
-              <m:rPr>
-                <m:sty m:val="b"/>
-              </m:rPr>
-              <m:t>x</m:t>
-            </m:r>
-          </m:e>
-        </m:d>
-        <m:r>
-          <m:rPr>
-            <m:sty m:val="p"/>
-          </m:rPr>
-          <m:t>−</m:t>
-        </m:r>
-        <m:sSub>
-          <m:e>
-            <m:r>
-              <m:t>σ</m:t>
-            </m:r>
-          </m:e>
-          <m:sub>
-            <m:r>
-              <m:rPr>
-                <m:sty m:val="p"/>
-              </m:rPr>
-              <m:t>−</m:t>
-            </m:r>
-            <m:r>
-              <m:t>i</m:t>
-            </m:r>
-          </m:sub>
-        </m:sSub>
-        <m:d>
-          <m:dPr>
-            <m:begChr m:val="("/>
-            <m:endChr m:val=")"/>
-            <m:sepChr m:val=""/>
-            <m:grow/>
-          </m:dPr>
-          <m:e>
-            <m:r>
-              <m:rPr>
-                <m:sty m:val="b"/>
-              </m:rPr>
-              <m:t>x</m:t>
-            </m:r>
-          </m:e>
-        </m:d>
-        <m:sSub>
-          <m:e>
-            <m:r>
-              <m:t>R</m:t>
-            </m:r>
-          </m:e>
-          <m:sub>
-            <m:r>
-              <m:t>i</m:t>
-            </m:r>
-          </m:sub>
-        </m:sSub>
-      </m:oMath>
-      <w:r>
-        <w:t xml:space="preserve"> </w:t>
-      </w:r>
-      <w:r>
-        <w:t xml:space="preserve">with</w:t>
-      </w:r>
-      <w:r>
-        <w:t xml:space="preserve"> </w:t>
-      </w:r>
-      <m:oMath>
-        <m:r>
-          <m:rPr>
-            <m:sty m:val="b"/>
-          </m:rPr>
-          <m:t>x</m:t>
-        </m:r>
-        <m:r>
-          <m:rPr>
-            <m:sty m:val="p"/>
-          </m:rPr>
-          <m:t>=</m:t>
-        </m:r>
-        <m:sSubSup>
-          <m:e>
-            <m:r>
-              <m:rPr>
-                <m:sty m:val="b"/>
-              </m:rPr>
-              <m:t>x</m:t>
-            </m:r>
-          </m:e>
-          <m:sub>
-            <m:r>
-              <m:t>m</m:t>
-            </m:r>
-            <m:r>
-              <m:rPr>
-                <m:sty m:val="p"/>
-              </m:rPr>
-              <m:t>+</m:t>
-            </m:r>
-            <m:r>
-              <m:t>1</m:t>
-            </m:r>
-          </m:sub>
-          <m:sup>
-            <m:r>
-              <m:t>T</m:t>
-            </m:r>
-          </m:sup>
-        </m:sSubSup>
-      </m:oMath>
-      <w:r>
-        <w:t xml:space="preserve">.</w:t>
-      </w:r>
-    </w:p>
-    <w:p>
-      <w:pPr>
-        <w:numPr>
-          <w:ilvl w:val="0"/>
-          <w:numId w:val="1032"/>
-        </w:numPr>
-      </w:pPr>
-      <w:r>
-        <w:rPr>
-          <w:iCs/>
-          <w:i/>
-        </w:rPr>
-        <w:t xml:space="preserve">Upper tail.</w:t>
-      </w:r>
-      <w:r>
-        <w:t xml:space="preserve"> </w:t>
-      </w:r>
-      <w:r>
-        <w:t xml:space="preserve">If</w:t>
-      </w:r>
-      <w:r>
-        <w:t xml:space="preserve"> </w:t>
-      </w:r>
-      <m:oMath>
-        <m:sSub>
-          <m:e>
-            <m:r>
-              <m:t>y</m:t>
-            </m:r>
-          </m:e>
-          <m:sub>
-            <m:r>
-              <m:t>m</m:t>
-            </m:r>
-            <m:r>
-              <m:rPr>
-                <m:sty m:val="p"/>
-              </m:rPr>
-              <m:t>+</m:t>
-            </m:r>
-            <m:r>
-              <m:t>1</m:t>
-            </m:r>
-          </m:sub>
-        </m:sSub>
-      </m:oMath>
-      <w:r>
-        <w:t xml:space="preserve"> </w:t>
-      </w:r>
-      <w:r>
-        <w:t xml:space="preserve">exceeds the upper bound in Eq. (4), the</w:t>
-      </w:r>
-      <w:r>
-        <w:t xml:space="preserve"> </w:t>
-      </w:r>
-      <m:oMath>
-        <m:r>
-          <m:rPr>
-            <m:sty m:val="p"/>
-          </m:rPr>
-          <m:t>⌈</m:t>
-        </m:r>
-        <m:d>
-          <m:dPr>
-            <m:begChr m:val="("/>
-            <m:endChr m:val=")"/>
-            <m:sepChr m:val=""/>
-            <m:grow/>
-          </m:dPr>
-          <m:e>
-            <m:r>
-              <m:t>1</m:t>
-            </m:r>
-            <m:r>
-              <m:rPr>
-                <m:sty m:val="p"/>
-              </m:rPr>
-              <m:t>−</m:t>
-            </m:r>
-            <m:r>
-              <m:t>α</m:t>
-            </m:r>
-          </m:e>
-        </m:d>
-        <m:d>
-          <m:dPr>
-            <m:begChr m:val="("/>
-            <m:endChr m:val=")"/>
-            <m:sepChr m:val=""/>
-            <m:grow/>
-          </m:dPr>
-          <m:e>
-            <m:r>
-              <m:t>m</m:t>
-            </m:r>
-            <m:r>
-              <m:rPr>
-                <m:sty m:val="p"/>
-              </m:rPr>
-              <m:t>+</m:t>
-            </m:r>
-            <m:r>
-              <m:t>1</m:t>
-            </m:r>
-          </m:e>
-        </m:d>
-        <m:r>
-          <m:rPr>
-            <m:sty m:val="p"/>
-          </m:rPr>
-          <m:t>⌉</m:t>
-        </m:r>
-      </m:oMath>
-      <w:r>
-        <w:t xml:space="preserve">-th smallest</w:t>
-      </w:r>
-      <w:r>
-        <w:t xml:space="preserve"> </w:t>
-      </w:r>
-      <m:oMath>
-        <m:sSub>
-          <m:e>
-            <m:r>
-              <m:t>U</m:t>
-            </m:r>
-          </m:e>
-          <m:sub>
-            <m:r>
-              <m:t>i</m:t>
-            </m:r>
-          </m:sub>
-        </m:sSub>
-      </m:oMath>
-      <w:r>
-        <w:t xml:space="preserve">, then</w:t>
-      </w:r>
-      <w:r>
-        <w:t xml:space="preserve"> </w:t>
-      </w:r>
-      <m:oMath>
-        <m:sSub>
-          <m:e>
-            <m:r>
-              <m:t>y</m:t>
-            </m:r>
-          </m:e>
-          <m:sub>
-            <m:r>
-              <m:t>m</m:t>
-            </m:r>
-            <m:r>
-              <m:rPr>
-                <m:sty m:val="p"/>
-              </m:rPr>
-              <m:t>+</m:t>
-            </m:r>
-            <m:r>
-              <m:t>1</m:t>
-            </m:r>
-          </m:sub>
-        </m:sSub>
-        <m:r>
-          <m:rPr>
-            <m:sty m:val="p"/>
-          </m:rPr>
-          <m:t>&gt;</m:t>
-        </m:r>
-        <m:sSub>
-          <m:e>
-            <m:r>
-              <m:t>U</m:t>
-            </m:r>
-          </m:e>
-          <m:sub>
-            <m:r>
-              <m:t>i</m:t>
-            </m:r>
-          </m:sub>
-        </m:sSub>
-      </m:oMath>
-      <w:r>
-        <w:t xml:space="preserve"> </w:t>
-      </w:r>
-      <w:r>
-        <w:t xml:space="preserve">for at least</w:t>
-      </w:r>
-      <w:r>
-        <w:t xml:space="preserve"> </w:t>
-      </w:r>
-      <m:oMath>
-        <m:d>
-          <m:dPr>
-            <m:begChr m:val="("/>
-            <m:endChr m:val=")"/>
-            <m:sepChr m:val=""/>
-            <m:grow/>
-          </m:dPr>
-          <m:e>
-            <m:r>
-              <m:t>1</m:t>
-            </m:r>
-            <m:r>
-              <m:rPr>
-                <m:sty m:val="p"/>
-              </m:rPr>
-              <m:t>−</m:t>
-            </m:r>
-            <m:r>
-              <m:t>α</m:t>
-            </m:r>
-          </m:e>
-        </m:d>
-        <m:d>
-          <m:dPr>
-            <m:begChr m:val="("/>
-            <m:endChr m:val=")"/>
-            <m:sepChr m:val=""/>
-            <m:grow/>
-          </m:dPr>
-          <m:e>
-            <m:r>
-              <m:t>m</m:t>
-            </m:r>
-            <m:r>
-              <m:rPr>
-                <m:sty m:val="p"/>
-              </m:rPr>
-              <m:t>+</m:t>
-            </m:r>
-            <m:r>
-              <m:t>1</m:t>
-            </m:r>
-          </m:e>
-        </m:d>
-      </m:oMath>
-      <w:r>
-        <w:t xml:space="preserve"> </w:t>
-      </w:r>
-      <w:r>
-        <w:t xml:space="preserve">indices</w:t>
-      </w:r>
-      <w:r>
-        <w:t xml:space="preserve"> </w:t>
-      </w:r>
-      <m:oMath>
-        <m:r>
-          <m:t>i</m:t>
-        </m:r>
-      </m:oMath>
-      <w:r>
-        <w:t xml:space="preserve">.</w:t>
-      </w:r>
-    </w:p>
-    <w:p>
-      <w:pPr>
-        <w:numPr>
-          <w:ilvl w:val="0"/>
-          <w:numId w:val="1032"/>
-        </w:numPr>
-      </w:pPr>
-      <w:r>
-        <w:rPr>
-          <w:iCs/>
-          <w:i/>
-        </w:rPr>
-        <w:t xml:space="preserve">Lower tail.</w:t>
-      </w:r>
-      <w:r>
-        <w:t xml:space="preserve"> </w:t>
-      </w:r>
-      <w:r>
-        <w:t xml:space="preserve">If</w:t>
-      </w:r>
-      <w:r>
-        <w:t xml:space="preserve"> </w:t>
-      </w:r>
-      <m:oMath>
-        <m:sSub>
-          <m:e>
-            <m:r>
-              <m:t>y</m:t>
-            </m:r>
-          </m:e>
-          <m:sub>
-            <m:r>
-              <m:t>m</m:t>
-            </m:r>
-            <m:r>
-              <m:rPr>
-                <m:sty m:val="p"/>
-              </m:rPr>
-              <m:t>+</m:t>
-            </m:r>
-            <m:r>
-              <m:t>1</m:t>
-            </m:r>
-          </m:sub>
-        </m:sSub>
-      </m:oMath>
-      <w:r>
-        <w:t xml:space="preserve"> </w:t>
-      </w:r>
-      <w:r>
-        <w:t xml:space="preserve">is below the lower bound, the</w:t>
-      </w:r>
-      <w:r>
-        <w:t xml:space="preserve"> </w:t>
-      </w:r>
-      <m:oMath>
-        <m:r>
-          <m:t>k</m:t>
-        </m:r>
-      </m:oMath>
-      <w:r>
-        <w:t xml:space="preserve">-th smallest</w:t>
-      </w:r>
-      <w:r>
-        <w:t xml:space="preserve"> </w:t>
-      </w:r>
-      <m:oMath>
-        <m:sSub>
-          <m:e>
-            <m:r>
-              <m:t>L</m:t>
-            </m:r>
-          </m:e>
-          <m:sub>
-            <m:r>
-              <m:t>i</m:t>
-            </m:r>
-          </m:sub>
-        </m:sSub>
-      </m:oMath>
-      <w:r>
-        <w:t xml:space="preserve"> </w:t>
-      </w:r>
-      <w:r>
-        <w:t xml:space="preserve">with</w:t>
-      </w:r>
-      <w:r>
-        <w:t xml:space="preserve"> </w:t>
-      </w:r>
-      <m:oMath>
-        <m:r>
-          <m:t>k</m:t>
-        </m:r>
-        <m:r>
-          <m:rPr>
-            <m:sty m:val="p"/>
-          </m:rPr>
-          <m:t>=</m:t>
-        </m:r>
-        <m:r>
-          <m:rPr>
-            <m:sty m:val="p"/>
-          </m:rPr>
-          <m:t>⌊</m:t>
-        </m:r>
-        <m:r>
-          <m:t>α</m:t>
-        </m:r>
-        <m:d>
-          <m:dPr>
-            <m:begChr m:val="("/>
-            <m:endChr m:val=")"/>
-            <m:sepChr m:val=""/>
-            <m:grow/>
-          </m:dPr>
-          <m:e>
-            <m:r>
-              <m:t>m</m:t>
-            </m:r>
-            <m:r>
-              <m:rPr>
-                <m:sty m:val="p"/>
-              </m:rPr>
-              <m:t>+</m:t>
-            </m:r>
-            <m:r>
-              <m:t>1</m:t>
-            </m:r>
-          </m:e>
-        </m:d>
-        <m:r>
-          <m:rPr>
-            <m:sty m:val="p"/>
-          </m:rPr>
-          <m:t>⌋</m:t>
-        </m:r>
-      </m:oMath>
-      <w:r>
-        <w:t xml:space="preserve">, then</w:t>
-      </w:r>
-      <w:r>
-        <w:t xml:space="preserve"> </w:t>
-      </w:r>
-      <m:oMath>
-        <m:sSub>
-          <m:e>
-            <m:r>
-              <m:t>y</m:t>
-            </m:r>
-          </m:e>
-          <m:sub>
-            <m:r>
-              <m:t>m</m:t>
-            </m:r>
-            <m:r>
-              <m:rPr>
-                <m:sty m:val="p"/>
-              </m:rPr>
-              <m:t>+</m:t>
-            </m:r>
-            <m:r>
-              <m:t>1</m:t>
-            </m:r>
-          </m:sub>
-        </m:sSub>
-        <m:r>
-          <m:rPr>
-            <m:sty m:val="p"/>
-          </m:rPr>
-          <m:t>&lt;</m:t>
-        </m:r>
-        <m:sSub>
-          <m:e>
-            <m:r>
-              <m:t>L</m:t>
-            </m:r>
-          </m:e>
-          <m:sub>
-            <m:r>
-              <m:t>i</m:t>
-            </m:r>
-          </m:sub>
-        </m:sSub>
-      </m:oMath>
-      <w:r>
-        <w:t xml:space="preserve"> </w:t>
-      </w:r>
-      <w:r>
-        <w:t xml:space="preserve">for at least</w:t>
-      </w:r>
-      <w:r>
-        <w:t xml:space="preserve"> </w:t>
-      </w:r>
-      <m:oMath>
-        <m:r>
-          <m:t>m</m:t>
-        </m:r>
-        <m:r>
-          <m:rPr>
-            <m:sty m:val="p"/>
-          </m:rPr>
-          <m:t>−</m:t>
-        </m:r>
-        <m:r>
-          <m:t>k</m:t>
-        </m:r>
-        <m:r>
-          <m:rPr>
-            <m:sty m:val="p"/>
-          </m:rPr>
-          <m:t>+</m:t>
-        </m:r>
-        <m:r>
-          <m:t>1</m:t>
-        </m:r>
-        <m:r>
-          <m:rPr>
-            <m:sty m:val="p"/>
-          </m:rPr>
-          <m:t>≥</m:t>
-        </m:r>
-        <m:d>
-          <m:dPr>
-            <m:begChr m:val="("/>
-            <m:endChr m:val=")"/>
-            <m:sepChr m:val=""/>
-            <m:grow/>
-          </m:dPr>
-          <m:e>
-            <m:r>
-              <m:t>1</m:t>
-            </m:r>
-            <m:r>
-              <m:rPr>
-                <m:sty m:val="p"/>
-              </m:rPr>
-              <m:t>−</m:t>
-            </m:r>
-            <m:r>
-              <m:t>α</m:t>
-            </m:r>
-          </m:e>
-        </m:d>
-        <m:d>
-          <m:dPr>
-            <m:begChr m:val="("/>
-            <m:endChr m:val=")"/>
-            <m:sepChr m:val=""/>
-            <m:grow/>
-          </m:dPr>
-          <m:e>
-            <m:r>
-              <m:t>m</m:t>
-            </m:r>
-            <m:r>
-              <m:rPr>
-                <m:sty m:val="p"/>
-              </m:rPr>
-              <m:t>+</m:t>
-            </m:r>
-            <m:r>
-              <m:t>1</m:t>
-            </m:r>
-          </m:e>
-        </m:d>
-      </m:oMath>
-      <w:r>
-        <w:t xml:space="preserve"> </w:t>
-      </w:r>
-      <w:r>
-        <w:t xml:space="preserve">indices.</w:t>
-      </w:r>
-    </w:p>
-    <w:p>
-      <w:pPr>
-        <w:pStyle w:val="FirstParagraph"/>
-      </w:pPr>
-      <w:r>
-        <w:t xml:space="preserve">In both cases</w:t>
-      </w:r>
-      <w:r>
-        <w:t xml:space="preserve"> </w:t>
-      </w:r>
-      <m:oMath>
-        <m:r>
-          <m:rPr>
-            <m:sty m:val="p"/>
-          </m:rPr>
-          <m:t>|</m:t>
-        </m:r>
-        <m:sSub>
-          <m:e>
-            <m:r>
-              <m:t>y</m:t>
-            </m:r>
-          </m:e>
-          <m:sub>
-            <m:r>
-              <m:t>m</m:t>
-            </m:r>
-            <m:r>
-              <m:rPr>
-                <m:sty m:val="p"/>
-              </m:rPr>
-              <m:t>+</m:t>
-            </m:r>
-            <m:r>
-              <m:t>1</m:t>
-            </m:r>
-          </m:sub>
-        </m:sSub>
-        <m:r>
-          <m:rPr>
-            <m:sty m:val="p"/>
-          </m:rPr>
-          <m:t>−</m:t>
-        </m:r>
-        <m:sSub>
-          <m:e>
-            <m:r>
-              <m:t>μ</m:t>
-            </m:r>
-          </m:e>
-          <m:sub>
-            <m:r>
-              <m:rPr>
-                <m:sty m:val="p"/>
-              </m:rPr>
-              <m:t>−</m:t>
-            </m:r>
-            <m:r>
-              <m:t>i</m:t>
-            </m:r>
-          </m:sub>
-        </m:sSub>
-        <m:d>
-          <m:dPr>
-            <m:begChr m:val="("/>
-            <m:endChr m:val=")"/>
-            <m:sepChr m:val=""/>
-            <m:grow/>
-          </m:dPr>
-          <m:e>
-            <m:r>
-              <m:rPr>
-                <m:sty m:val="b"/>
-              </m:rPr>
-              <m:t>x</m:t>
-            </m:r>
-          </m:e>
-        </m:d>
-        <m:r>
-          <m:rPr>
-            <m:sty m:val="p"/>
-          </m:rPr>
-          <m:t>|</m:t>
-        </m:r>
         <m:r>
           <m:rPr>
             <m:sty m:val="p"/>
@@ -21021,55 +21011,10 @@
         <w:t xml:space="preserve"> </w:t>
       </w:r>
       <m:oMath>
-        <m:r>
-          <m:rPr>
-            <m:sty m:val="p"/>
-          </m:rPr>
-          <m:t>|</m:t>
-        </m:r>
-        <m:sSub>
-          <m:e>
-            <m:r>
-              <m:t>y</m:t>
-            </m:r>
-          </m:e>
-          <m:sub>
-            <m:r>
-              <m:t>i</m:t>
-            </m:r>
-          </m:sub>
-        </m:sSub>
-        <m:r>
-          <m:rPr>
-            <m:sty m:val="p"/>
-          </m:rPr>
-          <m:t>−</m:t>
-        </m:r>
-        <m:sSub>
-          <m:e>
-            <m:r>
-              <m:t>μ</m:t>
-            </m:r>
-          </m:e>
-          <m:sub>
-            <m:r>
-              <m:rPr>
-                <m:sty m:val="p"/>
-              </m:rPr>
-              <m:t>−</m:t>
-            </m:r>
-            <m:r>
-              <m:t>i</m:t>
-            </m:r>
-            <m:r>
-              <m:t>j</m:t>
-            </m:r>
-          </m:sub>
-        </m:sSub>
         <m:d>
           <m:dPr>
-            <m:begChr m:val="("/>
-            <m:endChr m:val=")"/>
+            <m:begChr m:val="|"/>
+            <m:endChr m:val="|"/>
             <m:sepChr m:val=""/>
             <m:grow/>
           </m:dPr>
@@ -21077,10 +21022,7 @@
             <m:sSub>
               <m:e>
                 <m:r>
-                  <m:rPr>
-                    <m:sty m:val="b"/>
-                  </m:rPr>
-                  <m:t>x</m:t>
+                  <m:t>y</m:t>
                 </m:r>
               </m:e>
               <m:sub>
@@ -21089,14 +21031,60 @@
                 </m:r>
               </m:sub>
             </m:sSub>
+            <m:r>
+              <m:rPr>
+                <m:sty m:val="p"/>
+              </m:rPr>
+              <m:t>−</m:t>
+            </m:r>
+            <m:sSub>
+              <m:e>
+                <m:r>
+                  <m:t>μ</m:t>
+                </m:r>
+              </m:e>
+              <m:sub>
+                <m:r>
+                  <m:rPr>
+                    <m:sty m:val="p"/>
+                  </m:rPr>
+                  <m:t>−</m:t>
+                </m:r>
+                <m:r>
+                  <m:t>i</m:t>
+                </m:r>
+                <m:r>
+                  <m:t>j</m:t>
+                </m:r>
+              </m:sub>
+            </m:sSub>
+            <m:d>
+              <m:dPr>
+                <m:begChr m:val="("/>
+                <m:endChr m:val=")"/>
+                <m:sepChr m:val=""/>
+                <m:grow/>
+              </m:dPr>
+              <m:e>
+                <m:sSub>
+                  <m:e>
+                    <m:r>
+                      <m:rPr>
+                        <m:sty m:val="b"/>
+                      </m:rPr>
+                      <m:t>x</m:t>
+                    </m:r>
+                  </m:e>
+                  <m:sub>
+                    <m:r>
+                      <m:t>i</m:t>
+                    </m:r>
+                  </m:sub>
+                </m:sSub>
+              </m:e>
+            </m:d>
           </m:e>
         </m:d>
-        <m:r>
-          <m:rPr>
-            <m:sty m:val="p"/>
-          </m:rPr>
-          <m:t>|</m:t>
-        </m:r>
         <m:r>
           <m:rPr>
             <m:sty m:val="p"/>

</xml_diff>